<commit_message>
docs: create grade management requirement tables
</commit_message>
<xml_diff>
--- a/docs/SRS.docx
+++ b/docs/SRS.docx
@@ -4028,6 +4028,7 @@
                 <w:b/>
                 <w:bCs/>
               </w:rPr>
+              <w:lastRenderedPageBreak/>
               <w:t>ID</w:t>
             </w:r>
             <w:r>
@@ -4792,6 +4793,7 @@
                 <w:b/>
                 <w:bCs/>
               </w:rPr>
+              <w:lastRenderedPageBreak/>
               <w:t>ID</w:t>
             </w:r>
             <w:r>
@@ -5663,6 +5665,7 @@
                 <w:b/>
                 <w:bCs/>
               </w:rPr>
+              <w:lastRenderedPageBreak/>
               <w:t>ID</w:t>
             </w:r>
             <w:r>
@@ -6487,6 +6490,7 @@
                 <w:b/>
                 <w:bCs/>
               </w:rPr>
+              <w:lastRenderedPageBreak/>
               <w:t>ID</w:t>
             </w:r>
             <w:r>
@@ -7302,6 +7306,7 @@
                 <w:b/>
                 <w:bCs/>
               </w:rPr>
+              <w:lastRenderedPageBreak/>
               <w:t>ID</w:t>
             </w:r>
             <w:r>
@@ -8362,6 +8367,7 @@
                 <w:b/>
                 <w:bCs/>
               </w:rPr>
+              <w:lastRenderedPageBreak/>
               <w:t>ID</w:t>
             </w:r>
             <w:r>
@@ -9547,6 +9553,7 @@
                 <w:b/>
                 <w:bCs/>
               </w:rPr>
+              <w:lastRenderedPageBreak/>
               <w:t>ID</w:t>
             </w:r>
             <w:r>
@@ -10747,6 +10754,7 @@
                 <w:b/>
                 <w:bCs/>
               </w:rPr>
+              <w:lastRenderedPageBreak/>
               <w:t>ID</w:t>
             </w:r>
             <w:r>
@@ -12057,6 +12065,7 @@
                 <w:b/>
                 <w:bCs/>
               </w:rPr>
+              <w:lastRenderedPageBreak/>
               <w:t>ID</w:t>
             </w:r>
             <w:r>
@@ -13141,6 +13150,7 @@
       </w:pPr>
       <w:bookmarkStart w:id="18" w:name="_Toc237819754"/>
       <w:r>
+        <w:lastRenderedPageBreak/>
         <w:t xml:space="preserve">Subject Management (SUB) </w:t>
       </w:r>
       <w:r>
@@ -13985,6 +13995,7 @@
                 <w:b/>
                 <w:bCs/>
               </w:rPr>
+              <w:lastRenderedPageBreak/>
               <w:t>ID</w:t>
             </w:r>
             <w:r>
@@ -14862,6 +14873,7 @@
                 <w:b/>
                 <w:bCs/>
               </w:rPr>
+              <w:lastRenderedPageBreak/>
               <w:t>ID</w:t>
             </w:r>
             <w:r>
@@ -15727,6 +15739,7 @@
                 <w:b/>
                 <w:bCs/>
               </w:rPr>
+              <w:lastRenderedPageBreak/>
               <w:t>ID</w:t>
             </w:r>
             <w:r>
@@ -16838,6 +16851,7 @@
       </w:pPr>
       <w:proofErr w:type="spellStart"/>
       <w:r>
+        <w:lastRenderedPageBreak/>
         <w:t>Assessment</w:t>
       </w:r>
       <w:proofErr w:type="spellEnd"/>
@@ -17651,6 +17665,7 @@
                 <w:b/>
                 <w:bCs/>
               </w:rPr>
+              <w:lastRenderedPageBreak/>
               <w:t>ID</w:t>
             </w:r>
             <w:r>
@@ -17673,7 +17688,13 @@
               <w:jc w:val="center"/>
             </w:pPr>
             <w:r>
-              <w:t>FR-ASM-002 — Edit Assessment Component</w:t>
+              <w:t xml:space="preserve">FR-ASM-02 </w:t>
+            </w:r>
+            <w:r>
+              <w:t>–</w:t>
+            </w:r>
+            <w:r>
+              <w:t xml:space="preserve"> Edit Assessment Component</w:t>
             </w:r>
           </w:p>
         </w:tc>
@@ -18347,6 +18368,7 @@
                 <w:b/>
                 <w:bCs/>
               </w:rPr>
+              <w:lastRenderedPageBreak/>
               <w:t>ID</w:t>
             </w:r>
             <w:r>
@@ -18369,7 +18391,19 @@
               <w:jc w:val="center"/>
             </w:pPr>
             <w:r>
-              <w:t>FR-ASM-003 — Delete Assessment Component</w:t>
+              <w:t>FR-ASM-0</w:t>
+            </w:r>
+            <w:r>
+              <w:t xml:space="preserve">3 </w:t>
+            </w:r>
+            <w:r>
+              <w:t>–</w:t>
+            </w:r>
+            <w:r>
+              <w:t xml:space="preserve"> </w:t>
+            </w:r>
+            <w:r>
+              <w:t>Delete Assessment Component</w:t>
             </w:r>
           </w:p>
         </w:tc>
@@ -18976,6 +19010,7 @@
                 <w:b/>
                 <w:bCs/>
               </w:rPr>
+              <w:lastRenderedPageBreak/>
               <w:t>ID</w:t>
             </w:r>
             <w:r>
@@ -18998,7 +19033,16 @@
               <w:jc w:val="center"/>
             </w:pPr>
             <w:r>
-              <w:t>FR-ASM-004 — Create Assessment Group</w:t>
+              <w:t>FR-ASM-04</w:t>
+            </w:r>
+            <w:r>
+              <w:t xml:space="preserve"> </w:t>
+            </w:r>
+            <w:r>
+              <w:t>–</w:t>
+            </w:r>
+            <w:r>
+              <w:t xml:space="preserve"> Create Assessment Group</w:t>
             </w:r>
           </w:p>
         </w:tc>
@@ -19717,6 +19761,7 @@
                 <w:b/>
                 <w:bCs/>
               </w:rPr>
+              <w:lastRenderedPageBreak/>
               <w:t>ID</w:t>
             </w:r>
             <w:r>
@@ -19739,7 +19784,13 @@
               <w:jc w:val="center"/>
             </w:pPr>
             <w:r>
-              <w:t>FR-ASM-005 — Manage Assessments Within Group</w:t>
+              <w:t>FR-ASM-0</w:t>
+            </w:r>
+            <w:r>
+              <w:t>5 –</w:t>
+            </w:r>
+            <w:r>
+              <w:t xml:space="preserve"> Manage Assessments Within Group</w:t>
             </w:r>
           </w:p>
         </w:tc>
@@ -20423,6 +20474,1452 @@
         </w:tc>
       </w:tr>
     </w:tbl>
+    <w:p/>
+    <w:p>
+      <w:pPr>
+        <w:pStyle w:val="Ttulo3"/>
+      </w:pPr>
+      <w:r>
+        <w:br w:type="page"/>
+      </w:r>
+      <w:r>
+        <w:lastRenderedPageBreak/>
+        <w:t>Grade Management (GRD) Requirements</w:t>
+      </w:r>
+    </w:p>
+    <w:tbl>
+      <w:tblPr>
+        <w:tblStyle w:val="Tablaconcuadrcula"/>
+        <w:tblW w:w="0" w:type="auto"/>
+        <w:tblLook w:val="04A0" w:firstRow="1" w:lastRow="0" w:firstColumn="1" w:lastColumn="0" w:noHBand="0" w:noVBand="1"/>
+      </w:tblPr>
+      <w:tblGrid>
+        <w:gridCol w:w="2390"/>
+        <w:gridCol w:w="4534"/>
+        <w:gridCol w:w="2426"/>
+      </w:tblGrid>
+      <w:tr>
+        <w:trPr>
+          <w:trHeight w:val="508"/>
+        </w:trPr>
+        <w:tc>
+          <w:tcPr>
+            <w:tcW w:w="0" w:type="auto"/>
+            <w:shd w:val="clear" w:color="auto" w:fill="153D63" w:themeFill="text2" w:themeFillTint="E6"/>
+            <w:vAlign w:val="center"/>
+          </w:tcPr>
+          <w:p>
+            <w:pPr>
+              <w:jc w:val="center"/>
+              <w:rPr>
+                <w:b/>
+                <w:bCs/>
+              </w:rPr>
+            </w:pPr>
+            <w:r>
+              <w:rPr>
+                <w:b/>
+                <w:bCs/>
+              </w:rPr>
+              <w:t>ID</w:t>
+            </w:r>
+            <w:r>
+              <w:rPr>
+                <w:b/>
+                <w:bCs/>
+              </w:rPr>
+              <w:t xml:space="preserve"> &amp; NAME</w:t>
+            </w:r>
+          </w:p>
+        </w:tc>
+        <w:tc>
+          <w:tcPr>
+            <w:tcW w:w="0" w:type="auto"/>
+            <w:gridSpan w:val="2"/>
+            <w:vAlign w:val="center"/>
+          </w:tcPr>
+          <w:p>
+            <w:pPr>
+              <w:jc w:val="center"/>
+            </w:pPr>
+            <w:r>
+              <w:t xml:space="preserve">FR-GRD-01 </w:t>
+            </w:r>
+            <w:r>
+              <w:t>–</w:t>
+            </w:r>
+            <w:r>
+              <w:t xml:space="preserve"> </w:t>
+            </w:r>
+            <w:r>
+              <w:t>Manage Grades</w:t>
+            </w:r>
+          </w:p>
+        </w:tc>
+      </w:tr>
+      <w:tr>
+        <w:trPr>
+          <w:trHeight w:val="824"/>
+        </w:trPr>
+        <w:tc>
+          <w:tcPr>
+            <w:tcW w:w="0" w:type="auto"/>
+            <w:shd w:val="clear" w:color="auto" w:fill="153D63" w:themeFill="text2" w:themeFillTint="E6"/>
+            <w:vAlign w:val="center"/>
+          </w:tcPr>
+          <w:p>
+            <w:pPr>
+              <w:jc w:val="center"/>
+              <w:rPr>
+                <w:b/>
+                <w:bCs/>
+              </w:rPr>
+            </w:pPr>
+            <w:r>
+              <w:rPr>
+                <w:b/>
+                <w:bCs/>
+              </w:rPr>
+              <w:t>DESCRIPTION</w:t>
+            </w:r>
+          </w:p>
+        </w:tc>
+        <w:tc>
+          <w:tcPr>
+            <w:tcW w:w="0" w:type="auto"/>
+            <w:gridSpan w:val="2"/>
+            <w:vAlign w:val="center"/>
+          </w:tcPr>
+          <w:p>
+            <w:pPr>
+              <w:jc w:val="center"/>
+            </w:pPr>
+            <w:r>
+              <w:t>The system shall allow the user to add, modify, view, and remove grades associated with assessment components.</w:t>
+            </w:r>
+          </w:p>
+        </w:tc>
+      </w:tr>
+      <w:tr>
+        <w:trPr>
+          <w:trHeight w:val="565"/>
+        </w:trPr>
+        <w:tc>
+          <w:tcPr>
+            <w:tcW w:w="0" w:type="auto"/>
+            <w:shd w:val="clear" w:color="auto" w:fill="153D63" w:themeFill="text2" w:themeFillTint="E6"/>
+            <w:vAlign w:val="center"/>
+          </w:tcPr>
+          <w:p>
+            <w:pPr>
+              <w:jc w:val="center"/>
+              <w:rPr>
+                <w:b/>
+                <w:bCs/>
+              </w:rPr>
+            </w:pPr>
+            <w:r>
+              <w:rPr>
+                <w:b/>
+                <w:bCs/>
+              </w:rPr>
+              <w:t>ACTORS</w:t>
+            </w:r>
+          </w:p>
+        </w:tc>
+        <w:tc>
+          <w:tcPr>
+            <w:tcW w:w="0" w:type="auto"/>
+            <w:gridSpan w:val="2"/>
+            <w:vAlign w:val="center"/>
+          </w:tcPr>
+          <w:p>
+            <w:pPr>
+              <w:jc w:val="center"/>
+            </w:pPr>
+            <w:r>
+              <w:t>User</w:t>
+            </w:r>
+          </w:p>
+        </w:tc>
+      </w:tr>
+      <w:tr>
+        <w:trPr>
+          <w:trHeight w:val="724"/>
+        </w:trPr>
+        <w:tc>
+          <w:tcPr>
+            <w:tcW w:w="0" w:type="auto"/>
+            <w:shd w:val="clear" w:color="auto" w:fill="153D63" w:themeFill="text2" w:themeFillTint="E6"/>
+            <w:vAlign w:val="center"/>
+          </w:tcPr>
+          <w:p>
+            <w:pPr>
+              <w:jc w:val="center"/>
+              <w:rPr>
+                <w:b/>
+                <w:bCs/>
+              </w:rPr>
+            </w:pPr>
+            <w:r>
+              <w:rPr>
+                <w:b/>
+                <w:bCs/>
+              </w:rPr>
+              <w:t>PRECONDITIONS</w:t>
+            </w:r>
+          </w:p>
+        </w:tc>
+        <w:tc>
+          <w:tcPr>
+            <w:tcW w:w="0" w:type="auto"/>
+            <w:gridSpan w:val="2"/>
+            <w:vAlign w:val="center"/>
+          </w:tcPr>
+          <w:p>
+            <w:pPr>
+              <w:pStyle w:val="Prrafodelista"/>
+              <w:ind w:left="0"/>
+              <w:jc w:val="center"/>
+            </w:pPr>
+            <w:r>
+              <w:t>The user is authenticated and the selected assessment component exists and belongs to the user.</w:t>
+            </w:r>
+          </w:p>
+        </w:tc>
+      </w:tr>
+      <w:tr>
+        <w:trPr>
+          <w:trHeight w:val="363"/>
+        </w:trPr>
+        <w:tc>
+          <w:tcPr>
+            <w:tcW w:w="0" w:type="auto"/>
+            <w:vMerge w:val="restart"/>
+            <w:shd w:val="clear" w:color="auto" w:fill="153D63" w:themeFill="text2" w:themeFillTint="E6"/>
+            <w:vAlign w:val="center"/>
+          </w:tcPr>
+          <w:p>
+            <w:pPr>
+              <w:jc w:val="center"/>
+              <w:rPr>
+                <w:b/>
+                <w:bCs/>
+              </w:rPr>
+            </w:pPr>
+            <w:r>
+              <w:rPr>
+                <w:b/>
+                <w:bCs/>
+              </w:rPr>
+              <w:t>INPUTS</w:t>
+            </w:r>
+          </w:p>
+        </w:tc>
+        <w:tc>
+          <w:tcPr>
+            <w:tcW w:w="0" w:type="auto"/>
+            <w:shd w:val="clear" w:color="auto" w:fill="153D63" w:themeFill="text2" w:themeFillTint="E6"/>
+            <w:vAlign w:val="center"/>
+          </w:tcPr>
+          <w:p>
+            <w:pPr>
+              <w:jc w:val="center"/>
+              <w:rPr>
+                <w:b/>
+                <w:bCs/>
+              </w:rPr>
+            </w:pPr>
+            <w:r>
+              <w:rPr>
+                <w:b/>
+                <w:bCs/>
+              </w:rPr>
+              <w:t>NAME</w:t>
+            </w:r>
+          </w:p>
+        </w:tc>
+        <w:tc>
+          <w:tcPr>
+            <w:tcW w:w="0" w:type="auto"/>
+            <w:shd w:val="clear" w:color="auto" w:fill="153D63" w:themeFill="text2" w:themeFillTint="E6"/>
+            <w:vAlign w:val="center"/>
+          </w:tcPr>
+          <w:p>
+            <w:pPr>
+              <w:jc w:val="center"/>
+              <w:rPr>
+                <w:b/>
+                <w:bCs/>
+              </w:rPr>
+            </w:pPr>
+            <w:r>
+              <w:rPr>
+                <w:b/>
+                <w:bCs/>
+              </w:rPr>
+              <w:t>TYPE</w:t>
+            </w:r>
+          </w:p>
+        </w:tc>
+      </w:tr>
+      <w:tr>
+        <w:trPr>
+          <w:trHeight w:val="517"/>
+        </w:trPr>
+        <w:tc>
+          <w:tcPr>
+            <w:tcW w:w="0" w:type="auto"/>
+            <w:vMerge/>
+            <w:shd w:val="clear" w:color="auto" w:fill="153D63" w:themeFill="text2" w:themeFillTint="E6"/>
+            <w:vAlign w:val="center"/>
+          </w:tcPr>
+          <w:p>
+            <w:pPr>
+              <w:jc w:val="center"/>
+              <w:rPr>
+                <w:b/>
+                <w:bCs/>
+              </w:rPr>
+            </w:pPr>
+          </w:p>
+        </w:tc>
+        <w:tc>
+          <w:tcPr>
+            <w:tcW w:w="0" w:type="auto"/>
+            <w:vAlign w:val="center"/>
+          </w:tcPr>
+          <w:p>
+            <w:pPr>
+              <w:jc w:val="center"/>
+            </w:pPr>
+            <w:r>
+              <w:t>Assessment</w:t>
+            </w:r>
+          </w:p>
+        </w:tc>
+        <w:tc>
+          <w:tcPr>
+            <w:tcW w:w="0" w:type="auto"/>
+            <w:vAlign w:val="center"/>
+          </w:tcPr>
+          <w:p>
+            <w:pPr>
+              <w:jc w:val="center"/>
+            </w:pPr>
+            <w:r>
+              <w:t>Identifier</w:t>
+            </w:r>
+          </w:p>
+        </w:tc>
+      </w:tr>
+      <w:tr>
+        <w:trPr>
+          <w:trHeight w:val="517"/>
+        </w:trPr>
+        <w:tc>
+          <w:tcPr>
+            <w:tcW w:w="0" w:type="auto"/>
+            <w:vMerge/>
+            <w:shd w:val="clear" w:color="auto" w:fill="153D63" w:themeFill="text2" w:themeFillTint="E6"/>
+            <w:vAlign w:val="center"/>
+          </w:tcPr>
+          <w:p>
+            <w:pPr>
+              <w:jc w:val="center"/>
+              <w:rPr>
+                <w:b/>
+                <w:bCs/>
+              </w:rPr>
+            </w:pPr>
+          </w:p>
+        </w:tc>
+        <w:tc>
+          <w:tcPr>
+            <w:tcW w:w="0" w:type="auto"/>
+            <w:vAlign w:val="center"/>
+          </w:tcPr>
+          <w:p>
+            <w:pPr>
+              <w:jc w:val="center"/>
+            </w:pPr>
+            <w:r>
+              <w:t>Grade</w:t>
+            </w:r>
+          </w:p>
+        </w:tc>
+        <w:tc>
+          <w:tcPr>
+            <w:tcW w:w="0" w:type="auto"/>
+            <w:vAlign w:val="center"/>
+          </w:tcPr>
+          <w:p>
+            <w:pPr>
+              <w:jc w:val="center"/>
+            </w:pPr>
+            <w:r>
+              <w:t>Double</w:t>
+            </w:r>
+          </w:p>
+        </w:tc>
+      </w:tr>
+      <w:tr>
+        <w:trPr>
+          <w:trHeight w:val="992"/>
+        </w:trPr>
+        <w:tc>
+          <w:tcPr>
+            <w:tcW w:w="0" w:type="auto"/>
+            <w:shd w:val="clear" w:color="auto" w:fill="153D63" w:themeFill="text2" w:themeFillTint="E6"/>
+            <w:vAlign w:val="center"/>
+          </w:tcPr>
+          <w:p>
+            <w:pPr>
+              <w:jc w:val="center"/>
+              <w:rPr>
+                <w:b/>
+                <w:bCs/>
+              </w:rPr>
+            </w:pPr>
+            <w:r>
+              <w:rPr>
+                <w:b/>
+                <w:bCs/>
+              </w:rPr>
+              <w:t>PROCESS</w:t>
+            </w:r>
+          </w:p>
+        </w:tc>
+        <w:tc>
+          <w:tcPr>
+            <w:tcW w:w="0" w:type="auto"/>
+            <w:gridSpan w:val="2"/>
+            <w:vAlign w:val="center"/>
+          </w:tcPr>
+          <w:p>
+            <w:pPr>
+              <w:jc w:val="center"/>
+            </w:pPr>
+            <w:r>
+              <w:t>The system validates the provided grade and creates, modifies, or removes the grade associated with the selected assessment.</w:t>
+            </w:r>
+          </w:p>
+        </w:tc>
+      </w:tr>
+      <w:tr>
+        <w:trPr>
+          <w:trHeight w:val="347"/>
+        </w:trPr>
+        <w:tc>
+          <w:tcPr>
+            <w:tcW w:w="0" w:type="auto"/>
+            <w:vMerge w:val="restart"/>
+            <w:shd w:val="clear" w:color="auto" w:fill="153D63" w:themeFill="text2" w:themeFillTint="E6"/>
+            <w:vAlign w:val="center"/>
+          </w:tcPr>
+          <w:p>
+            <w:pPr>
+              <w:jc w:val="center"/>
+              <w:rPr>
+                <w:b/>
+                <w:bCs/>
+              </w:rPr>
+            </w:pPr>
+            <w:r>
+              <w:rPr>
+                <w:b/>
+                <w:bCs/>
+              </w:rPr>
+              <w:t>OUTPUTS</w:t>
+            </w:r>
+          </w:p>
+        </w:tc>
+        <w:tc>
+          <w:tcPr>
+            <w:tcW w:w="0" w:type="auto"/>
+            <w:shd w:val="clear" w:color="auto" w:fill="153D63" w:themeFill="text2" w:themeFillTint="E6"/>
+            <w:vAlign w:val="center"/>
+          </w:tcPr>
+          <w:p>
+            <w:pPr>
+              <w:jc w:val="center"/>
+              <w:rPr>
+                <w:b/>
+                <w:bCs/>
+              </w:rPr>
+            </w:pPr>
+            <w:r>
+              <w:rPr>
+                <w:b/>
+                <w:bCs/>
+              </w:rPr>
+              <w:t>NAME</w:t>
+            </w:r>
+          </w:p>
+        </w:tc>
+        <w:tc>
+          <w:tcPr>
+            <w:tcW w:w="0" w:type="auto"/>
+            <w:shd w:val="clear" w:color="auto" w:fill="153D63" w:themeFill="text2" w:themeFillTint="E6"/>
+            <w:vAlign w:val="center"/>
+          </w:tcPr>
+          <w:p>
+            <w:pPr>
+              <w:jc w:val="center"/>
+              <w:rPr>
+                <w:b/>
+                <w:bCs/>
+              </w:rPr>
+            </w:pPr>
+            <w:r>
+              <w:rPr>
+                <w:b/>
+                <w:bCs/>
+              </w:rPr>
+              <w:t>TYPE</w:t>
+            </w:r>
+          </w:p>
+        </w:tc>
+      </w:tr>
+      <w:tr>
+        <w:trPr>
+          <w:trHeight w:val="525"/>
+        </w:trPr>
+        <w:tc>
+          <w:tcPr>
+            <w:tcW w:w="0" w:type="auto"/>
+            <w:vMerge/>
+            <w:shd w:val="clear" w:color="auto" w:fill="153D63" w:themeFill="text2" w:themeFillTint="E6"/>
+            <w:vAlign w:val="center"/>
+          </w:tcPr>
+          <w:p>
+            <w:pPr>
+              <w:jc w:val="center"/>
+              <w:rPr>
+                <w:b/>
+                <w:bCs/>
+              </w:rPr>
+            </w:pPr>
+          </w:p>
+        </w:tc>
+        <w:tc>
+          <w:tcPr>
+            <w:tcW w:w="0" w:type="auto"/>
+            <w:vAlign w:val="center"/>
+          </w:tcPr>
+          <w:p>
+            <w:pPr>
+              <w:jc w:val="center"/>
+            </w:pPr>
+            <w:r>
+              <w:t>Grade</w:t>
+            </w:r>
+          </w:p>
+        </w:tc>
+        <w:tc>
+          <w:tcPr>
+            <w:tcW w:w="0" w:type="auto"/>
+            <w:vAlign w:val="center"/>
+          </w:tcPr>
+          <w:p>
+            <w:pPr>
+              <w:jc w:val="center"/>
+            </w:pPr>
+            <w:r>
+              <w:t>Double</w:t>
+            </w:r>
+          </w:p>
+        </w:tc>
+      </w:tr>
+      <w:tr>
+        <w:trPr>
+          <w:trHeight w:val="525"/>
+        </w:trPr>
+        <w:tc>
+          <w:tcPr>
+            <w:tcW w:w="0" w:type="auto"/>
+            <w:vMerge/>
+            <w:shd w:val="clear" w:color="auto" w:fill="153D63" w:themeFill="text2" w:themeFillTint="E6"/>
+            <w:vAlign w:val="center"/>
+          </w:tcPr>
+          <w:p>
+            <w:pPr>
+              <w:jc w:val="center"/>
+              <w:rPr>
+                <w:b/>
+                <w:bCs/>
+              </w:rPr>
+            </w:pPr>
+          </w:p>
+        </w:tc>
+        <w:tc>
+          <w:tcPr>
+            <w:tcW w:w="0" w:type="auto"/>
+            <w:vAlign w:val="center"/>
+          </w:tcPr>
+          <w:p>
+            <w:pPr>
+              <w:jc w:val="center"/>
+            </w:pPr>
+            <w:r>
+              <w:t>Updated Calculations</w:t>
+            </w:r>
+          </w:p>
+        </w:tc>
+        <w:tc>
+          <w:tcPr>
+            <w:tcW w:w="0" w:type="auto"/>
+            <w:vAlign w:val="center"/>
+          </w:tcPr>
+          <w:p>
+            <w:pPr>
+              <w:jc w:val="center"/>
+            </w:pPr>
+            <w:r>
+              <w:t>Values</w:t>
+            </w:r>
+          </w:p>
+        </w:tc>
+      </w:tr>
+      <w:tr>
+        <w:trPr>
+          <w:trHeight w:val="808"/>
+        </w:trPr>
+        <w:tc>
+          <w:tcPr>
+            <w:tcW w:w="0" w:type="auto"/>
+            <w:shd w:val="clear" w:color="auto" w:fill="153D63" w:themeFill="text2" w:themeFillTint="E6"/>
+            <w:vAlign w:val="center"/>
+          </w:tcPr>
+          <w:p>
+            <w:pPr>
+              <w:jc w:val="center"/>
+              <w:rPr>
+                <w:b/>
+                <w:bCs/>
+              </w:rPr>
+            </w:pPr>
+            <w:r>
+              <w:rPr>
+                <w:b/>
+                <w:bCs/>
+              </w:rPr>
+              <w:t>POSTCONDITIONS</w:t>
+            </w:r>
+          </w:p>
+        </w:tc>
+        <w:tc>
+          <w:tcPr>
+            <w:tcW w:w="0" w:type="auto"/>
+            <w:gridSpan w:val="2"/>
+            <w:vAlign w:val="center"/>
+          </w:tcPr>
+          <w:p>
+            <w:pPr>
+              <w:jc w:val="center"/>
+            </w:pPr>
+            <w:r>
+              <w:t xml:space="preserve">The grade information is </w:t>
+            </w:r>
+            <w:proofErr w:type="gramStart"/>
+            <w:r>
+              <w:t>updated</w:t>
+            </w:r>
+            <w:proofErr w:type="gramEnd"/>
+            <w:r>
+              <w:t xml:space="preserve"> and all dependent calculations reflect the change.</w:t>
+            </w:r>
+          </w:p>
+        </w:tc>
+      </w:tr>
+      <w:tr>
+        <w:trPr>
+          <w:trHeight w:val="1054"/>
+        </w:trPr>
+        <w:tc>
+          <w:tcPr>
+            <w:tcW w:w="0" w:type="auto"/>
+            <w:shd w:val="clear" w:color="auto" w:fill="153D63" w:themeFill="text2" w:themeFillTint="E6"/>
+            <w:vAlign w:val="center"/>
+          </w:tcPr>
+          <w:p>
+            <w:pPr>
+              <w:jc w:val="center"/>
+              <w:rPr>
+                <w:b/>
+                <w:bCs/>
+              </w:rPr>
+            </w:pPr>
+            <w:r>
+              <w:rPr>
+                <w:b/>
+                <w:bCs/>
+              </w:rPr>
+              <w:t>VALIDATIONS</w:t>
+            </w:r>
+          </w:p>
+        </w:tc>
+        <w:tc>
+          <w:tcPr>
+            <w:tcW w:w="0" w:type="auto"/>
+            <w:gridSpan w:val="2"/>
+            <w:vAlign w:val="center"/>
+          </w:tcPr>
+          <w:p>
+            <w:pPr>
+              <w:jc w:val="center"/>
+            </w:pPr>
+            <w:r>
+              <w:t>The grade must comply with the configured grading scale.</w:t>
+            </w:r>
+          </w:p>
+        </w:tc>
+      </w:tr>
+      <w:tr>
+        <w:trPr>
+          <w:trHeight w:val="1261"/>
+        </w:trPr>
+        <w:tc>
+          <w:tcPr>
+            <w:tcW w:w="0" w:type="auto"/>
+            <w:shd w:val="clear" w:color="auto" w:fill="153D63" w:themeFill="text2" w:themeFillTint="E6"/>
+            <w:vAlign w:val="center"/>
+          </w:tcPr>
+          <w:p>
+            <w:pPr>
+              <w:jc w:val="center"/>
+              <w:rPr>
+                <w:b/>
+                <w:bCs/>
+              </w:rPr>
+            </w:pPr>
+            <w:r>
+              <w:rPr>
+                <w:b/>
+                <w:bCs/>
+              </w:rPr>
+              <w:t>EXCEPTIONS</w:t>
+            </w:r>
+          </w:p>
+        </w:tc>
+        <w:tc>
+          <w:tcPr>
+            <w:tcW w:w="0" w:type="auto"/>
+            <w:gridSpan w:val="2"/>
+            <w:vAlign w:val="center"/>
+          </w:tcPr>
+          <w:p>
+            <w:pPr>
+              <w:jc w:val="center"/>
+            </w:pPr>
+            <w:r>
+              <w:t>Invalid grades or inaccessible assessment components shall be rejected.</w:t>
+            </w:r>
+          </w:p>
+        </w:tc>
+      </w:tr>
+    </w:tbl>
+    <w:p/>
+    <w:p>
+      <w:r>
+        <w:br w:type="page"/>
+      </w:r>
+    </w:p>
+    <w:tbl>
+      <w:tblPr>
+        <w:tblStyle w:val="Tablaconcuadrcula"/>
+        <w:tblW w:w="0" w:type="auto"/>
+        <w:tblLook w:val="04A0" w:firstRow="1" w:lastRow="0" w:firstColumn="1" w:lastColumn="0" w:noHBand="0" w:noVBand="1"/>
+      </w:tblPr>
+      <w:tblGrid>
+        <w:gridCol w:w="2390"/>
+        <w:gridCol w:w="4475"/>
+        <w:gridCol w:w="2485"/>
+      </w:tblGrid>
+      <w:tr>
+        <w:trPr>
+          <w:trHeight w:val="508"/>
+        </w:trPr>
+        <w:tc>
+          <w:tcPr>
+            <w:tcW w:w="0" w:type="auto"/>
+            <w:shd w:val="clear" w:color="auto" w:fill="153D63" w:themeFill="text2" w:themeFillTint="E6"/>
+            <w:vAlign w:val="center"/>
+          </w:tcPr>
+          <w:p>
+            <w:pPr>
+              <w:jc w:val="center"/>
+              <w:rPr>
+                <w:b/>
+                <w:bCs/>
+              </w:rPr>
+            </w:pPr>
+            <w:r>
+              <w:rPr>
+                <w:b/>
+                <w:bCs/>
+              </w:rPr>
+              <w:lastRenderedPageBreak/>
+              <w:t>ID</w:t>
+            </w:r>
+            <w:r>
+              <w:rPr>
+                <w:b/>
+                <w:bCs/>
+              </w:rPr>
+              <w:t xml:space="preserve"> &amp; NAME</w:t>
+            </w:r>
+          </w:p>
+        </w:tc>
+        <w:tc>
+          <w:tcPr>
+            <w:tcW w:w="0" w:type="auto"/>
+            <w:gridSpan w:val="2"/>
+            <w:vAlign w:val="center"/>
+          </w:tcPr>
+          <w:p>
+            <w:pPr>
+              <w:jc w:val="center"/>
+            </w:pPr>
+            <w:r>
+              <w:t>FR-GRD-</w:t>
+            </w:r>
+            <w:r>
+              <w:t>02</w:t>
+            </w:r>
+            <w:r>
+              <w:t xml:space="preserve"> </w:t>
+            </w:r>
+            <w:r>
+              <w:t xml:space="preserve">– </w:t>
+            </w:r>
+            <w:r>
+              <w:t>Track Ungraded Assessments</w:t>
+            </w:r>
+          </w:p>
+        </w:tc>
+      </w:tr>
+      <w:tr>
+        <w:trPr>
+          <w:trHeight w:val="824"/>
+        </w:trPr>
+        <w:tc>
+          <w:tcPr>
+            <w:tcW w:w="0" w:type="auto"/>
+            <w:shd w:val="clear" w:color="auto" w:fill="153D63" w:themeFill="text2" w:themeFillTint="E6"/>
+            <w:vAlign w:val="center"/>
+          </w:tcPr>
+          <w:p>
+            <w:pPr>
+              <w:jc w:val="center"/>
+              <w:rPr>
+                <w:b/>
+                <w:bCs/>
+              </w:rPr>
+            </w:pPr>
+            <w:r>
+              <w:rPr>
+                <w:b/>
+                <w:bCs/>
+              </w:rPr>
+              <w:t>DESCRIPTION</w:t>
+            </w:r>
+          </w:p>
+        </w:tc>
+        <w:tc>
+          <w:tcPr>
+            <w:tcW w:w="0" w:type="auto"/>
+            <w:gridSpan w:val="2"/>
+            <w:vAlign w:val="center"/>
+          </w:tcPr>
+          <w:p>
+            <w:pPr>
+              <w:jc w:val="center"/>
+            </w:pPr>
+            <w:r>
+              <w:t>The system shall distinguish between graded and ungraded assessment components and use their status when calculating current grades and projections.</w:t>
+            </w:r>
+          </w:p>
+        </w:tc>
+      </w:tr>
+      <w:tr>
+        <w:trPr>
+          <w:trHeight w:val="565"/>
+        </w:trPr>
+        <w:tc>
+          <w:tcPr>
+            <w:tcW w:w="0" w:type="auto"/>
+            <w:shd w:val="clear" w:color="auto" w:fill="153D63" w:themeFill="text2" w:themeFillTint="E6"/>
+            <w:vAlign w:val="center"/>
+          </w:tcPr>
+          <w:p>
+            <w:pPr>
+              <w:jc w:val="center"/>
+              <w:rPr>
+                <w:b/>
+                <w:bCs/>
+              </w:rPr>
+            </w:pPr>
+            <w:r>
+              <w:rPr>
+                <w:b/>
+                <w:bCs/>
+              </w:rPr>
+              <w:t>ACTORS</w:t>
+            </w:r>
+          </w:p>
+        </w:tc>
+        <w:tc>
+          <w:tcPr>
+            <w:tcW w:w="0" w:type="auto"/>
+            <w:gridSpan w:val="2"/>
+            <w:vAlign w:val="center"/>
+          </w:tcPr>
+          <w:p>
+            <w:pPr>
+              <w:jc w:val="center"/>
+            </w:pPr>
+            <w:r>
+              <w:t>User</w:t>
+            </w:r>
+          </w:p>
+        </w:tc>
+      </w:tr>
+      <w:tr>
+        <w:trPr>
+          <w:trHeight w:val="724"/>
+        </w:trPr>
+        <w:tc>
+          <w:tcPr>
+            <w:tcW w:w="0" w:type="auto"/>
+            <w:shd w:val="clear" w:color="auto" w:fill="153D63" w:themeFill="text2" w:themeFillTint="E6"/>
+            <w:vAlign w:val="center"/>
+          </w:tcPr>
+          <w:p>
+            <w:pPr>
+              <w:jc w:val="center"/>
+              <w:rPr>
+                <w:b/>
+                <w:bCs/>
+              </w:rPr>
+            </w:pPr>
+            <w:r>
+              <w:rPr>
+                <w:b/>
+                <w:bCs/>
+              </w:rPr>
+              <w:t>PRECONDITIONS</w:t>
+            </w:r>
+          </w:p>
+        </w:tc>
+        <w:tc>
+          <w:tcPr>
+            <w:tcW w:w="0" w:type="auto"/>
+            <w:gridSpan w:val="2"/>
+            <w:vAlign w:val="center"/>
+          </w:tcPr>
+          <w:p>
+            <w:pPr>
+              <w:pStyle w:val="Prrafodelista"/>
+              <w:ind w:left="0"/>
+              <w:jc w:val="center"/>
+            </w:pPr>
+            <w:r>
+              <w:t>Assessment components exist within a subject.</w:t>
+            </w:r>
+          </w:p>
+        </w:tc>
+      </w:tr>
+      <w:tr>
+        <w:trPr>
+          <w:trHeight w:val="363"/>
+        </w:trPr>
+        <w:tc>
+          <w:tcPr>
+            <w:tcW w:w="0" w:type="auto"/>
+            <w:vMerge w:val="restart"/>
+            <w:shd w:val="clear" w:color="auto" w:fill="153D63" w:themeFill="text2" w:themeFillTint="E6"/>
+            <w:vAlign w:val="center"/>
+          </w:tcPr>
+          <w:p>
+            <w:pPr>
+              <w:jc w:val="center"/>
+              <w:rPr>
+                <w:b/>
+                <w:bCs/>
+              </w:rPr>
+            </w:pPr>
+            <w:r>
+              <w:rPr>
+                <w:b/>
+                <w:bCs/>
+              </w:rPr>
+              <w:t>INPUTS</w:t>
+            </w:r>
+          </w:p>
+        </w:tc>
+        <w:tc>
+          <w:tcPr>
+            <w:tcW w:w="0" w:type="auto"/>
+            <w:shd w:val="clear" w:color="auto" w:fill="153D63" w:themeFill="text2" w:themeFillTint="E6"/>
+            <w:vAlign w:val="center"/>
+          </w:tcPr>
+          <w:p>
+            <w:pPr>
+              <w:jc w:val="center"/>
+              <w:rPr>
+                <w:b/>
+                <w:bCs/>
+              </w:rPr>
+            </w:pPr>
+            <w:r>
+              <w:rPr>
+                <w:b/>
+                <w:bCs/>
+              </w:rPr>
+              <w:t>NAME</w:t>
+            </w:r>
+          </w:p>
+        </w:tc>
+        <w:tc>
+          <w:tcPr>
+            <w:tcW w:w="0" w:type="auto"/>
+            <w:shd w:val="clear" w:color="auto" w:fill="153D63" w:themeFill="text2" w:themeFillTint="E6"/>
+            <w:vAlign w:val="center"/>
+          </w:tcPr>
+          <w:p>
+            <w:pPr>
+              <w:jc w:val="center"/>
+              <w:rPr>
+                <w:b/>
+                <w:bCs/>
+              </w:rPr>
+            </w:pPr>
+            <w:r>
+              <w:rPr>
+                <w:b/>
+                <w:bCs/>
+              </w:rPr>
+              <w:t>TYPE</w:t>
+            </w:r>
+          </w:p>
+        </w:tc>
+      </w:tr>
+      <w:tr>
+        <w:trPr>
+          <w:trHeight w:val="517"/>
+        </w:trPr>
+        <w:tc>
+          <w:tcPr>
+            <w:tcW w:w="0" w:type="auto"/>
+            <w:vMerge/>
+            <w:shd w:val="clear" w:color="auto" w:fill="153D63" w:themeFill="text2" w:themeFillTint="E6"/>
+            <w:vAlign w:val="center"/>
+          </w:tcPr>
+          <w:p>
+            <w:pPr>
+              <w:jc w:val="center"/>
+              <w:rPr>
+                <w:b/>
+                <w:bCs/>
+              </w:rPr>
+            </w:pPr>
+          </w:p>
+        </w:tc>
+        <w:tc>
+          <w:tcPr>
+            <w:tcW w:w="0" w:type="auto"/>
+            <w:vAlign w:val="center"/>
+          </w:tcPr>
+          <w:p>
+            <w:pPr>
+              <w:jc w:val="center"/>
+            </w:pPr>
+            <w:r>
+              <w:t>Assessment</w:t>
+            </w:r>
+            <w:r>
+              <w:t xml:space="preserve"> Status</w:t>
+            </w:r>
+          </w:p>
+        </w:tc>
+        <w:tc>
+          <w:tcPr>
+            <w:tcW w:w="0" w:type="auto"/>
+            <w:vAlign w:val="center"/>
+          </w:tcPr>
+          <w:p>
+            <w:pPr>
+              <w:jc w:val="center"/>
+            </w:pPr>
+            <w:r>
+              <w:t>Boolean</w:t>
+            </w:r>
+          </w:p>
+        </w:tc>
+      </w:tr>
+      <w:tr>
+        <w:trPr>
+          <w:trHeight w:val="992"/>
+        </w:trPr>
+        <w:tc>
+          <w:tcPr>
+            <w:tcW w:w="0" w:type="auto"/>
+            <w:shd w:val="clear" w:color="auto" w:fill="153D63" w:themeFill="text2" w:themeFillTint="E6"/>
+            <w:vAlign w:val="center"/>
+          </w:tcPr>
+          <w:p>
+            <w:pPr>
+              <w:jc w:val="center"/>
+              <w:rPr>
+                <w:b/>
+                <w:bCs/>
+              </w:rPr>
+            </w:pPr>
+            <w:r>
+              <w:rPr>
+                <w:b/>
+                <w:bCs/>
+              </w:rPr>
+              <w:t>PROCESS</w:t>
+            </w:r>
+          </w:p>
+        </w:tc>
+        <w:tc>
+          <w:tcPr>
+            <w:tcW w:w="0" w:type="auto"/>
+            <w:gridSpan w:val="2"/>
+            <w:vAlign w:val="center"/>
+          </w:tcPr>
+          <w:p>
+            <w:pPr>
+              <w:jc w:val="center"/>
+            </w:pPr>
+            <w:r>
+              <w:t xml:space="preserve">The system determines which assessment components have recorded </w:t>
+            </w:r>
+            <w:proofErr w:type="gramStart"/>
+            <w:r>
+              <w:t>grades</w:t>
+            </w:r>
+            <w:proofErr w:type="gramEnd"/>
+            <w:r>
+              <w:t xml:space="preserve"> and which remain ungraded.</w:t>
+            </w:r>
+          </w:p>
+        </w:tc>
+      </w:tr>
+      <w:tr>
+        <w:trPr>
+          <w:trHeight w:val="347"/>
+        </w:trPr>
+        <w:tc>
+          <w:tcPr>
+            <w:tcW w:w="0" w:type="auto"/>
+            <w:vMerge w:val="restart"/>
+            <w:shd w:val="clear" w:color="auto" w:fill="153D63" w:themeFill="text2" w:themeFillTint="E6"/>
+            <w:vAlign w:val="center"/>
+          </w:tcPr>
+          <w:p>
+            <w:pPr>
+              <w:jc w:val="center"/>
+              <w:rPr>
+                <w:b/>
+                <w:bCs/>
+              </w:rPr>
+            </w:pPr>
+            <w:r>
+              <w:rPr>
+                <w:b/>
+                <w:bCs/>
+              </w:rPr>
+              <w:t>OUTPUTS</w:t>
+            </w:r>
+          </w:p>
+        </w:tc>
+        <w:tc>
+          <w:tcPr>
+            <w:tcW w:w="0" w:type="auto"/>
+            <w:shd w:val="clear" w:color="auto" w:fill="153D63" w:themeFill="text2" w:themeFillTint="E6"/>
+            <w:vAlign w:val="center"/>
+          </w:tcPr>
+          <w:p>
+            <w:pPr>
+              <w:jc w:val="center"/>
+              <w:rPr>
+                <w:b/>
+                <w:bCs/>
+              </w:rPr>
+            </w:pPr>
+            <w:r>
+              <w:rPr>
+                <w:b/>
+                <w:bCs/>
+              </w:rPr>
+              <w:t>NAME</w:t>
+            </w:r>
+          </w:p>
+        </w:tc>
+        <w:tc>
+          <w:tcPr>
+            <w:tcW w:w="0" w:type="auto"/>
+            <w:shd w:val="clear" w:color="auto" w:fill="153D63" w:themeFill="text2" w:themeFillTint="E6"/>
+            <w:vAlign w:val="center"/>
+          </w:tcPr>
+          <w:p>
+            <w:pPr>
+              <w:jc w:val="center"/>
+              <w:rPr>
+                <w:b/>
+                <w:bCs/>
+              </w:rPr>
+            </w:pPr>
+            <w:r>
+              <w:rPr>
+                <w:b/>
+                <w:bCs/>
+              </w:rPr>
+              <w:t>TYPE</w:t>
+            </w:r>
+          </w:p>
+        </w:tc>
+      </w:tr>
+      <w:tr>
+        <w:trPr>
+          <w:trHeight w:val="525"/>
+        </w:trPr>
+        <w:tc>
+          <w:tcPr>
+            <w:tcW w:w="0" w:type="auto"/>
+            <w:vMerge/>
+            <w:shd w:val="clear" w:color="auto" w:fill="153D63" w:themeFill="text2" w:themeFillTint="E6"/>
+            <w:vAlign w:val="center"/>
+          </w:tcPr>
+          <w:p>
+            <w:pPr>
+              <w:jc w:val="center"/>
+              <w:rPr>
+                <w:b/>
+                <w:bCs/>
+              </w:rPr>
+            </w:pPr>
+          </w:p>
+        </w:tc>
+        <w:tc>
+          <w:tcPr>
+            <w:tcW w:w="0" w:type="auto"/>
+            <w:vAlign w:val="center"/>
+          </w:tcPr>
+          <w:p>
+            <w:pPr>
+              <w:jc w:val="center"/>
+            </w:pPr>
+            <w:r>
+              <w:t>Assessment Status</w:t>
+            </w:r>
+          </w:p>
+        </w:tc>
+        <w:tc>
+          <w:tcPr>
+            <w:tcW w:w="0" w:type="auto"/>
+            <w:vAlign w:val="center"/>
+          </w:tcPr>
+          <w:p>
+            <w:pPr>
+              <w:jc w:val="center"/>
+            </w:pPr>
+            <w:r>
+              <w:t>Boolean</w:t>
+            </w:r>
+          </w:p>
+        </w:tc>
+      </w:tr>
+      <w:tr>
+        <w:trPr>
+          <w:trHeight w:val="525"/>
+        </w:trPr>
+        <w:tc>
+          <w:tcPr>
+            <w:tcW w:w="0" w:type="auto"/>
+            <w:vMerge/>
+            <w:shd w:val="clear" w:color="auto" w:fill="153D63" w:themeFill="text2" w:themeFillTint="E6"/>
+            <w:vAlign w:val="center"/>
+          </w:tcPr>
+          <w:p>
+            <w:pPr>
+              <w:jc w:val="center"/>
+              <w:rPr>
+                <w:b/>
+                <w:bCs/>
+              </w:rPr>
+            </w:pPr>
+          </w:p>
+        </w:tc>
+        <w:tc>
+          <w:tcPr>
+            <w:tcW w:w="0" w:type="auto"/>
+            <w:vAlign w:val="center"/>
+          </w:tcPr>
+          <w:p>
+            <w:pPr>
+              <w:jc w:val="center"/>
+            </w:pPr>
+            <w:r>
+              <w:t>Remaining weight</w:t>
+            </w:r>
+          </w:p>
+        </w:tc>
+        <w:tc>
+          <w:tcPr>
+            <w:tcW w:w="0" w:type="auto"/>
+            <w:vAlign w:val="center"/>
+          </w:tcPr>
+          <w:p>
+            <w:pPr>
+              <w:jc w:val="center"/>
+            </w:pPr>
+            <w:r>
+              <w:t>Double</w:t>
+            </w:r>
+          </w:p>
+        </w:tc>
+      </w:tr>
+      <w:tr>
+        <w:trPr>
+          <w:trHeight w:val="808"/>
+        </w:trPr>
+        <w:tc>
+          <w:tcPr>
+            <w:tcW w:w="0" w:type="auto"/>
+            <w:shd w:val="clear" w:color="auto" w:fill="153D63" w:themeFill="text2" w:themeFillTint="E6"/>
+            <w:vAlign w:val="center"/>
+          </w:tcPr>
+          <w:p>
+            <w:pPr>
+              <w:jc w:val="center"/>
+              <w:rPr>
+                <w:b/>
+                <w:bCs/>
+              </w:rPr>
+            </w:pPr>
+            <w:r>
+              <w:rPr>
+                <w:b/>
+                <w:bCs/>
+              </w:rPr>
+              <w:t>POSTCONDITIONS</w:t>
+            </w:r>
+          </w:p>
+        </w:tc>
+        <w:tc>
+          <w:tcPr>
+            <w:tcW w:w="0" w:type="auto"/>
+            <w:gridSpan w:val="2"/>
+            <w:vAlign w:val="center"/>
+          </w:tcPr>
+          <w:p>
+            <w:pPr>
+              <w:jc w:val="center"/>
+            </w:pPr>
+            <w:r>
+              <w:t xml:space="preserve">The system maintains the current grading status of the subject. </w:t>
+            </w:r>
+          </w:p>
+        </w:tc>
+      </w:tr>
+      <w:tr>
+        <w:trPr>
+          <w:trHeight w:val="1054"/>
+        </w:trPr>
+        <w:tc>
+          <w:tcPr>
+            <w:tcW w:w="0" w:type="auto"/>
+            <w:shd w:val="clear" w:color="auto" w:fill="153D63" w:themeFill="text2" w:themeFillTint="E6"/>
+            <w:vAlign w:val="center"/>
+          </w:tcPr>
+          <w:p>
+            <w:pPr>
+              <w:jc w:val="center"/>
+              <w:rPr>
+                <w:b/>
+                <w:bCs/>
+              </w:rPr>
+            </w:pPr>
+            <w:r>
+              <w:rPr>
+                <w:b/>
+                <w:bCs/>
+              </w:rPr>
+              <w:t>VALIDATIONS</w:t>
+            </w:r>
+          </w:p>
+        </w:tc>
+        <w:tc>
+          <w:tcPr>
+            <w:tcW w:w="0" w:type="auto"/>
+            <w:gridSpan w:val="2"/>
+            <w:vAlign w:val="center"/>
+          </w:tcPr>
+          <w:p>
+            <w:pPr>
+              <w:jc w:val="center"/>
+            </w:pPr>
+            <w:r>
+              <w:t>An assessment shall only be considered graded when a valid grade is recorded.</w:t>
+            </w:r>
+          </w:p>
+        </w:tc>
+      </w:tr>
+      <w:tr>
+        <w:trPr>
+          <w:trHeight w:val="1261"/>
+        </w:trPr>
+        <w:tc>
+          <w:tcPr>
+            <w:tcW w:w="0" w:type="auto"/>
+            <w:shd w:val="clear" w:color="auto" w:fill="153D63" w:themeFill="text2" w:themeFillTint="E6"/>
+            <w:vAlign w:val="center"/>
+          </w:tcPr>
+          <w:p>
+            <w:pPr>
+              <w:jc w:val="center"/>
+              <w:rPr>
+                <w:b/>
+                <w:bCs/>
+              </w:rPr>
+            </w:pPr>
+            <w:r>
+              <w:rPr>
+                <w:b/>
+                <w:bCs/>
+              </w:rPr>
+              <w:t>EXCEPTIONS</w:t>
+            </w:r>
+          </w:p>
+        </w:tc>
+        <w:tc>
+          <w:tcPr>
+            <w:tcW w:w="0" w:type="auto"/>
+            <w:gridSpan w:val="2"/>
+            <w:vAlign w:val="center"/>
+          </w:tcPr>
+          <w:p>
+            <w:pPr>
+              <w:jc w:val="center"/>
+            </w:pPr>
+            <w:r>
+              <w:t>Inconsistent or invalid assessment status data shall not be used for calculations.</w:t>
+            </w:r>
+          </w:p>
+        </w:tc>
+      </w:tr>
+    </w:tbl>
+    <w:p/>
+    <w:p>
+      <w:r>
+        <w:br w:type="page"/>
+      </w:r>
+    </w:p>
     <w:p/>
     <w:sectPr>
       <w:pgSz w:w="12240" w:h="15840"/>

</xml_diff>

<commit_message>
docs: create risk and goal progress and report requirement tables
</commit_message>
<xml_diff>
--- a/docs/SRS.docx
+++ b/docs/SRS.docx
@@ -3275,40 +3275,22 @@
     <w:p>
       <w:pPr>
         <w:pStyle w:val="Ttulo3"/>
-        <w:rPr>
-          <w:lang w:val="en-US"/>
-        </w:rPr>
       </w:pPr>
       <w:bookmarkStart w:id="17" w:name="_Toc237819753"/>
       <w:r>
-        <w:rPr>
-          <w:lang w:val="en-US"/>
-        </w:rPr>
         <w:t>Academic Period Management</w:t>
       </w:r>
       <w:r>
-        <w:rPr>
-          <w:lang w:val="en-US"/>
-        </w:rPr>
         <w:t xml:space="preserve"> (ACP)</w:t>
       </w:r>
       <w:r>
-        <w:rPr>
-          <w:lang w:val="en-US"/>
-        </w:rPr>
         <w:t xml:space="preserve"> Requirements</w:t>
       </w:r>
       <w:bookmarkEnd w:id="17"/>
       <w:r>
-        <w:rPr>
-          <w:lang w:val="en-US"/>
-        </w:rPr>
         <w:t xml:space="preserve"> </w:t>
       </w:r>
       <w:r>
-        <w:rPr>
-          <w:lang w:val="en-US"/>
-        </w:rPr>
         <w:t xml:space="preserve"> </w:t>
       </w:r>
     </w:p>
@@ -13959,7 +13941,6 @@
                 <w:b/>
                 <w:bCs/>
               </w:rPr>
-              <w:lastRenderedPageBreak/>
               <w:t>ID</w:t>
             </w:r>
             <w:r>
@@ -14662,7 +14643,6 @@
                 <w:b/>
                 <w:bCs/>
               </w:rPr>
-              <w:lastRenderedPageBreak/>
               <w:t>ID</w:t>
             </w:r>
             <w:r>
@@ -15304,7 +15284,6 @@
                 <w:b/>
                 <w:bCs/>
               </w:rPr>
-              <w:lastRenderedPageBreak/>
               <w:t>ID</w:t>
             </w:r>
             <w:r>
@@ -16055,7 +16034,6 @@
                 <w:b/>
                 <w:bCs/>
               </w:rPr>
-              <w:lastRenderedPageBreak/>
               <w:t>ID</w:t>
             </w:r>
             <w:r>
@@ -16768,41 +16746,11 @@
         </w:tc>
       </w:tr>
     </w:tbl>
-    <w:p>
-      <w:pPr>
-        <w:pStyle w:val="Ttulo3"/>
-        <w:numPr>
-          <w:ilvl w:val="0"/>
-          <w:numId w:val="0"/>
-        </w:numPr>
-        <w:rPr>
-          <w:highlight w:val="lightGray"/>
-        </w:rPr>
-      </w:pPr>
-    </w:p>
-    <w:p>
-      <w:pPr>
-        <w:rPr>
-          <w:rFonts w:eastAsiaTheme="majorEastAsia" w:cstheme="majorBidi"/>
-          <w:b/>
-          <w:bCs/>
-          <w:highlight w:val="lightGray"/>
-          <w:lang w:val="es-ES"/>
-        </w:rPr>
-      </w:pPr>
-      <w:r>
-        <w:rPr>
-          <w:highlight w:val="lightGray"/>
-        </w:rPr>
-        <w:br w:type="page"/>
-      </w:r>
-    </w:p>
     <w:p>
       <w:pPr>
         <w:pStyle w:val="Ttulo3"/>
       </w:pPr>
       <w:r>
-        <w:lastRenderedPageBreak/>
         <w:t>Grade Management (GRD) Requirements</w:t>
       </w:r>
     </w:p>
@@ -19647,8 +19595,13 @@
       <w:pPr>
         <w:pStyle w:val="Ttulo3"/>
       </w:pPr>
+      <w:proofErr w:type="spellStart"/>
       <w:r>
-        <w:t xml:space="preserve">Calculations and </w:t>
+        <w:t>Calculations</w:t>
+      </w:r>
+      <w:proofErr w:type="spellEnd"/>
+      <w:r>
+        <w:t xml:space="preserve"> and </w:t>
       </w:r>
       <w:proofErr w:type="spellStart"/>
       <w:r>
@@ -20213,7 +20166,7 @@
               <w:jc w:val="center"/>
             </w:pPr>
             <w:r>
-              <w:t>Boolean</w:t>
+              <w:t>Double</w:t>
             </w:r>
           </w:p>
         </w:tc>
@@ -20961,7 +20914,7 @@
               <w:jc w:val="center"/>
             </w:pPr>
             <w:r>
-              <w:t>Boolean</w:t>
+              <w:t>Double</w:t>
             </w:r>
           </w:p>
         </w:tc>
@@ -21759,7 +21712,7 @@
               <w:jc w:val="center"/>
             </w:pPr>
             <w:r>
-              <w:t>Boolean</w:t>
+              <w:t>Double</w:t>
             </w:r>
           </w:p>
         </w:tc>
@@ -22504,7 +22457,7 @@
               <w:jc w:val="center"/>
             </w:pPr>
             <w:r>
-              <w:t>Boolean</w:t>
+              <w:t>Double</w:t>
             </w:r>
           </w:p>
         </w:tc>
@@ -22554,7 +22507,7 @@
               <w:jc w:val="center"/>
             </w:pPr>
             <w:r>
-              <w:t>Boolean</w:t>
+              <w:t>Double</w:t>
             </w:r>
           </w:p>
         </w:tc>
@@ -22690,6 +22643,2785 @@
       </w:tr>
     </w:tbl>
     <w:p/>
+    <w:p>
+      <w:r>
+        <w:br w:type="page"/>
+      </w:r>
+    </w:p>
+    <w:p>
+      <w:pPr>
+        <w:pStyle w:val="Ttulo3"/>
+      </w:pPr>
+      <w:r>
+        <w:t xml:space="preserve">Risk and </w:t>
+      </w:r>
+      <w:proofErr w:type="spellStart"/>
+      <w:r>
+        <w:t>Goal</w:t>
+      </w:r>
+      <w:proofErr w:type="spellEnd"/>
+      <w:r>
+        <w:t xml:space="preserve"> </w:t>
+      </w:r>
+      <w:proofErr w:type="spellStart"/>
+      <w:r>
+        <w:t>Progress</w:t>
+      </w:r>
+      <w:proofErr w:type="spellEnd"/>
+      <w:r>
+        <w:t xml:space="preserve"> (RSK) Requirements</w:t>
+      </w:r>
+    </w:p>
+    <w:tbl>
+      <w:tblPr>
+        <w:tblStyle w:val="Tablaconcuadrcula"/>
+        <w:tblW w:w="0" w:type="auto"/>
+        <w:tblLook w:val="04A0" w:firstRow="1" w:lastRow="0" w:firstColumn="1" w:lastColumn="0" w:noHBand="0" w:noVBand="1"/>
+      </w:tblPr>
+      <w:tblGrid>
+        <w:gridCol w:w="2390"/>
+        <w:gridCol w:w="4853"/>
+        <w:gridCol w:w="2107"/>
+      </w:tblGrid>
+      <w:tr>
+        <w:trPr>
+          <w:trHeight w:val="508"/>
+        </w:trPr>
+        <w:tc>
+          <w:tcPr>
+            <w:tcW w:w="0" w:type="auto"/>
+            <w:shd w:val="clear" w:color="auto" w:fill="153D63" w:themeFill="text2" w:themeFillTint="E6"/>
+            <w:vAlign w:val="center"/>
+          </w:tcPr>
+          <w:p>
+            <w:pPr>
+              <w:jc w:val="center"/>
+              <w:rPr>
+                <w:b/>
+                <w:bCs/>
+              </w:rPr>
+            </w:pPr>
+            <w:r>
+              <w:rPr>
+                <w:b/>
+                <w:bCs/>
+              </w:rPr>
+              <w:t>ID</w:t>
+            </w:r>
+            <w:r>
+              <w:rPr>
+                <w:b/>
+                <w:bCs/>
+              </w:rPr>
+              <w:t xml:space="preserve"> &amp; NAME</w:t>
+            </w:r>
+          </w:p>
+        </w:tc>
+        <w:tc>
+          <w:tcPr>
+            <w:tcW w:w="0" w:type="auto"/>
+            <w:gridSpan w:val="2"/>
+            <w:vAlign w:val="center"/>
+          </w:tcPr>
+          <w:p>
+            <w:pPr>
+              <w:jc w:val="center"/>
+            </w:pPr>
+            <w:r>
+              <w:t>FR</w:t>
+            </w:r>
+            <w:r>
+              <w:t>-</w:t>
+            </w:r>
+            <w:r>
+              <w:t>RSK</w:t>
+            </w:r>
+            <w:r>
+              <w:t>-</w:t>
+            </w:r>
+            <w:r>
+              <w:t>0</w:t>
+            </w:r>
+            <w:r>
+              <w:t>1</w:t>
+            </w:r>
+            <w:r>
+              <w:t xml:space="preserve"> </w:t>
+            </w:r>
+            <w:r>
+              <w:t xml:space="preserve">– </w:t>
+            </w:r>
+            <w:r>
+              <w:t xml:space="preserve">Detect </w:t>
+            </w:r>
+            <w:r>
+              <w:t>at</w:t>
+            </w:r>
+            <w:r>
+              <w:t xml:space="preserve"> Risk Subjects</w:t>
+            </w:r>
+          </w:p>
+        </w:tc>
+      </w:tr>
+      <w:tr>
+        <w:trPr>
+          <w:trHeight w:val="824"/>
+        </w:trPr>
+        <w:tc>
+          <w:tcPr>
+            <w:tcW w:w="0" w:type="auto"/>
+            <w:shd w:val="clear" w:color="auto" w:fill="153D63" w:themeFill="text2" w:themeFillTint="E6"/>
+            <w:vAlign w:val="center"/>
+          </w:tcPr>
+          <w:p>
+            <w:pPr>
+              <w:jc w:val="center"/>
+              <w:rPr>
+                <w:b/>
+                <w:bCs/>
+              </w:rPr>
+            </w:pPr>
+            <w:r>
+              <w:rPr>
+                <w:b/>
+                <w:bCs/>
+              </w:rPr>
+              <w:t>DESCRIPTION</w:t>
+            </w:r>
+          </w:p>
+        </w:tc>
+        <w:tc>
+          <w:tcPr>
+            <w:tcW w:w="0" w:type="auto"/>
+            <w:gridSpan w:val="2"/>
+            <w:vAlign w:val="center"/>
+          </w:tcPr>
+          <w:p>
+            <w:pPr>
+              <w:jc w:val="center"/>
+            </w:pPr>
+            <w:r>
+              <w:t>The system shall identify subjects whose projected final grade falls within the configured at-risk range.</w:t>
+            </w:r>
+          </w:p>
+        </w:tc>
+      </w:tr>
+      <w:tr>
+        <w:trPr>
+          <w:trHeight w:val="565"/>
+        </w:trPr>
+        <w:tc>
+          <w:tcPr>
+            <w:tcW w:w="0" w:type="auto"/>
+            <w:shd w:val="clear" w:color="auto" w:fill="153D63" w:themeFill="text2" w:themeFillTint="E6"/>
+            <w:vAlign w:val="center"/>
+          </w:tcPr>
+          <w:p>
+            <w:pPr>
+              <w:jc w:val="center"/>
+              <w:rPr>
+                <w:b/>
+                <w:bCs/>
+              </w:rPr>
+            </w:pPr>
+            <w:r>
+              <w:rPr>
+                <w:b/>
+                <w:bCs/>
+              </w:rPr>
+              <w:t>ACTORS</w:t>
+            </w:r>
+          </w:p>
+        </w:tc>
+        <w:tc>
+          <w:tcPr>
+            <w:tcW w:w="0" w:type="auto"/>
+            <w:gridSpan w:val="2"/>
+            <w:vAlign w:val="center"/>
+          </w:tcPr>
+          <w:p>
+            <w:pPr>
+              <w:jc w:val="center"/>
+            </w:pPr>
+            <w:r>
+              <w:t>System</w:t>
+            </w:r>
+          </w:p>
+        </w:tc>
+      </w:tr>
+      <w:tr>
+        <w:trPr>
+          <w:trHeight w:val="724"/>
+        </w:trPr>
+        <w:tc>
+          <w:tcPr>
+            <w:tcW w:w="0" w:type="auto"/>
+            <w:shd w:val="clear" w:color="auto" w:fill="153D63" w:themeFill="text2" w:themeFillTint="E6"/>
+            <w:vAlign w:val="center"/>
+          </w:tcPr>
+          <w:p>
+            <w:pPr>
+              <w:jc w:val="center"/>
+              <w:rPr>
+                <w:b/>
+                <w:bCs/>
+              </w:rPr>
+            </w:pPr>
+            <w:r>
+              <w:rPr>
+                <w:b/>
+                <w:bCs/>
+              </w:rPr>
+              <w:t>PRECONDITIONS</w:t>
+            </w:r>
+          </w:p>
+        </w:tc>
+        <w:tc>
+          <w:tcPr>
+            <w:tcW w:w="0" w:type="auto"/>
+            <w:gridSpan w:val="2"/>
+            <w:vAlign w:val="center"/>
+          </w:tcPr>
+          <w:p>
+            <w:pPr>
+              <w:pStyle w:val="Prrafodelista"/>
+              <w:ind w:left="0"/>
+              <w:jc w:val="center"/>
+            </w:pPr>
+            <w:r>
+              <w:t>The subject has a valid projected final grade and a configured minimum passing grade</w:t>
+            </w:r>
+          </w:p>
+        </w:tc>
+      </w:tr>
+      <w:tr>
+        <w:trPr>
+          <w:trHeight w:val="363"/>
+        </w:trPr>
+        <w:tc>
+          <w:tcPr>
+            <w:tcW w:w="0" w:type="auto"/>
+            <w:vMerge w:val="restart"/>
+            <w:shd w:val="clear" w:color="auto" w:fill="153D63" w:themeFill="text2" w:themeFillTint="E6"/>
+            <w:vAlign w:val="center"/>
+          </w:tcPr>
+          <w:p>
+            <w:pPr>
+              <w:jc w:val="center"/>
+              <w:rPr>
+                <w:b/>
+                <w:bCs/>
+              </w:rPr>
+            </w:pPr>
+            <w:r>
+              <w:rPr>
+                <w:b/>
+                <w:bCs/>
+              </w:rPr>
+              <w:t>INPUTS</w:t>
+            </w:r>
+          </w:p>
+        </w:tc>
+        <w:tc>
+          <w:tcPr>
+            <w:tcW w:w="0" w:type="auto"/>
+            <w:shd w:val="clear" w:color="auto" w:fill="153D63" w:themeFill="text2" w:themeFillTint="E6"/>
+            <w:vAlign w:val="center"/>
+          </w:tcPr>
+          <w:p>
+            <w:pPr>
+              <w:jc w:val="center"/>
+              <w:rPr>
+                <w:b/>
+                <w:bCs/>
+              </w:rPr>
+            </w:pPr>
+            <w:r>
+              <w:rPr>
+                <w:b/>
+                <w:bCs/>
+              </w:rPr>
+              <w:t>NAME</w:t>
+            </w:r>
+          </w:p>
+        </w:tc>
+        <w:tc>
+          <w:tcPr>
+            <w:tcW w:w="0" w:type="auto"/>
+            <w:shd w:val="clear" w:color="auto" w:fill="153D63" w:themeFill="text2" w:themeFillTint="E6"/>
+            <w:vAlign w:val="center"/>
+          </w:tcPr>
+          <w:p>
+            <w:pPr>
+              <w:jc w:val="center"/>
+              <w:rPr>
+                <w:b/>
+                <w:bCs/>
+              </w:rPr>
+            </w:pPr>
+            <w:r>
+              <w:rPr>
+                <w:b/>
+                <w:bCs/>
+              </w:rPr>
+              <w:t>TYPE</w:t>
+            </w:r>
+          </w:p>
+        </w:tc>
+      </w:tr>
+      <w:tr>
+        <w:trPr>
+          <w:trHeight w:val="517"/>
+        </w:trPr>
+        <w:tc>
+          <w:tcPr>
+            <w:tcW w:w="0" w:type="auto"/>
+            <w:vMerge/>
+            <w:shd w:val="clear" w:color="auto" w:fill="153D63" w:themeFill="text2" w:themeFillTint="E6"/>
+            <w:vAlign w:val="center"/>
+          </w:tcPr>
+          <w:p>
+            <w:pPr>
+              <w:jc w:val="center"/>
+              <w:rPr>
+                <w:b/>
+                <w:bCs/>
+              </w:rPr>
+            </w:pPr>
+          </w:p>
+        </w:tc>
+        <w:tc>
+          <w:tcPr>
+            <w:tcW w:w="0" w:type="auto"/>
+            <w:vAlign w:val="center"/>
+          </w:tcPr>
+          <w:p>
+            <w:pPr>
+              <w:jc w:val="center"/>
+            </w:pPr>
+            <w:r>
+              <w:t>Projected Final Grade</w:t>
+            </w:r>
+          </w:p>
+        </w:tc>
+        <w:tc>
+          <w:tcPr>
+            <w:tcW w:w="0" w:type="auto"/>
+            <w:vAlign w:val="center"/>
+          </w:tcPr>
+          <w:p>
+            <w:pPr>
+              <w:jc w:val="center"/>
+            </w:pPr>
+            <w:r>
+              <w:t>Double</w:t>
+            </w:r>
+          </w:p>
+        </w:tc>
+      </w:tr>
+      <w:tr>
+        <w:trPr>
+          <w:trHeight w:val="517"/>
+        </w:trPr>
+        <w:tc>
+          <w:tcPr>
+            <w:tcW w:w="0" w:type="auto"/>
+            <w:vMerge/>
+            <w:shd w:val="clear" w:color="auto" w:fill="153D63" w:themeFill="text2" w:themeFillTint="E6"/>
+            <w:vAlign w:val="center"/>
+          </w:tcPr>
+          <w:p>
+            <w:pPr>
+              <w:jc w:val="center"/>
+              <w:rPr>
+                <w:b/>
+                <w:bCs/>
+              </w:rPr>
+            </w:pPr>
+          </w:p>
+        </w:tc>
+        <w:tc>
+          <w:tcPr>
+            <w:tcW w:w="0" w:type="auto"/>
+            <w:vAlign w:val="center"/>
+          </w:tcPr>
+          <w:p>
+            <w:pPr>
+              <w:jc w:val="center"/>
+            </w:pPr>
+            <w:r>
+              <w:t>Minimum Passing Grade</w:t>
+            </w:r>
+          </w:p>
+        </w:tc>
+        <w:tc>
+          <w:tcPr>
+            <w:tcW w:w="0" w:type="auto"/>
+            <w:vAlign w:val="center"/>
+          </w:tcPr>
+          <w:p>
+            <w:pPr>
+              <w:jc w:val="center"/>
+            </w:pPr>
+            <w:r>
+              <w:t>Double</w:t>
+            </w:r>
+          </w:p>
+        </w:tc>
+      </w:tr>
+      <w:tr>
+        <w:trPr>
+          <w:trHeight w:val="992"/>
+        </w:trPr>
+        <w:tc>
+          <w:tcPr>
+            <w:tcW w:w="0" w:type="auto"/>
+            <w:shd w:val="clear" w:color="auto" w:fill="153D63" w:themeFill="text2" w:themeFillTint="E6"/>
+            <w:vAlign w:val="center"/>
+          </w:tcPr>
+          <w:p>
+            <w:pPr>
+              <w:jc w:val="center"/>
+              <w:rPr>
+                <w:b/>
+                <w:bCs/>
+              </w:rPr>
+            </w:pPr>
+            <w:r>
+              <w:rPr>
+                <w:b/>
+                <w:bCs/>
+              </w:rPr>
+              <w:t>PROCESS</w:t>
+            </w:r>
+          </w:p>
+        </w:tc>
+        <w:tc>
+          <w:tcPr>
+            <w:tcW w:w="0" w:type="auto"/>
+            <w:gridSpan w:val="2"/>
+            <w:vAlign w:val="center"/>
+          </w:tcPr>
+          <w:p>
+            <w:pPr>
+              <w:jc w:val="center"/>
+            </w:pPr>
+            <w:r>
+              <w:t>The system compares the projected grade against the defined at-risk range.</w:t>
+            </w:r>
+          </w:p>
+        </w:tc>
+      </w:tr>
+      <w:tr>
+        <w:trPr>
+          <w:trHeight w:val="347"/>
+        </w:trPr>
+        <w:tc>
+          <w:tcPr>
+            <w:tcW w:w="0" w:type="auto"/>
+            <w:vMerge w:val="restart"/>
+            <w:shd w:val="clear" w:color="auto" w:fill="153D63" w:themeFill="text2" w:themeFillTint="E6"/>
+            <w:vAlign w:val="center"/>
+          </w:tcPr>
+          <w:p>
+            <w:pPr>
+              <w:jc w:val="center"/>
+              <w:rPr>
+                <w:b/>
+                <w:bCs/>
+              </w:rPr>
+            </w:pPr>
+            <w:r>
+              <w:rPr>
+                <w:b/>
+                <w:bCs/>
+              </w:rPr>
+              <w:t>OUTPUTS</w:t>
+            </w:r>
+          </w:p>
+        </w:tc>
+        <w:tc>
+          <w:tcPr>
+            <w:tcW w:w="0" w:type="auto"/>
+            <w:shd w:val="clear" w:color="auto" w:fill="153D63" w:themeFill="text2" w:themeFillTint="E6"/>
+            <w:vAlign w:val="center"/>
+          </w:tcPr>
+          <w:p>
+            <w:pPr>
+              <w:jc w:val="center"/>
+              <w:rPr>
+                <w:b/>
+                <w:bCs/>
+              </w:rPr>
+            </w:pPr>
+            <w:r>
+              <w:rPr>
+                <w:b/>
+                <w:bCs/>
+              </w:rPr>
+              <w:t>NAME</w:t>
+            </w:r>
+          </w:p>
+        </w:tc>
+        <w:tc>
+          <w:tcPr>
+            <w:tcW w:w="0" w:type="auto"/>
+            <w:shd w:val="clear" w:color="auto" w:fill="153D63" w:themeFill="text2" w:themeFillTint="E6"/>
+            <w:vAlign w:val="center"/>
+          </w:tcPr>
+          <w:p>
+            <w:pPr>
+              <w:jc w:val="center"/>
+              <w:rPr>
+                <w:b/>
+                <w:bCs/>
+              </w:rPr>
+            </w:pPr>
+            <w:r>
+              <w:rPr>
+                <w:b/>
+                <w:bCs/>
+              </w:rPr>
+              <w:t>TYPE</w:t>
+            </w:r>
+          </w:p>
+        </w:tc>
+      </w:tr>
+      <w:tr>
+        <w:trPr>
+          <w:trHeight w:val="525"/>
+        </w:trPr>
+        <w:tc>
+          <w:tcPr>
+            <w:tcW w:w="0" w:type="auto"/>
+            <w:vMerge/>
+            <w:shd w:val="clear" w:color="auto" w:fill="153D63" w:themeFill="text2" w:themeFillTint="E6"/>
+            <w:vAlign w:val="center"/>
+          </w:tcPr>
+          <w:p>
+            <w:pPr>
+              <w:jc w:val="center"/>
+              <w:rPr>
+                <w:b/>
+                <w:bCs/>
+              </w:rPr>
+            </w:pPr>
+          </w:p>
+        </w:tc>
+        <w:tc>
+          <w:tcPr>
+            <w:tcW w:w="0" w:type="auto"/>
+            <w:vAlign w:val="center"/>
+          </w:tcPr>
+          <w:p>
+            <w:pPr>
+              <w:jc w:val="center"/>
+            </w:pPr>
+            <w:r>
+              <w:t>At Risk Status</w:t>
+            </w:r>
+          </w:p>
+        </w:tc>
+        <w:tc>
+          <w:tcPr>
+            <w:tcW w:w="0" w:type="auto"/>
+            <w:vAlign w:val="center"/>
+          </w:tcPr>
+          <w:p>
+            <w:pPr>
+              <w:jc w:val="center"/>
+            </w:pPr>
+            <w:r>
+              <w:t>Boolean</w:t>
+            </w:r>
+          </w:p>
+        </w:tc>
+      </w:tr>
+      <w:tr>
+        <w:trPr>
+          <w:trHeight w:val="808"/>
+        </w:trPr>
+        <w:tc>
+          <w:tcPr>
+            <w:tcW w:w="0" w:type="auto"/>
+            <w:shd w:val="clear" w:color="auto" w:fill="153D63" w:themeFill="text2" w:themeFillTint="E6"/>
+            <w:vAlign w:val="center"/>
+          </w:tcPr>
+          <w:p>
+            <w:pPr>
+              <w:jc w:val="center"/>
+              <w:rPr>
+                <w:b/>
+                <w:bCs/>
+              </w:rPr>
+            </w:pPr>
+            <w:r>
+              <w:rPr>
+                <w:b/>
+                <w:bCs/>
+              </w:rPr>
+              <w:t>POSTCONDITIONS</w:t>
+            </w:r>
+          </w:p>
+        </w:tc>
+        <w:tc>
+          <w:tcPr>
+            <w:tcW w:w="0" w:type="auto"/>
+            <w:gridSpan w:val="2"/>
+            <w:vAlign w:val="center"/>
+          </w:tcPr>
+          <w:p>
+            <w:pPr>
+              <w:jc w:val="center"/>
+            </w:pPr>
+            <w:r>
+              <w:t>The subject is identified as at risk or not at risk.</w:t>
+            </w:r>
+          </w:p>
+        </w:tc>
+      </w:tr>
+      <w:tr>
+        <w:trPr>
+          <w:trHeight w:val="1054"/>
+        </w:trPr>
+        <w:tc>
+          <w:tcPr>
+            <w:tcW w:w="0" w:type="auto"/>
+            <w:shd w:val="clear" w:color="auto" w:fill="153D63" w:themeFill="text2" w:themeFillTint="E6"/>
+            <w:vAlign w:val="center"/>
+          </w:tcPr>
+          <w:p>
+            <w:pPr>
+              <w:jc w:val="center"/>
+              <w:rPr>
+                <w:b/>
+                <w:bCs/>
+              </w:rPr>
+            </w:pPr>
+            <w:r>
+              <w:rPr>
+                <w:b/>
+                <w:bCs/>
+              </w:rPr>
+              <w:t>VALIDATIONS</w:t>
+            </w:r>
+          </w:p>
+        </w:tc>
+        <w:tc>
+          <w:tcPr>
+            <w:tcW w:w="0" w:type="auto"/>
+            <w:gridSpan w:val="2"/>
+            <w:vAlign w:val="center"/>
+          </w:tcPr>
+          <w:p>
+            <w:pPr>
+              <w:jc w:val="center"/>
+            </w:pPr>
+            <w:r>
+              <w:t>The projected grade and minimum passing grade must be valid.</w:t>
+            </w:r>
+          </w:p>
+        </w:tc>
+      </w:tr>
+      <w:tr>
+        <w:trPr>
+          <w:trHeight w:val="1261"/>
+        </w:trPr>
+        <w:tc>
+          <w:tcPr>
+            <w:tcW w:w="0" w:type="auto"/>
+            <w:shd w:val="clear" w:color="auto" w:fill="153D63" w:themeFill="text2" w:themeFillTint="E6"/>
+            <w:vAlign w:val="center"/>
+          </w:tcPr>
+          <w:p>
+            <w:pPr>
+              <w:jc w:val="center"/>
+              <w:rPr>
+                <w:b/>
+                <w:bCs/>
+              </w:rPr>
+            </w:pPr>
+            <w:r>
+              <w:rPr>
+                <w:b/>
+                <w:bCs/>
+              </w:rPr>
+              <w:t>EXCEPTIONS</w:t>
+            </w:r>
+          </w:p>
+        </w:tc>
+        <w:tc>
+          <w:tcPr>
+            <w:tcW w:w="0" w:type="auto"/>
+            <w:gridSpan w:val="2"/>
+            <w:vAlign w:val="center"/>
+          </w:tcPr>
+          <w:p>
+            <w:pPr>
+              <w:jc w:val="center"/>
+            </w:pPr>
+            <w:r>
+              <w:t>Subjects without sufficient information for a projection shall not receive an at-risk classification.</w:t>
+            </w:r>
+          </w:p>
+        </w:tc>
+      </w:tr>
+    </w:tbl>
+    <w:p/>
+    <w:tbl>
+      <w:tblPr>
+        <w:tblStyle w:val="Tablaconcuadrcula"/>
+        <w:tblW w:w="0" w:type="auto"/>
+        <w:tblLook w:val="04A0" w:firstRow="1" w:lastRow="0" w:firstColumn="1" w:lastColumn="0" w:noHBand="0" w:noVBand="1"/>
+      </w:tblPr>
+      <w:tblGrid>
+        <w:gridCol w:w="2390"/>
+        <w:gridCol w:w="4925"/>
+        <w:gridCol w:w="2035"/>
+      </w:tblGrid>
+      <w:tr>
+        <w:trPr>
+          <w:trHeight w:val="508"/>
+        </w:trPr>
+        <w:tc>
+          <w:tcPr>
+            <w:tcW w:w="0" w:type="auto"/>
+            <w:shd w:val="clear" w:color="auto" w:fill="153D63" w:themeFill="text2" w:themeFillTint="E6"/>
+            <w:vAlign w:val="center"/>
+          </w:tcPr>
+          <w:p>
+            <w:pPr>
+              <w:jc w:val="center"/>
+              <w:rPr>
+                <w:b/>
+                <w:bCs/>
+              </w:rPr>
+            </w:pPr>
+            <w:r>
+              <w:rPr>
+                <w:b/>
+                <w:bCs/>
+              </w:rPr>
+              <w:t>ID</w:t>
+            </w:r>
+            <w:r>
+              <w:rPr>
+                <w:b/>
+                <w:bCs/>
+              </w:rPr>
+              <w:t xml:space="preserve"> &amp; NAME</w:t>
+            </w:r>
+          </w:p>
+        </w:tc>
+        <w:tc>
+          <w:tcPr>
+            <w:tcW w:w="0" w:type="auto"/>
+            <w:gridSpan w:val="2"/>
+            <w:vAlign w:val="center"/>
+          </w:tcPr>
+          <w:p>
+            <w:pPr>
+              <w:jc w:val="center"/>
+            </w:pPr>
+            <w:r>
+              <w:t>FR</w:t>
+            </w:r>
+            <w:r>
+              <w:t>-RSK</w:t>
+            </w:r>
+            <w:r>
+              <w:t>-</w:t>
+            </w:r>
+            <w:r>
+              <w:t>0</w:t>
+            </w:r>
+            <w:r>
+              <w:t>2</w:t>
+            </w:r>
+            <w:r>
+              <w:t xml:space="preserve"> </w:t>
+            </w:r>
+            <w:r>
+              <w:t xml:space="preserve">– </w:t>
+            </w:r>
+            <w:r>
+              <w:t>Track Goal Progress</w:t>
+            </w:r>
+          </w:p>
+        </w:tc>
+      </w:tr>
+      <w:tr>
+        <w:trPr>
+          <w:trHeight w:val="824"/>
+        </w:trPr>
+        <w:tc>
+          <w:tcPr>
+            <w:tcW w:w="0" w:type="auto"/>
+            <w:shd w:val="clear" w:color="auto" w:fill="153D63" w:themeFill="text2" w:themeFillTint="E6"/>
+            <w:vAlign w:val="center"/>
+          </w:tcPr>
+          <w:p>
+            <w:pPr>
+              <w:jc w:val="center"/>
+              <w:rPr>
+                <w:b/>
+                <w:bCs/>
+              </w:rPr>
+            </w:pPr>
+            <w:r>
+              <w:rPr>
+                <w:b/>
+                <w:bCs/>
+              </w:rPr>
+              <w:t>DESCRIPTION</w:t>
+            </w:r>
+          </w:p>
+        </w:tc>
+        <w:tc>
+          <w:tcPr>
+            <w:tcW w:w="0" w:type="auto"/>
+            <w:gridSpan w:val="2"/>
+            <w:vAlign w:val="center"/>
+          </w:tcPr>
+          <w:p>
+            <w:pPr>
+              <w:jc w:val="center"/>
+            </w:pPr>
+            <w:r>
+              <w:t>The system shall calculate and display the user's progress toward active subject and academic-period goals.</w:t>
+            </w:r>
+          </w:p>
+        </w:tc>
+      </w:tr>
+      <w:tr>
+        <w:trPr>
+          <w:trHeight w:val="565"/>
+        </w:trPr>
+        <w:tc>
+          <w:tcPr>
+            <w:tcW w:w="0" w:type="auto"/>
+            <w:shd w:val="clear" w:color="auto" w:fill="153D63" w:themeFill="text2" w:themeFillTint="E6"/>
+            <w:vAlign w:val="center"/>
+          </w:tcPr>
+          <w:p>
+            <w:pPr>
+              <w:jc w:val="center"/>
+              <w:rPr>
+                <w:b/>
+                <w:bCs/>
+              </w:rPr>
+            </w:pPr>
+            <w:r>
+              <w:rPr>
+                <w:b/>
+                <w:bCs/>
+              </w:rPr>
+              <w:t>ACTORS</w:t>
+            </w:r>
+          </w:p>
+        </w:tc>
+        <w:tc>
+          <w:tcPr>
+            <w:tcW w:w="0" w:type="auto"/>
+            <w:gridSpan w:val="2"/>
+            <w:vAlign w:val="center"/>
+          </w:tcPr>
+          <w:p>
+            <w:pPr>
+              <w:jc w:val="center"/>
+            </w:pPr>
+            <w:r>
+              <w:t>System</w:t>
+            </w:r>
+          </w:p>
+        </w:tc>
+      </w:tr>
+      <w:tr>
+        <w:trPr>
+          <w:trHeight w:val="724"/>
+        </w:trPr>
+        <w:tc>
+          <w:tcPr>
+            <w:tcW w:w="0" w:type="auto"/>
+            <w:shd w:val="clear" w:color="auto" w:fill="153D63" w:themeFill="text2" w:themeFillTint="E6"/>
+            <w:vAlign w:val="center"/>
+          </w:tcPr>
+          <w:p>
+            <w:pPr>
+              <w:jc w:val="center"/>
+              <w:rPr>
+                <w:b/>
+                <w:bCs/>
+              </w:rPr>
+            </w:pPr>
+            <w:r>
+              <w:rPr>
+                <w:b/>
+                <w:bCs/>
+              </w:rPr>
+              <w:t>PRECONDITIONS</w:t>
+            </w:r>
+          </w:p>
+        </w:tc>
+        <w:tc>
+          <w:tcPr>
+            <w:tcW w:w="0" w:type="auto"/>
+            <w:gridSpan w:val="2"/>
+            <w:vAlign w:val="center"/>
+          </w:tcPr>
+          <w:p>
+            <w:pPr>
+              <w:pStyle w:val="Prrafodelista"/>
+              <w:ind w:left="0"/>
+              <w:jc w:val="center"/>
+            </w:pPr>
+            <w:r>
+              <w:t>An active goal and sufficient academic performance data exist.</w:t>
+            </w:r>
+          </w:p>
+        </w:tc>
+      </w:tr>
+      <w:tr>
+        <w:trPr>
+          <w:trHeight w:val="363"/>
+        </w:trPr>
+        <w:tc>
+          <w:tcPr>
+            <w:tcW w:w="0" w:type="auto"/>
+            <w:vMerge w:val="restart"/>
+            <w:shd w:val="clear" w:color="auto" w:fill="153D63" w:themeFill="text2" w:themeFillTint="E6"/>
+            <w:vAlign w:val="center"/>
+          </w:tcPr>
+          <w:p>
+            <w:pPr>
+              <w:jc w:val="center"/>
+              <w:rPr>
+                <w:b/>
+                <w:bCs/>
+              </w:rPr>
+            </w:pPr>
+            <w:r>
+              <w:rPr>
+                <w:b/>
+                <w:bCs/>
+              </w:rPr>
+              <w:t>INPUTS</w:t>
+            </w:r>
+          </w:p>
+        </w:tc>
+        <w:tc>
+          <w:tcPr>
+            <w:tcW w:w="0" w:type="auto"/>
+            <w:shd w:val="clear" w:color="auto" w:fill="153D63" w:themeFill="text2" w:themeFillTint="E6"/>
+            <w:vAlign w:val="center"/>
+          </w:tcPr>
+          <w:p>
+            <w:pPr>
+              <w:jc w:val="center"/>
+              <w:rPr>
+                <w:b/>
+                <w:bCs/>
+              </w:rPr>
+            </w:pPr>
+            <w:r>
+              <w:rPr>
+                <w:b/>
+                <w:bCs/>
+              </w:rPr>
+              <w:t>NAME</w:t>
+            </w:r>
+          </w:p>
+        </w:tc>
+        <w:tc>
+          <w:tcPr>
+            <w:tcW w:w="0" w:type="auto"/>
+            <w:shd w:val="clear" w:color="auto" w:fill="153D63" w:themeFill="text2" w:themeFillTint="E6"/>
+            <w:vAlign w:val="center"/>
+          </w:tcPr>
+          <w:p>
+            <w:pPr>
+              <w:jc w:val="center"/>
+              <w:rPr>
+                <w:b/>
+                <w:bCs/>
+              </w:rPr>
+            </w:pPr>
+            <w:r>
+              <w:rPr>
+                <w:b/>
+                <w:bCs/>
+              </w:rPr>
+              <w:t>TYPE</w:t>
+            </w:r>
+          </w:p>
+        </w:tc>
+      </w:tr>
+      <w:tr>
+        <w:trPr>
+          <w:trHeight w:val="517"/>
+        </w:trPr>
+        <w:tc>
+          <w:tcPr>
+            <w:tcW w:w="0" w:type="auto"/>
+            <w:vMerge/>
+            <w:shd w:val="clear" w:color="auto" w:fill="153D63" w:themeFill="text2" w:themeFillTint="E6"/>
+            <w:vAlign w:val="center"/>
+          </w:tcPr>
+          <w:p>
+            <w:pPr>
+              <w:jc w:val="center"/>
+              <w:rPr>
+                <w:b/>
+                <w:bCs/>
+              </w:rPr>
+            </w:pPr>
+          </w:p>
+        </w:tc>
+        <w:tc>
+          <w:tcPr>
+            <w:tcW w:w="0" w:type="auto"/>
+            <w:vAlign w:val="center"/>
+          </w:tcPr>
+          <w:p>
+            <w:pPr>
+              <w:jc w:val="center"/>
+            </w:pPr>
+            <w:r>
+              <w:t>Goal Target</w:t>
+            </w:r>
+          </w:p>
+        </w:tc>
+        <w:tc>
+          <w:tcPr>
+            <w:tcW w:w="0" w:type="auto"/>
+            <w:vAlign w:val="center"/>
+          </w:tcPr>
+          <w:p>
+            <w:pPr>
+              <w:jc w:val="center"/>
+            </w:pPr>
+            <w:r>
+              <w:t>Double</w:t>
+            </w:r>
+          </w:p>
+        </w:tc>
+      </w:tr>
+      <w:tr>
+        <w:trPr>
+          <w:trHeight w:val="517"/>
+        </w:trPr>
+        <w:tc>
+          <w:tcPr>
+            <w:tcW w:w="0" w:type="auto"/>
+            <w:vMerge/>
+            <w:shd w:val="clear" w:color="auto" w:fill="153D63" w:themeFill="text2" w:themeFillTint="E6"/>
+            <w:vAlign w:val="center"/>
+          </w:tcPr>
+          <w:p>
+            <w:pPr>
+              <w:jc w:val="center"/>
+              <w:rPr>
+                <w:b/>
+                <w:bCs/>
+              </w:rPr>
+            </w:pPr>
+          </w:p>
+        </w:tc>
+        <w:tc>
+          <w:tcPr>
+            <w:tcW w:w="0" w:type="auto"/>
+            <w:vAlign w:val="center"/>
+          </w:tcPr>
+          <w:p>
+            <w:pPr>
+              <w:jc w:val="center"/>
+            </w:pPr>
+            <w:r>
+              <w:t>Current Grade</w:t>
+            </w:r>
+          </w:p>
+        </w:tc>
+        <w:tc>
+          <w:tcPr>
+            <w:tcW w:w="0" w:type="auto"/>
+            <w:vAlign w:val="center"/>
+          </w:tcPr>
+          <w:p>
+            <w:pPr>
+              <w:jc w:val="center"/>
+            </w:pPr>
+            <w:r>
+              <w:t>Double</w:t>
+            </w:r>
+          </w:p>
+        </w:tc>
+      </w:tr>
+      <w:tr>
+        <w:trPr>
+          <w:trHeight w:val="517"/>
+        </w:trPr>
+        <w:tc>
+          <w:tcPr>
+            <w:tcW w:w="0" w:type="auto"/>
+            <w:vMerge/>
+            <w:shd w:val="clear" w:color="auto" w:fill="153D63" w:themeFill="text2" w:themeFillTint="E6"/>
+            <w:vAlign w:val="center"/>
+          </w:tcPr>
+          <w:p>
+            <w:pPr>
+              <w:jc w:val="center"/>
+              <w:rPr>
+                <w:b/>
+                <w:bCs/>
+              </w:rPr>
+            </w:pPr>
+          </w:p>
+        </w:tc>
+        <w:tc>
+          <w:tcPr>
+            <w:tcW w:w="0" w:type="auto"/>
+            <w:vAlign w:val="center"/>
+          </w:tcPr>
+          <w:p>
+            <w:pPr>
+              <w:jc w:val="center"/>
+            </w:pPr>
+            <w:r>
+              <w:t>Projected Final Grade</w:t>
+            </w:r>
+          </w:p>
+        </w:tc>
+        <w:tc>
+          <w:tcPr>
+            <w:tcW w:w="0" w:type="auto"/>
+            <w:vAlign w:val="center"/>
+          </w:tcPr>
+          <w:p>
+            <w:pPr>
+              <w:jc w:val="center"/>
+            </w:pPr>
+            <w:r>
+              <w:t>Double</w:t>
+            </w:r>
+          </w:p>
+        </w:tc>
+      </w:tr>
+      <w:tr>
+        <w:trPr>
+          <w:trHeight w:val="992"/>
+        </w:trPr>
+        <w:tc>
+          <w:tcPr>
+            <w:tcW w:w="0" w:type="auto"/>
+            <w:shd w:val="clear" w:color="auto" w:fill="153D63" w:themeFill="text2" w:themeFillTint="E6"/>
+            <w:vAlign w:val="center"/>
+          </w:tcPr>
+          <w:p>
+            <w:pPr>
+              <w:jc w:val="center"/>
+              <w:rPr>
+                <w:b/>
+                <w:bCs/>
+              </w:rPr>
+            </w:pPr>
+            <w:r>
+              <w:rPr>
+                <w:b/>
+                <w:bCs/>
+              </w:rPr>
+              <w:t>PROCESS</w:t>
+            </w:r>
+          </w:p>
+        </w:tc>
+        <w:tc>
+          <w:tcPr>
+            <w:tcW w:w="0" w:type="auto"/>
+            <w:gridSpan w:val="2"/>
+            <w:vAlign w:val="center"/>
+          </w:tcPr>
+          <w:p>
+            <w:pPr>
+              <w:jc w:val="center"/>
+            </w:pPr>
+            <w:r>
+              <w:t>The system compares the relevant academic result with the goal target.</w:t>
+            </w:r>
+          </w:p>
+        </w:tc>
+      </w:tr>
+      <w:tr>
+        <w:trPr>
+          <w:trHeight w:val="347"/>
+        </w:trPr>
+        <w:tc>
+          <w:tcPr>
+            <w:tcW w:w="0" w:type="auto"/>
+            <w:vMerge w:val="restart"/>
+            <w:shd w:val="clear" w:color="auto" w:fill="153D63" w:themeFill="text2" w:themeFillTint="E6"/>
+            <w:vAlign w:val="center"/>
+          </w:tcPr>
+          <w:p>
+            <w:pPr>
+              <w:jc w:val="center"/>
+              <w:rPr>
+                <w:b/>
+                <w:bCs/>
+              </w:rPr>
+            </w:pPr>
+            <w:r>
+              <w:rPr>
+                <w:b/>
+                <w:bCs/>
+              </w:rPr>
+              <w:t>OUTPUTS</w:t>
+            </w:r>
+          </w:p>
+        </w:tc>
+        <w:tc>
+          <w:tcPr>
+            <w:tcW w:w="0" w:type="auto"/>
+            <w:shd w:val="clear" w:color="auto" w:fill="153D63" w:themeFill="text2" w:themeFillTint="E6"/>
+            <w:vAlign w:val="center"/>
+          </w:tcPr>
+          <w:p>
+            <w:pPr>
+              <w:jc w:val="center"/>
+              <w:rPr>
+                <w:b/>
+                <w:bCs/>
+              </w:rPr>
+            </w:pPr>
+            <w:r>
+              <w:rPr>
+                <w:b/>
+                <w:bCs/>
+              </w:rPr>
+              <w:t>NAME</w:t>
+            </w:r>
+          </w:p>
+        </w:tc>
+        <w:tc>
+          <w:tcPr>
+            <w:tcW w:w="0" w:type="auto"/>
+            <w:shd w:val="clear" w:color="auto" w:fill="153D63" w:themeFill="text2" w:themeFillTint="E6"/>
+            <w:vAlign w:val="center"/>
+          </w:tcPr>
+          <w:p>
+            <w:pPr>
+              <w:jc w:val="center"/>
+              <w:rPr>
+                <w:b/>
+                <w:bCs/>
+              </w:rPr>
+            </w:pPr>
+            <w:r>
+              <w:rPr>
+                <w:b/>
+                <w:bCs/>
+              </w:rPr>
+              <w:t>TYPE</w:t>
+            </w:r>
+          </w:p>
+        </w:tc>
+      </w:tr>
+      <w:tr>
+        <w:trPr>
+          <w:trHeight w:val="525"/>
+        </w:trPr>
+        <w:tc>
+          <w:tcPr>
+            <w:tcW w:w="0" w:type="auto"/>
+            <w:vMerge/>
+            <w:shd w:val="clear" w:color="auto" w:fill="153D63" w:themeFill="text2" w:themeFillTint="E6"/>
+            <w:vAlign w:val="center"/>
+          </w:tcPr>
+          <w:p>
+            <w:pPr>
+              <w:jc w:val="center"/>
+              <w:rPr>
+                <w:b/>
+                <w:bCs/>
+              </w:rPr>
+            </w:pPr>
+          </w:p>
+        </w:tc>
+        <w:tc>
+          <w:tcPr>
+            <w:tcW w:w="0" w:type="auto"/>
+            <w:vAlign w:val="center"/>
+          </w:tcPr>
+          <w:p>
+            <w:pPr>
+              <w:jc w:val="center"/>
+            </w:pPr>
+            <w:r>
+              <w:t>Goal Progress Indicator</w:t>
+            </w:r>
+          </w:p>
+        </w:tc>
+        <w:tc>
+          <w:tcPr>
+            <w:tcW w:w="0" w:type="auto"/>
+            <w:vAlign w:val="center"/>
+          </w:tcPr>
+          <w:p>
+            <w:pPr>
+              <w:jc w:val="center"/>
+            </w:pPr>
+            <w:r>
+              <w:t>Double</w:t>
+            </w:r>
+          </w:p>
+        </w:tc>
+      </w:tr>
+      <w:tr>
+        <w:trPr>
+          <w:trHeight w:val="808"/>
+        </w:trPr>
+        <w:tc>
+          <w:tcPr>
+            <w:tcW w:w="0" w:type="auto"/>
+            <w:shd w:val="clear" w:color="auto" w:fill="153D63" w:themeFill="text2" w:themeFillTint="E6"/>
+            <w:vAlign w:val="center"/>
+          </w:tcPr>
+          <w:p>
+            <w:pPr>
+              <w:jc w:val="center"/>
+              <w:rPr>
+                <w:b/>
+                <w:bCs/>
+              </w:rPr>
+            </w:pPr>
+            <w:r>
+              <w:rPr>
+                <w:b/>
+                <w:bCs/>
+              </w:rPr>
+              <w:t>POSTCONDITIONS</w:t>
+            </w:r>
+          </w:p>
+        </w:tc>
+        <w:tc>
+          <w:tcPr>
+            <w:tcW w:w="0" w:type="auto"/>
+            <w:gridSpan w:val="2"/>
+            <w:vAlign w:val="center"/>
+          </w:tcPr>
+          <w:p>
+            <w:pPr>
+              <w:jc w:val="center"/>
+            </w:pPr>
+            <w:r>
+              <w:t xml:space="preserve">The user's progress toward the goal is available and updated when relevant academic data changes. </w:t>
+            </w:r>
+          </w:p>
+        </w:tc>
+      </w:tr>
+      <w:tr>
+        <w:trPr>
+          <w:trHeight w:val="1054"/>
+        </w:trPr>
+        <w:tc>
+          <w:tcPr>
+            <w:tcW w:w="0" w:type="auto"/>
+            <w:shd w:val="clear" w:color="auto" w:fill="153D63" w:themeFill="text2" w:themeFillTint="E6"/>
+            <w:vAlign w:val="center"/>
+          </w:tcPr>
+          <w:p>
+            <w:pPr>
+              <w:jc w:val="center"/>
+              <w:rPr>
+                <w:b/>
+                <w:bCs/>
+              </w:rPr>
+            </w:pPr>
+            <w:r>
+              <w:rPr>
+                <w:b/>
+                <w:bCs/>
+              </w:rPr>
+              <w:t>VALIDATIONS</w:t>
+            </w:r>
+          </w:p>
+        </w:tc>
+        <w:tc>
+          <w:tcPr>
+            <w:tcW w:w="0" w:type="auto"/>
+            <w:gridSpan w:val="2"/>
+            <w:vAlign w:val="center"/>
+          </w:tcPr>
+          <w:p>
+            <w:pPr>
+              <w:jc w:val="center"/>
+            </w:pPr>
+            <w:r>
+              <w:t>The goal and relevant grade must be valid.</w:t>
+            </w:r>
+          </w:p>
+        </w:tc>
+      </w:tr>
+      <w:tr>
+        <w:trPr>
+          <w:trHeight w:val="1261"/>
+        </w:trPr>
+        <w:tc>
+          <w:tcPr>
+            <w:tcW w:w="0" w:type="auto"/>
+            <w:shd w:val="clear" w:color="auto" w:fill="153D63" w:themeFill="text2" w:themeFillTint="E6"/>
+            <w:vAlign w:val="center"/>
+          </w:tcPr>
+          <w:p>
+            <w:pPr>
+              <w:jc w:val="center"/>
+              <w:rPr>
+                <w:b/>
+                <w:bCs/>
+              </w:rPr>
+            </w:pPr>
+            <w:r>
+              <w:rPr>
+                <w:b/>
+                <w:bCs/>
+              </w:rPr>
+              <w:t>EXCEPTIONS</w:t>
+            </w:r>
+          </w:p>
+        </w:tc>
+        <w:tc>
+          <w:tcPr>
+            <w:tcW w:w="0" w:type="auto"/>
+            <w:gridSpan w:val="2"/>
+            <w:vAlign w:val="center"/>
+          </w:tcPr>
+          <w:p>
+            <w:pPr>
+              <w:jc w:val="center"/>
+            </w:pPr>
+            <w:r>
+              <w:t>Progress shall not be calculated when insufficient information exists.</w:t>
+            </w:r>
+          </w:p>
+        </w:tc>
+      </w:tr>
+    </w:tbl>
+    <w:p/>
+    <w:p>
+      <w:r>
+        <w:br w:type="page"/>
+      </w:r>
+    </w:p>
+    <w:p>
+      <w:pPr>
+        <w:pStyle w:val="Ttulo3"/>
+      </w:pPr>
+      <w:proofErr w:type="spellStart"/>
+      <w:r>
+        <w:t>Report</w:t>
+      </w:r>
+      <w:proofErr w:type="spellEnd"/>
+      <w:r>
+        <w:t xml:space="preserve"> (RPT) Requirements</w:t>
+      </w:r>
+    </w:p>
+    <w:tbl>
+      <w:tblPr>
+        <w:tblStyle w:val="Tablaconcuadrcula"/>
+        <w:tblW w:w="0" w:type="auto"/>
+        <w:tblLook w:val="04A0" w:firstRow="1" w:lastRow="0" w:firstColumn="1" w:lastColumn="0" w:noHBand="0" w:noVBand="1"/>
+      </w:tblPr>
+      <w:tblGrid>
+        <w:gridCol w:w="2390"/>
+        <w:gridCol w:w="4808"/>
+        <w:gridCol w:w="2152"/>
+      </w:tblGrid>
+      <w:tr>
+        <w:trPr>
+          <w:trHeight w:val="508"/>
+        </w:trPr>
+        <w:tc>
+          <w:tcPr>
+            <w:tcW w:w="0" w:type="auto"/>
+            <w:shd w:val="clear" w:color="auto" w:fill="153D63" w:themeFill="text2" w:themeFillTint="E6"/>
+            <w:vAlign w:val="center"/>
+          </w:tcPr>
+          <w:p>
+            <w:pPr>
+              <w:jc w:val="center"/>
+              <w:rPr>
+                <w:b/>
+                <w:bCs/>
+              </w:rPr>
+            </w:pPr>
+            <w:r>
+              <w:rPr>
+                <w:b/>
+                <w:bCs/>
+              </w:rPr>
+              <w:t>ID</w:t>
+            </w:r>
+            <w:r>
+              <w:rPr>
+                <w:b/>
+                <w:bCs/>
+              </w:rPr>
+              <w:t xml:space="preserve"> &amp; NAME</w:t>
+            </w:r>
+          </w:p>
+        </w:tc>
+        <w:tc>
+          <w:tcPr>
+            <w:tcW w:w="0" w:type="auto"/>
+            <w:gridSpan w:val="2"/>
+            <w:vAlign w:val="center"/>
+          </w:tcPr>
+          <w:p>
+            <w:pPr>
+              <w:jc w:val="center"/>
+            </w:pPr>
+            <w:r>
+              <w:t>FR</w:t>
+            </w:r>
+            <w:r>
+              <w:t>-RPT</w:t>
+            </w:r>
+            <w:r>
+              <w:t>-</w:t>
+            </w:r>
+            <w:r>
+              <w:t>0</w:t>
+            </w:r>
+            <w:r>
+              <w:t>1</w:t>
+            </w:r>
+            <w:r>
+              <w:t xml:space="preserve"> </w:t>
+            </w:r>
+            <w:r>
+              <w:t xml:space="preserve">– </w:t>
+            </w:r>
+            <w:r>
+              <w:t>Generate Subject Performance Report</w:t>
+            </w:r>
+          </w:p>
+        </w:tc>
+      </w:tr>
+      <w:tr>
+        <w:trPr>
+          <w:trHeight w:val="824"/>
+        </w:trPr>
+        <w:tc>
+          <w:tcPr>
+            <w:tcW w:w="0" w:type="auto"/>
+            <w:shd w:val="clear" w:color="auto" w:fill="153D63" w:themeFill="text2" w:themeFillTint="E6"/>
+            <w:vAlign w:val="center"/>
+          </w:tcPr>
+          <w:p>
+            <w:pPr>
+              <w:jc w:val="center"/>
+              <w:rPr>
+                <w:b/>
+                <w:bCs/>
+              </w:rPr>
+            </w:pPr>
+            <w:r>
+              <w:rPr>
+                <w:b/>
+                <w:bCs/>
+              </w:rPr>
+              <w:t>DESCRIPTION</w:t>
+            </w:r>
+          </w:p>
+        </w:tc>
+        <w:tc>
+          <w:tcPr>
+            <w:tcW w:w="0" w:type="auto"/>
+            <w:gridSpan w:val="2"/>
+            <w:vAlign w:val="center"/>
+          </w:tcPr>
+          <w:p>
+            <w:pPr>
+              <w:jc w:val="center"/>
+            </w:pPr>
+            <w:r>
+              <w:t>The system shall generate a report containing the relevant academic performance information of a selected subject.</w:t>
+            </w:r>
+          </w:p>
+        </w:tc>
+      </w:tr>
+      <w:tr>
+        <w:trPr>
+          <w:trHeight w:val="565"/>
+        </w:trPr>
+        <w:tc>
+          <w:tcPr>
+            <w:tcW w:w="0" w:type="auto"/>
+            <w:shd w:val="clear" w:color="auto" w:fill="153D63" w:themeFill="text2" w:themeFillTint="E6"/>
+            <w:vAlign w:val="center"/>
+          </w:tcPr>
+          <w:p>
+            <w:pPr>
+              <w:jc w:val="center"/>
+              <w:rPr>
+                <w:b/>
+                <w:bCs/>
+              </w:rPr>
+            </w:pPr>
+            <w:r>
+              <w:rPr>
+                <w:b/>
+                <w:bCs/>
+              </w:rPr>
+              <w:t>ACTORS</w:t>
+            </w:r>
+          </w:p>
+        </w:tc>
+        <w:tc>
+          <w:tcPr>
+            <w:tcW w:w="0" w:type="auto"/>
+            <w:gridSpan w:val="2"/>
+            <w:vAlign w:val="center"/>
+          </w:tcPr>
+          <w:p>
+            <w:pPr>
+              <w:jc w:val="center"/>
+            </w:pPr>
+            <w:r>
+              <w:t xml:space="preserve">User, </w:t>
+            </w:r>
+            <w:r>
+              <w:t>System</w:t>
+            </w:r>
+          </w:p>
+        </w:tc>
+      </w:tr>
+      <w:tr>
+        <w:trPr>
+          <w:trHeight w:val="724"/>
+        </w:trPr>
+        <w:tc>
+          <w:tcPr>
+            <w:tcW w:w="0" w:type="auto"/>
+            <w:shd w:val="clear" w:color="auto" w:fill="153D63" w:themeFill="text2" w:themeFillTint="E6"/>
+            <w:vAlign w:val="center"/>
+          </w:tcPr>
+          <w:p>
+            <w:pPr>
+              <w:jc w:val="center"/>
+              <w:rPr>
+                <w:b/>
+                <w:bCs/>
+              </w:rPr>
+            </w:pPr>
+            <w:r>
+              <w:rPr>
+                <w:b/>
+                <w:bCs/>
+              </w:rPr>
+              <w:t>PRECONDITIONS</w:t>
+            </w:r>
+          </w:p>
+        </w:tc>
+        <w:tc>
+          <w:tcPr>
+            <w:tcW w:w="0" w:type="auto"/>
+            <w:gridSpan w:val="2"/>
+            <w:vAlign w:val="center"/>
+          </w:tcPr>
+          <w:p>
+            <w:pPr>
+              <w:pStyle w:val="Prrafodelista"/>
+              <w:ind w:left="0"/>
+              <w:jc w:val="center"/>
+            </w:pPr>
+            <w:r>
+              <w:t>The subject exists and belongs to the authenticated user.</w:t>
+            </w:r>
+          </w:p>
+        </w:tc>
+      </w:tr>
+      <w:tr>
+        <w:trPr>
+          <w:trHeight w:val="363"/>
+        </w:trPr>
+        <w:tc>
+          <w:tcPr>
+            <w:tcW w:w="0" w:type="auto"/>
+            <w:vMerge w:val="restart"/>
+            <w:shd w:val="clear" w:color="auto" w:fill="153D63" w:themeFill="text2" w:themeFillTint="E6"/>
+            <w:vAlign w:val="center"/>
+          </w:tcPr>
+          <w:p>
+            <w:pPr>
+              <w:jc w:val="center"/>
+              <w:rPr>
+                <w:b/>
+                <w:bCs/>
+              </w:rPr>
+            </w:pPr>
+            <w:r>
+              <w:rPr>
+                <w:b/>
+                <w:bCs/>
+              </w:rPr>
+              <w:t>INPUTS</w:t>
+            </w:r>
+          </w:p>
+        </w:tc>
+        <w:tc>
+          <w:tcPr>
+            <w:tcW w:w="0" w:type="auto"/>
+            <w:shd w:val="clear" w:color="auto" w:fill="153D63" w:themeFill="text2" w:themeFillTint="E6"/>
+            <w:vAlign w:val="center"/>
+          </w:tcPr>
+          <w:p>
+            <w:pPr>
+              <w:jc w:val="center"/>
+              <w:rPr>
+                <w:b/>
+                <w:bCs/>
+              </w:rPr>
+            </w:pPr>
+            <w:r>
+              <w:rPr>
+                <w:b/>
+                <w:bCs/>
+              </w:rPr>
+              <w:t>NAME</w:t>
+            </w:r>
+          </w:p>
+        </w:tc>
+        <w:tc>
+          <w:tcPr>
+            <w:tcW w:w="0" w:type="auto"/>
+            <w:shd w:val="clear" w:color="auto" w:fill="153D63" w:themeFill="text2" w:themeFillTint="E6"/>
+            <w:vAlign w:val="center"/>
+          </w:tcPr>
+          <w:p>
+            <w:pPr>
+              <w:jc w:val="center"/>
+              <w:rPr>
+                <w:b/>
+                <w:bCs/>
+              </w:rPr>
+            </w:pPr>
+            <w:r>
+              <w:rPr>
+                <w:b/>
+                <w:bCs/>
+              </w:rPr>
+              <w:t>TYPE</w:t>
+            </w:r>
+          </w:p>
+        </w:tc>
+      </w:tr>
+      <w:tr>
+        <w:trPr>
+          <w:trHeight w:val="517"/>
+        </w:trPr>
+        <w:tc>
+          <w:tcPr>
+            <w:tcW w:w="0" w:type="auto"/>
+            <w:vMerge/>
+            <w:shd w:val="clear" w:color="auto" w:fill="153D63" w:themeFill="text2" w:themeFillTint="E6"/>
+            <w:vAlign w:val="center"/>
+          </w:tcPr>
+          <w:p>
+            <w:pPr>
+              <w:jc w:val="center"/>
+              <w:rPr>
+                <w:b/>
+                <w:bCs/>
+              </w:rPr>
+            </w:pPr>
+          </w:p>
+        </w:tc>
+        <w:tc>
+          <w:tcPr>
+            <w:tcW w:w="0" w:type="auto"/>
+            <w:vAlign w:val="center"/>
+          </w:tcPr>
+          <w:p>
+            <w:pPr>
+              <w:jc w:val="center"/>
+            </w:pPr>
+            <w:r>
+              <w:t>Subject</w:t>
+            </w:r>
+          </w:p>
+        </w:tc>
+        <w:tc>
+          <w:tcPr>
+            <w:tcW w:w="0" w:type="auto"/>
+            <w:vAlign w:val="center"/>
+          </w:tcPr>
+          <w:p>
+            <w:pPr>
+              <w:jc w:val="center"/>
+            </w:pPr>
+            <w:r>
+              <w:t>Identifier</w:t>
+            </w:r>
+          </w:p>
+        </w:tc>
+      </w:tr>
+      <w:tr>
+        <w:trPr>
+          <w:trHeight w:val="992"/>
+        </w:trPr>
+        <w:tc>
+          <w:tcPr>
+            <w:tcW w:w="0" w:type="auto"/>
+            <w:shd w:val="clear" w:color="auto" w:fill="153D63" w:themeFill="text2" w:themeFillTint="E6"/>
+            <w:vAlign w:val="center"/>
+          </w:tcPr>
+          <w:p>
+            <w:pPr>
+              <w:jc w:val="center"/>
+              <w:rPr>
+                <w:b/>
+                <w:bCs/>
+              </w:rPr>
+            </w:pPr>
+            <w:r>
+              <w:rPr>
+                <w:b/>
+                <w:bCs/>
+              </w:rPr>
+              <w:t>PROCESS</w:t>
+            </w:r>
+          </w:p>
+        </w:tc>
+        <w:tc>
+          <w:tcPr>
+            <w:tcW w:w="0" w:type="auto"/>
+            <w:gridSpan w:val="2"/>
+            <w:vAlign w:val="center"/>
+          </w:tcPr>
+          <w:p>
+            <w:pPr>
+              <w:jc w:val="center"/>
+            </w:pPr>
+            <w:r>
+              <w:t>The system retrieves the subject's assessments, grades, calculations, projections, goals, and risk status and generates a consolidated report.</w:t>
+            </w:r>
+          </w:p>
+        </w:tc>
+      </w:tr>
+      <w:tr>
+        <w:trPr>
+          <w:trHeight w:val="347"/>
+        </w:trPr>
+        <w:tc>
+          <w:tcPr>
+            <w:tcW w:w="0" w:type="auto"/>
+            <w:vMerge w:val="restart"/>
+            <w:shd w:val="clear" w:color="auto" w:fill="153D63" w:themeFill="text2" w:themeFillTint="E6"/>
+            <w:vAlign w:val="center"/>
+          </w:tcPr>
+          <w:p>
+            <w:pPr>
+              <w:jc w:val="center"/>
+              <w:rPr>
+                <w:b/>
+                <w:bCs/>
+              </w:rPr>
+            </w:pPr>
+            <w:r>
+              <w:rPr>
+                <w:b/>
+                <w:bCs/>
+              </w:rPr>
+              <w:t>OUTPUTS</w:t>
+            </w:r>
+          </w:p>
+        </w:tc>
+        <w:tc>
+          <w:tcPr>
+            <w:tcW w:w="0" w:type="auto"/>
+            <w:shd w:val="clear" w:color="auto" w:fill="153D63" w:themeFill="text2" w:themeFillTint="E6"/>
+            <w:vAlign w:val="center"/>
+          </w:tcPr>
+          <w:p>
+            <w:pPr>
+              <w:jc w:val="center"/>
+              <w:rPr>
+                <w:b/>
+                <w:bCs/>
+              </w:rPr>
+            </w:pPr>
+            <w:r>
+              <w:rPr>
+                <w:b/>
+                <w:bCs/>
+              </w:rPr>
+              <w:t>NAME</w:t>
+            </w:r>
+          </w:p>
+        </w:tc>
+        <w:tc>
+          <w:tcPr>
+            <w:tcW w:w="0" w:type="auto"/>
+            <w:shd w:val="clear" w:color="auto" w:fill="153D63" w:themeFill="text2" w:themeFillTint="E6"/>
+            <w:vAlign w:val="center"/>
+          </w:tcPr>
+          <w:p>
+            <w:pPr>
+              <w:jc w:val="center"/>
+              <w:rPr>
+                <w:b/>
+                <w:bCs/>
+              </w:rPr>
+            </w:pPr>
+            <w:r>
+              <w:rPr>
+                <w:b/>
+                <w:bCs/>
+              </w:rPr>
+              <w:t>TYPE</w:t>
+            </w:r>
+          </w:p>
+        </w:tc>
+      </w:tr>
+      <w:tr>
+        <w:trPr>
+          <w:trHeight w:val="525"/>
+        </w:trPr>
+        <w:tc>
+          <w:tcPr>
+            <w:tcW w:w="0" w:type="auto"/>
+            <w:vMerge/>
+            <w:shd w:val="clear" w:color="auto" w:fill="153D63" w:themeFill="text2" w:themeFillTint="E6"/>
+            <w:vAlign w:val="center"/>
+          </w:tcPr>
+          <w:p>
+            <w:pPr>
+              <w:jc w:val="center"/>
+              <w:rPr>
+                <w:b/>
+                <w:bCs/>
+              </w:rPr>
+            </w:pPr>
+          </w:p>
+        </w:tc>
+        <w:tc>
+          <w:tcPr>
+            <w:tcW w:w="0" w:type="auto"/>
+            <w:vAlign w:val="center"/>
+          </w:tcPr>
+          <w:p>
+            <w:pPr>
+              <w:jc w:val="center"/>
+            </w:pPr>
+            <w:r>
+              <w:t>Subject Performance Report</w:t>
+            </w:r>
+          </w:p>
+        </w:tc>
+        <w:tc>
+          <w:tcPr>
+            <w:tcW w:w="0" w:type="auto"/>
+            <w:vAlign w:val="center"/>
+          </w:tcPr>
+          <w:p>
+            <w:pPr>
+              <w:jc w:val="center"/>
+            </w:pPr>
+            <w:r>
+              <w:t>File</w:t>
+            </w:r>
+          </w:p>
+        </w:tc>
+      </w:tr>
+      <w:tr>
+        <w:trPr>
+          <w:trHeight w:val="808"/>
+        </w:trPr>
+        <w:tc>
+          <w:tcPr>
+            <w:tcW w:w="0" w:type="auto"/>
+            <w:shd w:val="clear" w:color="auto" w:fill="153D63" w:themeFill="text2" w:themeFillTint="E6"/>
+            <w:vAlign w:val="center"/>
+          </w:tcPr>
+          <w:p>
+            <w:pPr>
+              <w:jc w:val="center"/>
+              <w:rPr>
+                <w:b/>
+                <w:bCs/>
+              </w:rPr>
+            </w:pPr>
+            <w:r>
+              <w:rPr>
+                <w:b/>
+                <w:bCs/>
+              </w:rPr>
+              <w:t>POSTCONDITIONS</w:t>
+            </w:r>
+          </w:p>
+        </w:tc>
+        <w:tc>
+          <w:tcPr>
+            <w:tcW w:w="0" w:type="auto"/>
+            <w:gridSpan w:val="2"/>
+            <w:vAlign w:val="center"/>
+          </w:tcPr>
+          <w:p>
+            <w:pPr>
+              <w:jc w:val="center"/>
+            </w:pPr>
+            <w:r>
+              <w:t>The report is presented to the user.</w:t>
+            </w:r>
+          </w:p>
+        </w:tc>
+      </w:tr>
+      <w:tr>
+        <w:trPr>
+          <w:trHeight w:val="1054"/>
+        </w:trPr>
+        <w:tc>
+          <w:tcPr>
+            <w:tcW w:w="0" w:type="auto"/>
+            <w:shd w:val="clear" w:color="auto" w:fill="153D63" w:themeFill="text2" w:themeFillTint="E6"/>
+            <w:vAlign w:val="center"/>
+          </w:tcPr>
+          <w:p>
+            <w:pPr>
+              <w:jc w:val="center"/>
+              <w:rPr>
+                <w:b/>
+                <w:bCs/>
+              </w:rPr>
+            </w:pPr>
+            <w:r>
+              <w:rPr>
+                <w:b/>
+                <w:bCs/>
+              </w:rPr>
+              <w:t>VALIDATIONS</w:t>
+            </w:r>
+          </w:p>
+        </w:tc>
+        <w:tc>
+          <w:tcPr>
+            <w:tcW w:w="0" w:type="auto"/>
+            <w:gridSpan w:val="2"/>
+            <w:vAlign w:val="center"/>
+          </w:tcPr>
+          <w:p>
+            <w:pPr>
+              <w:jc w:val="center"/>
+            </w:pPr>
+            <w:r>
+              <w:t>The selected subject must be accessible to the user.</w:t>
+            </w:r>
+          </w:p>
+        </w:tc>
+      </w:tr>
+      <w:tr>
+        <w:trPr>
+          <w:trHeight w:val="1261"/>
+        </w:trPr>
+        <w:tc>
+          <w:tcPr>
+            <w:tcW w:w="0" w:type="auto"/>
+            <w:shd w:val="clear" w:color="auto" w:fill="153D63" w:themeFill="text2" w:themeFillTint="E6"/>
+            <w:vAlign w:val="center"/>
+          </w:tcPr>
+          <w:p>
+            <w:pPr>
+              <w:jc w:val="center"/>
+              <w:rPr>
+                <w:b/>
+                <w:bCs/>
+              </w:rPr>
+            </w:pPr>
+            <w:r>
+              <w:rPr>
+                <w:b/>
+                <w:bCs/>
+              </w:rPr>
+              <w:t>EXCEPTIONS</w:t>
+            </w:r>
+          </w:p>
+        </w:tc>
+        <w:tc>
+          <w:tcPr>
+            <w:tcW w:w="0" w:type="auto"/>
+            <w:gridSpan w:val="2"/>
+            <w:vAlign w:val="center"/>
+          </w:tcPr>
+          <w:p>
+            <w:pPr>
+              <w:jc w:val="center"/>
+            </w:pPr>
+            <w:r>
+              <w:t>The system shall notify the user if the report cannot be generated.</w:t>
+            </w:r>
+          </w:p>
+        </w:tc>
+      </w:tr>
+    </w:tbl>
+    <w:p/>
+    <w:p>
+      <w:r>
+        <w:br w:type="page"/>
+      </w:r>
+    </w:p>
+    <w:tbl>
+      <w:tblPr>
+        <w:tblStyle w:val="Tablaconcuadrcula"/>
+        <w:tblW w:w="0" w:type="auto"/>
+        <w:tblLook w:val="04A0" w:firstRow="1" w:lastRow="0" w:firstColumn="1" w:lastColumn="0" w:noHBand="0" w:noVBand="1"/>
+      </w:tblPr>
+      <w:tblGrid>
+        <w:gridCol w:w="2390"/>
+        <w:gridCol w:w="5051"/>
+        <w:gridCol w:w="1909"/>
+      </w:tblGrid>
+      <w:tr>
+        <w:trPr>
+          <w:trHeight w:val="508"/>
+        </w:trPr>
+        <w:tc>
+          <w:tcPr>
+            <w:tcW w:w="0" w:type="auto"/>
+            <w:shd w:val="clear" w:color="auto" w:fill="153D63" w:themeFill="text2" w:themeFillTint="E6"/>
+            <w:vAlign w:val="center"/>
+          </w:tcPr>
+          <w:p>
+            <w:pPr>
+              <w:jc w:val="center"/>
+              <w:rPr>
+                <w:b/>
+                <w:bCs/>
+              </w:rPr>
+            </w:pPr>
+            <w:r>
+              <w:rPr>
+                <w:b/>
+                <w:bCs/>
+              </w:rPr>
+              <w:t>ID</w:t>
+            </w:r>
+            <w:r>
+              <w:rPr>
+                <w:b/>
+                <w:bCs/>
+              </w:rPr>
+              <w:t xml:space="preserve"> &amp; NAME</w:t>
+            </w:r>
+          </w:p>
+        </w:tc>
+        <w:tc>
+          <w:tcPr>
+            <w:tcW w:w="0" w:type="auto"/>
+            <w:gridSpan w:val="2"/>
+            <w:vAlign w:val="center"/>
+          </w:tcPr>
+          <w:p>
+            <w:pPr>
+              <w:jc w:val="center"/>
+            </w:pPr>
+            <w:r>
+              <w:t>FR</w:t>
+            </w:r>
+            <w:r>
+              <w:t>-RPT</w:t>
+            </w:r>
+            <w:r>
+              <w:t>-</w:t>
+            </w:r>
+            <w:r>
+              <w:t>0</w:t>
+            </w:r>
+            <w:r>
+              <w:t>2</w:t>
+            </w:r>
+            <w:r>
+              <w:t xml:space="preserve"> </w:t>
+            </w:r>
+            <w:r>
+              <w:t xml:space="preserve">– </w:t>
+            </w:r>
+            <w:r>
+              <w:t>Generate Academic Period Repor</w:t>
+            </w:r>
+            <w:r>
+              <w:t>t</w:t>
+            </w:r>
+          </w:p>
+        </w:tc>
+      </w:tr>
+      <w:tr>
+        <w:trPr>
+          <w:trHeight w:val="824"/>
+        </w:trPr>
+        <w:tc>
+          <w:tcPr>
+            <w:tcW w:w="0" w:type="auto"/>
+            <w:shd w:val="clear" w:color="auto" w:fill="153D63" w:themeFill="text2" w:themeFillTint="E6"/>
+            <w:vAlign w:val="center"/>
+          </w:tcPr>
+          <w:p>
+            <w:pPr>
+              <w:jc w:val="center"/>
+              <w:rPr>
+                <w:b/>
+                <w:bCs/>
+              </w:rPr>
+            </w:pPr>
+            <w:r>
+              <w:rPr>
+                <w:b/>
+                <w:bCs/>
+              </w:rPr>
+              <w:t>DESCRIPTION</w:t>
+            </w:r>
+          </w:p>
+        </w:tc>
+        <w:tc>
+          <w:tcPr>
+            <w:tcW w:w="0" w:type="auto"/>
+            <w:gridSpan w:val="2"/>
+            <w:vAlign w:val="center"/>
+          </w:tcPr>
+          <w:p>
+            <w:pPr>
+              <w:jc w:val="center"/>
+            </w:pPr>
+            <w:r>
+              <w:t>The system shall generate a report containing the academic performance information of a selected academic period.</w:t>
+            </w:r>
+          </w:p>
+        </w:tc>
+      </w:tr>
+      <w:tr>
+        <w:trPr>
+          <w:trHeight w:val="565"/>
+        </w:trPr>
+        <w:tc>
+          <w:tcPr>
+            <w:tcW w:w="0" w:type="auto"/>
+            <w:shd w:val="clear" w:color="auto" w:fill="153D63" w:themeFill="text2" w:themeFillTint="E6"/>
+            <w:vAlign w:val="center"/>
+          </w:tcPr>
+          <w:p>
+            <w:pPr>
+              <w:jc w:val="center"/>
+              <w:rPr>
+                <w:b/>
+                <w:bCs/>
+              </w:rPr>
+            </w:pPr>
+            <w:r>
+              <w:rPr>
+                <w:b/>
+                <w:bCs/>
+              </w:rPr>
+              <w:t>ACTORS</w:t>
+            </w:r>
+          </w:p>
+        </w:tc>
+        <w:tc>
+          <w:tcPr>
+            <w:tcW w:w="0" w:type="auto"/>
+            <w:gridSpan w:val="2"/>
+            <w:vAlign w:val="center"/>
+          </w:tcPr>
+          <w:p>
+            <w:pPr>
+              <w:jc w:val="center"/>
+            </w:pPr>
+            <w:r>
+              <w:t>User, System</w:t>
+            </w:r>
+          </w:p>
+        </w:tc>
+      </w:tr>
+      <w:tr>
+        <w:trPr>
+          <w:trHeight w:val="724"/>
+        </w:trPr>
+        <w:tc>
+          <w:tcPr>
+            <w:tcW w:w="0" w:type="auto"/>
+            <w:shd w:val="clear" w:color="auto" w:fill="153D63" w:themeFill="text2" w:themeFillTint="E6"/>
+            <w:vAlign w:val="center"/>
+          </w:tcPr>
+          <w:p>
+            <w:pPr>
+              <w:jc w:val="center"/>
+              <w:rPr>
+                <w:b/>
+                <w:bCs/>
+              </w:rPr>
+            </w:pPr>
+            <w:r>
+              <w:rPr>
+                <w:b/>
+                <w:bCs/>
+              </w:rPr>
+              <w:t>PRECONDITIONS</w:t>
+            </w:r>
+          </w:p>
+        </w:tc>
+        <w:tc>
+          <w:tcPr>
+            <w:tcW w:w="0" w:type="auto"/>
+            <w:gridSpan w:val="2"/>
+            <w:vAlign w:val="center"/>
+          </w:tcPr>
+          <w:p>
+            <w:pPr>
+              <w:pStyle w:val="Prrafodelista"/>
+              <w:ind w:left="0"/>
+              <w:jc w:val="center"/>
+            </w:pPr>
+            <w:r>
+              <w:t>The academic period exists and belongs to the authenticated user.</w:t>
+            </w:r>
+          </w:p>
+        </w:tc>
+      </w:tr>
+      <w:tr>
+        <w:trPr>
+          <w:trHeight w:val="363"/>
+        </w:trPr>
+        <w:tc>
+          <w:tcPr>
+            <w:tcW w:w="0" w:type="auto"/>
+            <w:vMerge w:val="restart"/>
+            <w:shd w:val="clear" w:color="auto" w:fill="153D63" w:themeFill="text2" w:themeFillTint="E6"/>
+            <w:vAlign w:val="center"/>
+          </w:tcPr>
+          <w:p>
+            <w:pPr>
+              <w:jc w:val="center"/>
+              <w:rPr>
+                <w:b/>
+                <w:bCs/>
+              </w:rPr>
+            </w:pPr>
+            <w:r>
+              <w:rPr>
+                <w:b/>
+                <w:bCs/>
+              </w:rPr>
+              <w:t>INPUTS</w:t>
+            </w:r>
+          </w:p>
+        </w:tc>
+        <w:tc>
+          <w:tcPr>
+            <w:tcW w:w="0" w:type="auto"/>
+            <w:shd w:val="clear" w:color="auto" w:fill="153D63" w:themeFill="text2" w:themeFillTint="E6"/>
+            <w:vAlign w:val="center"/>
+          </w:tcPr>
+          <w:p>
+            <w:pPr>
+              <w:jc w:val="center"/>
+              <w:rPr>
+                <w:b/>
+                <w:bCs/>
+              </w:rPr>
+            </w:pPr>
+            <w:r>
+              <w:rPr>
+                <w:b/>
+                <w:bCs/>
+              </w:rPr>
+              <w:t>NAME</w:t>
+            </w:r>
+          </w:p>
+        </w:tc>
+        <w:tc>
+          <w:tcPr>
+            <w:tcW w:w="0" w:type="auto"/>
+            <w:shd w:val="clear" w:color="auto" w:fill="153D63" w:themeFill="text2" w:themeFillTint="E6"/>
+            <w:vAlign w:val="center"/>
+          </w:tcPr>
+          <w:p>
+            <w:pPr>
+              <w:jc w:val="center"/>
+              <w:rPr>
+                <w:b/>
+                <w:bCs/>
+              </w:rPr>
+            </w:pPr>
+            <w:r>
+              <w:rPr>
+                <w:b/>
+                <w:bCs/>
+              </w:rPr>
+              <w:t>TYPE</w:t>
+            </w:r>
+          </w:p>
+        </w:tc>
+      </w:tr>
+      <w:tr>
+        <w:trPr>
+          <w:trHeight w:val="517"/>
+        </w:trPr>
+        <w:tc>
+          <w:tcPr>
+            <w:tcW w:w="0" w:type="auto"/>
+            <w:vMerge/>
+            <w:shd w:val="clear" w:color="auto" w:fill="153D63" w:themeFill="text2" w:themeFillTint="E6"/>
+            <w:vAlign w:val="center"/>
+          </w:tcPr>
+          <w:p>
+            <w:pPr>
+              <w:jc w:val="center"/>
+              <w:rPr>
+                <w:b/>
+                <w:bCs/>
+              </w:rPr>
+            </w:pPr>
+          </w:p>
+        </w:tc>
+        <w:tc>
+          <w:tcPr>
+            <w:tcW w:w="0" w:type="auto"/>
+            <w:vAlign w:val="center"/>
+          </w:tcPr>
+          <w:p>
+            <w:pPr>
+              <w:jc w:val="center"/>
+            </w:pPr>
+            <w:r>
+              <w:t>Academic Period</w:t>
+            </w:r>
+          </w:p>
+        </w:tc>
+        <w:tc>
+          <w:tcPr>
+            <w:tcW w:w="0" w:type="auto"/>
+            <w:vAlign w:val="center"/>
+          </w:tcPr>
+          <w:p>
+            <w:pPr>
+              <w:jc w:val="center"/>
+            </w:pPr>
+            <w:r>
+              <w:t>Identifier</w:t>
+            </w:r>
+          </w:p>
+        </w:tc>
+      </w:tr>
+      <w:tr>
+        <w:trPr>
+          <w:trHeight w:val="992"/>
+        </w:trPr>
+        <w:tc>
+          <w:tcPr>
+            <w:tcW w:w="0" w:type="auto"/>
+            <w:shd w:val="clear" w:color="auto" w:fill="153D63" w:themeFill="text2" w:themeFillTint="E6"/>
+            <w:vAlign w:val="center"/>
+          </w:tcPr>
+          <w:p>
+            <w:pPr>
+              <w:jc w:val="center"/>
+              <w:rPr>
+                <w:b/>
+                <w:bCs/>
+              </w:rPr>
+            </w:pPr>
+            <w:r>
+              <w:rPr>
+                <w:b/>
+                <w:bCs/>
+              </w:rPr>
+              <w:t>PROCESS</w:t>
+            </w:r>
+          </w:p>
+        </w:tc>
+        <w:tc>
+          <w:tcPr>
+            <w:tcW w:w="0" w:type="auto"/>
+            <w:gridSpan w:val="2"/>
+            <w:vAlign w:val="center"/>
+          </w:tcPr>
+          <w:p>
+            <w:pPr>
+              <w:jc w:val="center"/>
+            </w:pPr>
+            <w:r>
+              <w:t>The system retrieves the academic period's subjects, grades, averages, projections, goals, and relevant performance indicators and generates a consolidated report.</w:t>
+            </w:r>
+          </w:p>
+        </w:tc>
+      </w:tr>
+      <w:tr>
+        <w:trPr>
+          <w:trHeight w:val="347"/>
+        </w:trPr>
+        <w:tc>
+          <w:tcPr>
+            <w:tcW w:w="0" w:type="auto"/>
+            <w:vMerge w:val="restart"/>
+            <w:shd w:val="clear" w:color="auto" w:fill="153D63" w:themeFill="text2" w:themeFillTint="E6"/>
+            <w:vAlign w:val="center"/>
+          </w:tcPr>
+          <w:p>
+            <w:pPr>
+              <w:jc w:val="center"/>
+              <w:rPr>
+                <w:b/>
+                <w:bCs/>
+              </w:rPr>
+            </w:pPr>
+            <w:r>
+              <w:rPr>
+                <w:b/>
+                <w:bCs/>
+              </w:rPr>
+              <w:t>OUTPUTS</w:t>
+            </w:r>
+          </w:p>
+        </w:tc>
+        <w:tc>
+          <w:tcPr>
+            <w:tcW w:w="0" w:type="auto"/>
+            <w:shd w:val="clear" w:color="auto" w:fill="153D63" w:themeFill="text2" w:themeFillTint="E6"/>
+            <w:vAlign w:val="center"/>
+          </w:tcPr>
+          <w:p>
+            <w:pPr>
+              <w:jc w:val="center"/>
+              <w:rPr>
+                <w:b/>
+                <w:bCs/>
+              </w:rPr>
+            </w:pPr>
+            <w:r>
+              <w:rPr>
+                <w:b/>
+                <w:bCs/>
+              </w:rPr>
+              <w:t>NAME</w:t>
+            </w:r>
+          </w:p>
+        </w:tc>
+        <w:tc>
+          <w:tcPr>
+            <w:tcW w:w="0" w:type="auto"/>
+            <w:shd w:val="clear" w:color="auto" w:fill="153D63" w:themeFill="text2" w:themeFillTint="E6"/>
+            <w:vAlign w:val="center"/>
+          </w:tcPr>
+          <w:p>
+            <w:pPr>
+              <w:jc w:val="center"/>
+              <w:rPr>
+                <w:b/>
+                <w:bCs/>
+              </w:rPr>
+            </w:pPr>
+            <w:r>
+              <w:rPr>
+                <w:b/>
+                <w:bCs/>
+              </w:rPr>
+              <w:t>TYPE</w:t>
+            </w:r>
+          </w:p>
+        </w:tc>
+      </w:tr>
+      <w:tr>
+        <w:trPr>
+          <w:trHeight w:val="525"/>
+        </w:trPr>
+        <w:tc>
+          <w:tcPr>
+            <w:tcW w:w="0" w:type="auto"/>
+            <w:vMerge/>
+            <w:shd w:val="clear" w:color="auto" w:fill="153D63" w:themeFill="text2" w:themeFillTint="E6"/>
+            <w:vAlign w:val="center"/>
+          </w:tcPr>
+          <w:p>
+            <w:pPr>
+              <w:jc w:val="center"/>
+              <w:rPr>
+                <w:b/>
+                <w:bCs/>
+              </w:rPr>
+            </w:pPr>
+          </w:p>
+        </w:tc>
+        <w:tc>
+          <w:tcPr>
+            <w:tcW w:w="0" w:type="auto"/>
+            <w:vAlign w:val="center"/>
+          </w:tcPr>
+          <w:p>
+            <w:pPr>
+              <w:jc w:val="center"/>
+            </w:pPr>
+            <w:r>
+              <w:t>Academic Period</w:t>
+            </w:r>
+            <w:r>
+              <w:t xml:space="preserve"> Performance Report</w:t>
+            </w:r>
+          </w:p>
+        </w:tc>
+        <w:tc>
+          <w:tcPr>
+            <w:tcW w:w="0" w:type="auto"/>
+            <w:vAlign w:val="center"/>
+          </w:tcPr>
+          <w:p>
+            <w:pPr>
+              <w:jc w:val="center"/>
+            </w:pPr>
+            <w:r>
+              <w:t>File</w:t>
+            </w:r>
+          </w:p>
+        </w:tc>
+      </w:tr>
+      <w:tr>
+        <w:trPr>
+          <w:trHeight w:val="808"/>
+        </w:trPr>
+        <w:tc>
+          <w:tcPr>
+            <w:tcW w:w="0" w:type="auto"/>
+            <w:shd w:val="clear" w:color="auto" w:fill="153D63" w:themeFill="text2" w:themeFillTint="E6"/>
+            <w:vAlign w:val="center"/>
+          </w:tcPr>
+          <w:p>
+            <w:pPr>
+              <w:jc w:val="center"/>
+              <w:rPr>
+                <w:b/>
+                <w:bCs/>
+              </w:rPr>
+            </w:pPr>
+            <w:r>
+              <w:rPr>
+                <w:b/>
+                <w:bCs/>
+              </w:rPr>
+              <w:t>POSTCONDITIONS</w:t>
+            </w:r>
+          </w:p>
+        </w:tc>
+        <w:tc>
+          <w:tcPr>
+            <w:tcW w:w="0" w:type="auto"/>
+            <w:gridSpan w:val="2"/>
+            <w:vAlign w:val="center"/>
+          </w:tcPr>
+          <w:p>
+            <w:pPr>
+              <w:jc w:val="center"/>
+            </w:pPr>
+            <w:r>
+              <w:t>The report is presented to the user.</w:t>
+            </w:r>
+          </w:p>
+        </w:tc>
+      </w:tr>
+      <w:tr>
+        <w:trPr>
+          <w:trHeight w:val="1054"/>
+        </w:trPr>
+        <w:tc>
+          <w:tcPr>
+            <w:tcW w:w="0" w:type="auto"/>
+            <w:shd w:val="clear" w:color="auto" w:fill="153D63" w:themeFill="text2" w:themeFillTint="E6"/>
+            <w:vAlign w:val="center"/>
+          </w:tcPr>
+          <w:p>
+            <w:pPr>
+              <w:jc w:val="center"/>
+              <w:rPr>
+                <w:b/>
+                <w:bCs/>
+              </w:rPr>
+            </w:pPr>
+            <w:r>
+              <w:rPr>
+                <w:b/>
+                <w:bCs/>
+              </w:rPr>
+              <w:t>VALIDATIONS</w:t>
+            </w:r>
+          </w:p>
+        </w:tc>
+        <w:tc>
+          <w:tcPr>
+            <w:tcW w:w="0" w:type="auto"/>
+            <w:gridSpan w:val="2"/>
+            <w:vAlign w:val="center"/>
+          </w:tcPr>
+          <w:p>
+            <w:pPr>
+              <w:jc w:val="center"/>
+            </w:pPr>
+            <w:r>
+              <w:t>The selected academic period must be accessible to the user.</w:t>
+            </w:r>
+          </w:p>
+        </w:tc>
+      </w:tr>
+      <w:tr>
+        <w:trPr>
+          <w:trHeight w:val="1261"/>
+        </w:trPr>
+        <w:tc>
+          <w:tcPr>
+            <w:tcW w:w="0" w:type="auto"/>
+            <w:shd w:val="clear" w:color="auto" w:fill="153D63" w:themeFill="text2" w:themeFillTint="E6"/>
+            <w:vAlign w:val="center"/>
+          </w:tcPr>
+          <w:p>
+            <w:pPr>
+              <w:jc w:val="center"/>
+              <w:rPr>
+                <w:b/>
+                <w:bCs/>
+              </w:rPr>
+            </w:pPr>
+            <w:r>
+              <w:rPr>
+                <w:b/>
+                <w:bCs/>
+              </w:rPr>
+              <w:t>EXCEPTIONS</w:t>
+            </w:r>
+          </w:p>
+        </w:tc>
+        <w:tc>
+          <w:tcPr>
+            <w:tcW w:w="0" w:type="auto"/>
+            <w:gridSpan w:val="2"/>
+            <w:vAlign w:val="center"/>
+          </w:tcPr>
+          <w:p>
+            <w:pPr>
+              <w:jc w:val="center"/>
+            </w:pPr>
+            <w:r>
+              <w:t>The system shall notify the user if the report cannot be generated.</w:t>
+            </w:r>
+          </w:p>
+        </w:tc>
+      </w:tr>
+    </w:tbl>
+    <w:p/>
+    <w:p>
+      <w:pPr>
+        <w:pStyle w:val="Ttulo3"/>
+        <w:rPr>
+          <w:lang w:val="en-US"/>
+        </w:rPr>
+      </w:pPr>
+      <w:r>
+        <w:t>Historical Performance (HIS) Requirements</w:t>
+      </w:r>
+    </w:p>
     <w:sectPr>
       <w:pgSz w:w="12240" w:h="15840"/>
       <w:pgMar w:top="1440" w:right="1440" w:bottom="1440" w:left="1440" w:header="709" w:footer="709" w:gutter="0"/>

</xml_diff>

<commit_message>
docs: updated README with milestones
</commit_message>
<xml_diff>
--- a/docs/SRS.docx
+++ b/docs/SRS.docx
@@ -205,7 +205,7 @@
           <w:r>
             <w:fldChar w:fldCharType="separate"/>
           </w:r>
-          <w:hyperlink w:anchor="_Toc237869683" w:history="1">
+          <w:hyperlink w:anchor="_Toc237869933" w:history="1">
             <w:r>
               <w:rPr>
                 <w:rStyle w:val="Hipervnculo"/>
@@ -249,7 +249,7 @@
                 <w:noProof/>
                 <w:webHidden/>
               </w:rPr>
-              <w:instrText xml:space="preserve"> PAGEREF _Toc237869683 \h </w:instrText>
+              <w:instrText xml:space="preserve"> PAGEREF _Toc237869933 \h </w:instrText>
             </w:r>
             <w:r>
               <w:rPr>
@@ -295,7 +295,7 @@
               <w14:ligatures w14:val="standardContextual"/>
             </w:rPr>
           </w:pPr>
-          <w:hyperlink w:anchor="_Toc237869684" w:history="1">
+          <w:hyperlink w:anchor="_Toc237869934" w:history="1">
             <w:r>
               <w:rPr>
                 <w:rStyle w:val="Hipervnculo"/>
@@ -339,7 +339,7 @@
                 <w:noProof/>
                 <w:webHidden/>
               </w:rPr>
-              <w:instrText xml:space="preserve"> PAGEREF _Toc237869684 \h </w:instrText>
+              <w:instrText xml:space="preserve"> PAGEREF _Toc237869934 \h </w:instrText>
             </w:r>
             <w:r>
               <w:rPr>
@@ -385,7 +385,7 @@
               <w14:ligatures w14:val="standardContextual"/>
             </w:rPr>
           </w:pPr>
-          <w:hyperlink w:anchor="_Toc237869685" w:history="1">
+          <w:hyperlink w:anchor="_Toc237869935" w:history="1">
             <w:r>
               <w:rPr>
                 <w:rStyle w:val="Hipervnculo"/>
@@ -429,7 +429,7 @@
                 <w:noProof/>
                 <w:webHidden/>
               </w:rPr>
-              <w:instrText xml:space="preserve"> PAGEREF _Toc237869685 \h </w:instrText>
+              <w:instrText xml:space="preserve"> PAGEREF _Toc237869935 \h </w:instrText>
             </w:r>
             <w:r>
               <w:rPr>
@@ -475,7 +475,7 @@
               <w14:ligatures w14:val="standardContextual"/>
             </w:rPr>
           </w:pPr>
-          <w:hyperlink w:anchor="_Toc237869686" w:history="1">
+          <w:hyperlink w:anchor="_Toc237869936" w:history="1">
             <w:r>
               <w:rPr>
                 <w:rStyle w:val="Hipervnculo"/>
@@ -519,7 +519,7 @@
                 <w:noProof/>
                 <w:webHidden/>
               </w:rPr>
-              <w:instrText xml:space="preserve"> PAGEREF _Toc237869686 \h </w:instrText>
+              <w:instrText xml:space="preserve"> PAGEREF _Toc237869936 \h </w:instrText>
             </w:r>
             <w:r>
               <w:rPr>
@@ -539,7 +539,7 @@
                 <w:noProof/>
                 <w:webHidden/>
               </w:rPr>
-              <w:t>5</w:t>
+              <w:t>6</w:t>
             </w:r>
             <w:r>
               <w:rPr>
@@ -565,7 +565,7 @@
               <w14:ligatures w14:val="standardContextual"/>
             </w:rPr>
           </w:pPr>
-          <w:hyperlink w:anchor="_Toc237869687" w:history="1">
+          <w:hyperlink w:anchor="_Toc237869937" w:history="1">
             <w:r>
               <w:rPr>
                 <w:rStyle w:val="Hipervnculo"/>
@@ -609,7 +609,7 @@
                 <w:noProof/>
                 <w:webHidden/>
               </w:rPr>
-              <w:instrText xml:space="preserve"> PAGEREF _Toc237869687 \h </w:instrText>
+              <w:instrText xml:space="preserve"> PAGEREF _Toc237869937 \h </w:instrText>
             </w:r>
             <w:r>
               <w:rPr>
@@ -655,7 +655,7 @@
               <w14:ligatures w14:val="standardContextual"/>
             </w:rPr>
           </w:pPr>
-          <w:hyperlink w:anchor="_Toc237869688" w:history="1">
+          <w:hyperlink w:anchor="_Toc237869938" w:history="1">
             <w:r>
               <w:rPr>
                 <w:rStyle w:val="Hipervnculo"/>
@@ -699,7 +699,7 @@
                 <w:noProof/>
                 <w:webHidden/>
               </w:rPr>
-              <w:instrText xml:space="preserve"> PAGEREF _Toc237869688 \h </w:instrText>
+              <w:instrText xml:space="preserve"> PAGEREF _Toc237869938 \h </w:instrText>
             </w:r>
             <w:r>
               <w:rPr>
@@ -719,7 +719,7 @@
                 <w:noProof/>
                 <w:webHidden/>
               </w:rPr>
-              <w:t>6</w:t>
+              <w:t>7</w:t>
             </w:r>
             <w:r>
               <w:rPr>
@@ -745,7 +745,7 @@
               <w14:ligatures w14:val="standardContextual"/>
             </w:rPr>
           </w:pPr>
-          <w:hyperlink w:anchor="_Toc237869689" w:history="1">
+          <w:hyperlink w:anchor="_Toc237869939" w:history="1">
             <w:r>
               <w:rPr>
                 <w:rStyle w:val="Hipervnculo"/>
@@ -789,7 +789,7 @@
                 <w:noProof/>
                 <w:webHidden/>
               </w:rPr>
-              <w:instrText xml:space="preserve"> PAGEREF _Toc237869689 \h </w:instrText>
+              <w:instrText xml:space="preserve"> PAGEREF _Toc237869939 \h </w:instrText>
             </w:r>
             <w:r>
               <w:rPr>
@@ -809,7 +809,7 @@
                 <w:noProof/>
                 <w:webHidden/>
               </w:rPr>
-              <w:t>6</w:t>
+              <w:t>7</w:t>
             </w:r>
             <w:r>
               <w:rPr>
@@ -835,7 +835,7 @@
               <w14:ligatures w14:val="standardContextual"/>
             </w:rPr>
           </w:pPr>
-          <w:hyperlink w:anchor="_Toc237869690" w:history="1">
+          <w:hyperlink w:anchor="_Toc237869940" w:history="1">
             <w:r>
               <w:rPr>
                 <w:rStyle w:val="Hipervnculo"/>
@@ -879,7 +879,7 @@
                 <w:noProof/>
                 <w:webHidden/>
               </w:rPr>
-              <w:instrText xml:space="preserve"> PAGEREF _Toc237869690 \h </w:instrText>
+              <w:instrText xml:space="preserve"> PAGEREF _Toc237869940 \h </w:instrText>
             </w:r>
             <w:r>
               <w:rPr>
@@ -925,7 +925,7 @@
               <w14:ligatures w14:val="standardContextual"/>
             </w:rPr>
           </w:pPr>
-          <w:hyperlink w:anchor="_Toc237869691" w:history="1">
+          <w:hyperlink w:anchor="_Toc237869941" w:history="1">
             <w:r>
               <w:rPr>
                 <w:rStyle w:val="Hipervnculo"/>
@@ -969,7 +969,7 @@
                 <w:noProof/>
                 <w:webHidden/>
               </w:rPr>
-              <w:instrText xml:space="preserve"> PAGEREF _Toc237869691 \h </w:instrText>
+              <w:instrText xml:space="preserve"> PAGEREF _Toc237869941 \h </w:instrText>
             </w:r>
             <w:r>
               <w:rPr>
@@ -1015,7 +1015,7 @@
               <w14:ligatures w14:val="standardContextual"/>
             </w:rPr>
           </w:pPr>
-          <w:hyperlink w:anchor="_Toc237869692" w:history="1">
+          <w:hyperlink w:anchor="_Toc237869942" w:history="1">
             <w:r>
               <w:rPr>
                 <w:rStyle w:val="Hipervnculo"/>
@@ -1059,7 +1059,7 @@
                 <w:noProof/>
                 <w:webHidden/>
               </w:rPr>
-              <w:instrText xml:space="preserve"> PAGEREF _Toc237869692 \h </w:instrText>
+              <w:instrText xml:space="preserve"> PAGEREF _Toc237869942 \h </w:instrText>
             </w:r>
             <w:r>
               <w:rPr>
@@ -1079,7 +1079,7 @@
                 <w:noProof/>
                 <w:webHidden/>
               </w:rPr>
-              <w:t>7</w:t>
+              <w:t>8</w:t>
             </w:r>
             <w:r>
               <w:rPr>
@@ -1105,7 +1105,7 @@
               <w14:ligatures w14:val="standardContextual"/>
             </w:rPr>
           </w:pPr>
-          <w:hyperlink w:anchor="_Toc237869693" w:history="1">
+          <w:hyperlink w:anchor="_Toc237869943" w:history="1">
             <w:r>
               <w:rPr>
                 <w:rStyle w:val="Hipervnculo"/>
@@ -1149,7 +1149,7 @@
                 <w:noProof/>
                 <w:webHidden/>
               </w:rPr>
-              <w:instrText xml:space="preserve"> PAGEREF _Toc237869693 \h </w:instrText>
+              <w:instrText xml:space="preserve"> PAGEREF _Toc237869943 \h </w:instrText>
             </w:r>
             <w:r>
               <w:rPr>
@@ -1195,7 +1195,7 @@
               <w14:ligatures w14:val="standardContextual"/>
             </w:rPr>
           </w:pPr>
-          <w:hyperlink w:anchor="_Toc237869694" w:history="1">
+          <w:hyperlink w:anchor="_Toc237869944" w:history="1">
             <w:r>
               <w:rPr>
                 <w:rStyle w:val="Hipervnculo"/>
@@ -1239,7 +1239,7 @@
                 <w:noProof/>
                 <w:webHidden/>
               </w:rPr>
-              <w:instrText xml:space="preserve"> PAGEREF _Toc237869694 \h </w:instrText>
+              <w:instrText xml:space="preserve"> PAGEREF _Toc237869944 \h </w:instrText>
             </w:r>
             <w:r>
               <w:rPr>
@@ -1259,7 +1259,7 @@
                 <w:noProof/>
                 <w:webHidden/>
               </w:rPr>
-              <w:t>8</w:t>
+              <w:t>9</w:t>
             </w:r>
             <w:r>
               <w:rPr>
@@ -1285,7 +1285,7 @@
               <w14:ligatures w14:val="standardContextual"/>
             </w:rPr>
           </w:pPr>
-          <w:hyperlink w:anchor="_Toc237869695" w:history="1">
+          <w:hyperlink w:anchor="_Toc237869945" w:history="1">
             <w:r>
               <w:rPr>
                 <w:rStyle w:val="Hipervnculo"/>
@@ -1329,7 +1329,7 @@
                 <w:noProof/>
                 <w:webHidden/>
               </w:rPr>
-              <w:instrText xml:space="preserve"> PAGEREF _Toc237869695 \h </w:instrText>
+              <w:instrText xml:space="preserve"> PAGEREF _Toc237869945 \h </w:instrText>
             </w:r>
             <w:r>
               <w:rPr>
@@ -1349,7 +1349,7 @@
                 <w:noProof/>
                 <w:webHidden/>
               </w:rPr>
-              <w:t>8</w:t>
+              <w:t>9</w:t>
             </w:r>
             <w:r>
               <w:rPr>
@@ -1375,7 +1375,7 @@
               <w14:ligatures w14:val="standardContextual"/>
             </w:rPr>
           </w:pPr>
-          <w:hyperlink w:anchor="_Toc237869696" w:history="1">
+          <w:hyperlink w:anchor="_Toc237869946" w:history="1">
             <w:r>
               <w:rPr>
                 <w:rStyle w:val="Hipervnculo"/>
@@ -1419,7 +1419,7 @@
                 <w:noProof/>
                 <w:webHidden/>
               </w:rPr>
-              <w:instrText xml:space="preserve"> PAGEREF _Toc237869696 \h </w:instrText>
+              <w:instrText xml:space="preserve"> PAGEREF _Toc237869946 \h </w:instrText>
             </w:r>
             <w:r>
               <w:rPr>
@@ -1465,7 +1465,7 @@
               <w14:ligatures w14:val="standardContextual"/>
             </w:rPr>
           </w:pPr>
-          <w:hyperlink w:anchor="_Toc237869697" w:history="1">
+          <w:hyperlink w:anchor="_Toc237869947" w:history="1">
             <w:r>
               <w:rPr>
                 <w:rStyle w:val="Hipervnculo"/>
@@ -1509,7 +1509,7 @@
                 <w:noProof/>
                 <w:webHidden/>
               </w:rPr>
-              <w:instrText xml:space="preserve"> PAGEREF _Toc237869697 \h </w:instrText>
+              <w:instrText xml:space="preserve"> PAGEREF _Toc237869947 \h </w:instrText>
             </w:r>
             <w:r>
               <w:rPr>
@@ -1529,7 +1529,7 @@
                 <w:noProof/>
                 <w:webHidden/>
               </w:rPr>
-              <w:t>9</w:t>
+              <w:t>10</w:t>
             </w:r>
             <w:r>
               <w:rPr>
@@ -1555,7 +1555,7 @@
               <w14:ligatures w14:val="standardContextual"/>
             </w:rPr>
           </w:pPr>
-          <w:hyperlink w:anchor="_Toc237869698" w:history="1">
+          <w:hyperlink w:anchor="_Toc237869948" w:history="1">
             <w:r>
               <w:rPr>
                 <w:rStyle w:val="Hipervnculo"/>
@@ -1599,7 +1599,7 @@
                 <w:noProof/>
                 <w:webHidden/>
               </w:rPr>
-              <w:instrText xml:space="preserve"> PAGEREF _Toc237869698 \h </w:instrText>
+              <w:instrText xml:space="preserve"> PAGEREF _Toc237869948 \h </w:instrText>
             </w:r>
             <w:r>
               <w:rPr>
@@ -1619,7 +1619,7 @@
                 <w:noProof/>
                 <w:webHidden/>
               </w:rPr>
-              <w:t>9</w:t>
+              <w:t>10</w:t>
             </w:r>
             <w:r>
               <w:rPr>
@@ -1645,7 +1645,7 @@
               <w14:ligatures w14:val="standardContextual"/>
             </w:rPr>
           </w:pPr>
-          <w:hyperlink w:anchor="_Toc237869699" w:history="1">
+          <w:hyperlink w:anchor="_Toc237869949" w:history="1">
             <w:r>
               <w:rPr>
                 <w:rStyle w:val="Hipervnculo"/>
@@ -1689,7 +1689,7 @@
                 <w:noProof/>
                 <w:webHidden/>
               </w:rPr>
-              <w:instrText xml:space="preserve"> PAGEREF _Toc237869699 \h </w:instrText>
+              <w:instrText xml:space="preserve"> PAGEREF _Toc237869949 \h </w:instrText>
             </w:r>
             <w:r>
               <w:rPr>
@@ -1709,7 +1709,7 @@
                 <w:noProof/>
                 <w:webHidden/>
               </w:rPr>
-              <w:t>10</w:t>
+              <w:t>11</w:t>
             </w:r>
             <w:r>
               <w:rPr>
@@ -1735,7 +1735,7 @@
               <w14:ligatures w14:val="standardContextual"/>
             </w:rPr>
           </w:pPr>
-          <w:hyperlink w:anchor="_Toc237869700" w:history="1">
+          <w:hyperlink w:anchor="_Toc237869950" w:history="1">
             <w:r>
               <w:rPr>
                 <w:rStyle w:val="Hipervnculo"/>
@@ -1779,7 +1779,7 @@
                 <w:noProof/>
                 <w:webHidden/>
               </w:rPr>
-              <w:instrText xml:space="preserve"> PAGEREF _Toc237869700 \h </w:instrText>
+              <w:instrText xml:space="preserve"> PAGEREF _Toc237869950 \h </w:instrText>
             </w:r>
             <w:r>
               <w:rPr>
@@ -1799,7 +1799,7 @@
                 <w:noProof/>
                 <w:webHidden/>
               </w:rPr>
-              <w:t>10</w:t>
+              <w:t>11</w:t>
             </w:r>
             <w:r>
               <w:rPr>
@@ -1825,7 +1825,7 @@
               <w14:ligatures w14:val="standardContextual"/>
             </w:rPr>
           </w:pPr>
-          <w:hyperlink w:anchor="_Toc237869701" w:history="1">
+          <w:hyperlink w:anchor="_Toc237869951" w:history="1">
             <w:r>
               <w:rPr>
                 <w:rStyle w:val="Hipervnculo"/>
@@ -1869,7 +1869,7 @@
                 <w:noProof/>
                 <w:webHidden/>
               </w:rPr>
-              <w:instrText xml:space="preserve"> PAGEREF _Toc237869701 \h </w:instrText>
+              <w:instrText xml:space="preserve"> PAGEREF _Toc237869951 \h </w:instrText>
             </w:r>
             <w:r>
               <w:rPr>
@@ -1889,7 +1889,7 @@
                 <w:noProof/>
                 <w:webHidden/>
               </w:rPr>
-              <w:t>19</w:t>
+              <w:t>20</w:t>
             </w:r>
             <w:r>
               <w:rPr>
@@ -1915,7 +1915,7 @@
               <w14:ligatures w14:val="standardContextual"/>
             </w:rPr>
           </w:pPr>
-          <w:hyperlink w:anchor="_Toc237869702" w:history="1">
+          <w:hyperlink w:anchor="_Toc237869952" w:history="1">
             <w:r>
               <w:rPr>
                 <w:rStyle w:val="Hipervnculo"/>
@@ -1959,7 +1959,7 @@
                 <w:noProof/>
                 <w:webHidden/>
               </w:rPr>
-              <w:instrText xml:space="preserve"> PAGEREF _Toc237869702 \h </w:instrText>
+              <w:instrText xml:space="preserve"> PAGEREF _Toc237869952 \h </w:instrText>
             </w:r>
             <w:r>
               <w:rPr>
@@ -1979,7 +1979,7 @@
                 <w:noProof/>
                 <w:webHidden/>
               </w:rPr>
-              <w:t>25</w:t>
+              <w:t>26</w:t>
             </w:r>
             <w:r>
               <w:rPr>
@@ -2005,7 +2005,7 @@
               <w14:ligatures w14:val="standardContextual"/>
             </w:rPr>
           </w:pPr>
-          <w:hyperlink w:anchor="_Toc237869703" w:history="1">
+          <w:hyperlink w:anchor="_Toc237869953" w:history="1">
             <w:r>
               <w:rPr>
                 <w:rStyle w:val="Hipervnculo"/>
@@ -2049,7 +2049,7 @@
                 <w:noProof/>
                 <w:webHidden/>
               </w:rPr>
-              <w:instrText xml:space="preserve"> PAGEREF _Toc237869703 \h </w:instrText>
+              <w:instrText xml:space="preserve"> PAGEREF _Toc237869953 \h </w:instrText>
             </w:r>
             <w:r>
               <w:rPr>
@@ -2069,7 +2069,7 @@
                 <w:noProof/>
                 <w:webHidden/>
               </w:rPr>
-              <w:t>30</w:t>
+              <w:t>31</w:t>
             </w:r>
             <w:r>
               <w:rPr>
@@ -2095,7 +2095,7 @@
               <w14:ligatures w14:val="standardContextual"/>
             </w:rPr>
           </w:pPr>
-          <w:hyperlink w:anchor="_Toc237869704" w:history="1">
+          <w:hyperlink w:anchor="_Toc237869954" w:history="1">
             <w:r>
               <w:rPr>
                 <w:rStyle w:val="Hipervnculo"/>
@@ -2139,7 +2139,7 @@
                 <w:noProof/>
                 <w:webHidden/>
               </w:rPr>
-              <w:instrText xml:space="preserve"> PAGEREF _Toc237869704 \h </w:instrText>
+              <w:instrText xml:space="preserve"> PAGEREF _Toc237869954 \h </w:instrText>
             </w:r>
             <w:r>
               <w:rPr>
@@ -2159,7 +2159,7 @@
                 <w:noProof/>
                 <w:webHidden/>
               </w:rPr>
-              <w:t>32</w:t>
+              <w:t>33</w:t>
             </w:r>
             <w:r>
               <w:rPr>
@@ -2185,7 +2185,7 @@
               <w14:ligatures w14:val="standardContextual"/>
             </w:rPr>
           </w:pPr>
-          <w:hyperlink w:anchor="_Toc237869705" w:history="1">
+          <w:hyperlink w:anchor="_Toc237869955" w:history="1">
             <w:r>
               <w:rPr>
                 <w:rStyle w:val="Hipervnculo"/>
@@ -2229,7 +2229,7 @@
                 <w:noProof/>
                 <w:webHidden/>
               </w:rPr>
-              <w:instrText xml:space="preserve"> PAGEREF _Toc237869705 \h </w:instrText>
+              <w:instrText xml:space="preserve"> PAGEREF _Toc237869955 \h </w:instrText>
             </w:r>
             <w:r>
               <w:rPr>
@@ -2249,7 +2249,7 @@
                 <w:noProof/>
                 <w:webHidden/>
               </w:rPr>
-              <w:t>34</w:t>
+              <w:t>35</w:t>
             </w:r>
             <w:r>
               <w:rPr>
@@ -2275,7 +2275,7 @@
               <w14:ligatures w14:val="standardContextual"/>
             </w:rPr>
           </w:pPr>
-          <w:hyperlink w:anchor="_Toc237869706" w:history="1">
+          <w:hyperlink w:anchor="_Toc237869956" w:history="1">
             <w:r>
               <w:rPr>
                 <w:rStyle w:val="Hipervnculo"/>
@@ -2319,7 +2319,7 @@
                 <w:noProof/>
                 <w:webHidden/>
               </w:rPr>
-              <w:instrText xml:space="preserve"> PAGEREF _Toc237869706 \h </w:instrText>
+              <w:instrText xml:space="preserve"> PAGEREF _Toc237869956 \h </w:instrText>
             </w:r>
             <w:r>
               <w:rPr>
@@ -2339,7 +2339,7 @@
                 <w:noProof/>
                 <w:webHidden/>
               </w:rPr>
-              <w:t>38</w:t>
+              <w:t>39</w:t>
             </w:r>
             <w:r>
               <w:rPr>
@@ -2365,7 +2365,7 @@
               <w14:ligatures w14:val="standardContextual"/>
             </w:rPr>
           </w:pPr>
-          <w:hyperlink w:anchor="_Toc237869707" w:history="1">
+          <w:hyperlink w:anchor="_Toc237869957" w:history="1">
             <w:r>
               <w:rPr>
                 <w:rStyle w:val="Hipervnculo"/>
@@ -2409,7 +2409,7 @@
                 <w:noProof/>
                 <w:webHidden/>
               </w:rPr>
-              <w:instrText xml:space="preserve"> PAGEREF _Toc237869707 \h </w:instrText>
+              <w:instrText xml:space="preserve"> PAGEREF _Toc237869957 \h </w:instrText>
             </w:r>
             <w:r>
               <w:rPr>
@@ -2429,7 +2429,7 @@
                 <w:noProof/>
                 <w:webHidden/>
               </w:rPr>
-              <w:t>40</w:t>
+              <w:t>41</w:t>
             </w:r>
             <w:r>
               <w:rPr>
@@ -2455,7 +2455,7 @@
               <w14:ligatures w14:val="standardContextual"/>
             </w:rPr>
           </w:pPr>
-          <w:hyperlink w:anchor="_Toc237869708" w:history="1">
+          <w:hyperlink w:anchor="_Toc237869958" w:history="1">
             <w:r>
               <w:rPr>
                 <w:rStyle w:val="Hipervnculo"/>
@@ -2499,7 +2499,7 @@
                 <w:noProof/>
                 <w:webHidden/>
               </w:rPr>
-              <w:instrText xml:space="preserve"> PAGEREF _Toc237869708 \h </w:instrText>
+              <w:instrText xml:space="preserve"> PAGEREF _Toc237869958 \h </w:instrText>
             </w:r>
             <w:r>
               <w:rPr>
@@ -2519,7 +2519,7 @@
                 <w:noProof/>
                 <w:webHidden/>
               </w:rPr>
-              <w:t>42</w:t>
+              <w:t>43</w:t>
             </w:r>
             <w:r>
               <w:rPr>
@@ -2545,7 +2545,7 @@
               <w14:ligatures w14:val="standardContextual"/>
             </w:rPr>
           </w:pPr>
-          <w:hyperlink w:anchor="_Toc237869709" w:history="1">
+          <w:hyperlink w:anchor="_Toc237869959" w:history="1">
             <w:r>
               <w:rPr>
                 <w:rStyle w:val="Hipervnculo"/>
@@ -2589,7 +2589,7 @@
                 <w:noProof/>
                 <w:webHidden/>
               </w:rPr>
-              <w:instrText xml:space="preserve"> PAGEREF _Toc237869709 \h </w:instrText>
+              <w:instrText xml:space="preserve"> PAGEREF _Toc237869959 \h </w:instrText>
             </w:r>
             <w:r>
               <w:rPr>
@@ -2609,7 +2609,7 @@
                 <w:noProof/>
                 <w:webHidden/>
               </w:rPr>
-              <w:t>44</w:t>
+              <w:t>45</w:t>
             </w:r>
             <w:r>
               <w:rPr>
@@ -2635,7 +2635,7 @@
               <w14:ligatures w14:val="standardContextual"/>
             </w:rPr>
           </w:pPr>
-          <w:hyperlink w:anchor="_Toc237869710" w:history="1">
+          <w:hyperlink w:anchor="_Toc237869960" w:history="1">
             <w:r>
               <w:rPr>
                 <w:rStyle w:val="Hipervnculo"/>
@@ -2679,7 +2679,7 @@
                 <w:noProof/>
                 <w:webHidden/>
               </w:rPr>
-              <w:instrText xml:space="preserve"> PAGEREF _Toc237869710 \h </w:instrText>
+              <w:instrText xml:space="preserve"> PAGEREF _Toc237869960 \h </w:instrText>
             </w:r>
             <w:r>
               <w:rPr>
@@ -2699,7 +2699,7 @@
                 <w:noProof/>
                 <w:webHidden/>
               </w:rPr>
-              <w:t>46</w:t>
+              <w:t>47</w:t>
             </w:r>
             <w:r>
               <w:rPr>
@@ -2725,7 +2725,7 @@
               <w14:ligatures w14:val="standardContextual"/>
             </w:rPr>
           </w:pPr>
-          <w:hyperlink w:anchor="_Toc237869711" w:history="1">
+          <w:hyperlink w:anchor="_Toc237869961" w:history="1">
             <w:r>
               <w:rPr>
                 <w:rStyle w:val="Hipervnculo"/>
@@ -2769,7 +2769,7 @@
                 <w:noProof/>
                 <w:webHidden/>
               </w:rPr>
-              <w:instrText xml:space="preserve"> PAGEREF _Toc237869711 \h </w:instrText>
+              <w:instrText xml:space="preserve"> PAGEREF _Toc237869961 \h </w:instrText>
             </w:r>
             <w:r>
               <w:rPr>
@@ -2789,7 +2789,7 @@
                 <w:noProof/>
                 <w:webHidden/>
               </w:rPr>
-              <w:t>46</w:t>
+              <w:t>47</w:t>
             </w:r>
             <w:r>
               <w:rPr>
@@ -2815,7 +2815,7 @@
               <w14:ligatures w14:val="standardContextual"/>
             </w:rPr>
           </w:pPr>
-          <w:hyperlink w:anchor="_Toc237869712" w:history="1">
+          <w:hyperlink w:anchor="_Toc237869962" w:history="1">
             <w:r>
               <w:rPr>
                 <w:rStyle w:val="Hipervnculo"/>
@@ -2859,7 +2859,7 @@
                 <w:noProof/>
                 <w:webHidden/>
               </w:rPr>
-              <w:instrText xml:space="preserve"> PAGEREF _Toc237869712 \h </w:instrText>
+              <w:instrText xml:space="preserve"> PAGEREF _Toc237869962 \h </w:instrText>
             </w:r>
             <w:r>
               <w:rPr>
@@ -2879,7 +2879,7 @@
                 <w:noProof/>
                 <w:webHidden/>
               </w:rPr>
-              <w:t>46</w:t>
+              <w:t>47</w:t>
             </w:r>
             <w:r>
               <w:rPr>
@@ -2905,7 +2905,7 @@
               <w14:ligatures w14:val="standardContextual"/>
             </w:rPr>
           </w:pPr>
-          <w:hyperlink w:anchor="_Toc237869713" w:history="1">
+          <w:hyperlink w:anchor="_Toc237869963" w:history="1">
             <w:r>
               <w:rPr>
                 <w:rStyle w:val="Hipervnculo"/>
@@ -2949,7 +2949,7 @@
                 <w:noProof/>
                 <w:webHidden/>
               </w:rPr>
-              <w:instrText xml:space="preserve"> PAGEREF _Toc237869713 \h </w:instrText>
+              <w:instrText xml:space="preserve"> PAGEREF _Toc237869963 \h </w:instrText>
             </w:r>
             <w:r>
               <w:rPr>
@@ -2969,7 +2969,7 @@
                 <w:noProof/>
                 <w:webHidden/>
               </w:rPr>
-              <w:t>46</w:t>
+              <w:t>47</w:t>
             </w:r>
             <w:r>
               <w:rPr>
@@ -2995,7 +2995,7 @@
               <w14:ligatures w14:val="standardContextual"/>
             </w:rPr>
           </w:pPr>
-          <w:hyperlink w:anchor="_Toc237869714" w:history="1">
+          <w:hyperlink w:anchor="_Toc237869964" w:history="1">
             <w:r>
               <w:rPr>
                 <w:rStyle w:val="Hipervnculo"/>
@@ -3039,7 +3039,7 @@
                 <w:noProof/>
                 <w:webHidden/>
               </w:rPr>
-              <w:instrText xml:space="preserve"> PAGEREF _Toc237869714 \h </w:instrText>
+              <w:instrText xml:space="preserve"> PAGEREF _Toc237869964 \h </w:instrText>
             </w:r>
             <w:r>
               <w:rPr>
@@ -3059,7 +3059,7 @@
                 <w:noProof/>
                 <w:webHidden/>
               </w:rPr>
-              <w:t>47</w:t>
+              <w:t>48</w:t>
             </w:r>
             <w:r>
               <w:rPr>
@@ -3085,7 +3085,7 @@
               <w14:ligatures w14:val="standardContextual"/>
             </w:rPr>
           </w:pPr>
-          <w:hyperlink w:anchor="_Toc237869715" w:history="1">
+          <w:hyperlink w:anchor="_Toc237869965" w:history="1">
             <w:r>
               <w:rPr>
                 <w:rStyle w:val="Hipervnculo"/>
@@ -3129,7 +3129,7 @@
                 <w:noProof/>
                 <w:webHidden/>
               </w:rPr>
-              <w:instrText xml:space="preserve"> PAGEREF _Toc237869715 \h </w:instrText>
+              <w:instrText xml:space="preserve"> PAGEREF _Toc237869965 \h </w:instrText>
             </w:r>
             <w:r>
               <w:rPr>
@@ -3149,7 +3149,7 @@
                 <w:noProof/>
                 <w:webHidden/>
               </w:rPr>
-              <w:t>48</w:t>
+              <w:t>49</w:t>
             </w:r>
             <w:r>
               <w:rPr>
@@ -3175,7 +3175,7 @@
               <w14:ligatures w14:val="standardContextual"/>
             </w:rPr>
           </w:pPr>
-          <w:hyperlink w:anchor="_Toc237869716" w:history="1">
+          <w:hyperlink w:anchor="_Toc237869966" w:history="1">
             <w:r>
               <w:rPr>
                 <w:rStyle w:val="Hipervnculo"/>
@@ -3219,7 +3219,7 @@
                 <w:noProof/>
                 <w:webHidden/>
               </w:rPr>
-              <w:instrText xml:space="preserve"> PAGEREF _Toc237869716 \h </w:instrText>
+              <w:instrText xml:space="preserve"> PAGEREF _Toc237869966 \h </w:instrText>
             </w:r>
             <w:r>
               <w:rPr>
@@ -3239,7 +3239,7 @@
                 <w:noProof/>
                 <w:webHidden/>
               </w:rPr>
-              <w:t>49</w:t>
+              <w:t>50</w:t>
             </w:r>
             <w:r>
               <w:rPr>
@@ -3265,7 +3265,7 @@
               <w14:ligatures w14:val="standardContextual"/>
             </w:rPr>
           </w:pPr>
-          <w:hyperlink w:anchor="_Toc237869717" w:history="1">
+          <w:hyperlink w:anchor="_Toc237869967" w:history="1">
             <w:r>
               <w:rPr>
                 <w:rStyle w:val="Hipervnculo"/>
@@ -3288,7 +3288,7 @@
                 <w:rStyle w:val="Hipervnculo"/>
                 <w:noProof/>
               </w:rPr>
-              <w:t>Mantainability (MNT) NFRs</w:t>
+              <w:t>Maintainability (MNT) NFRs</w:t>
             </w:r>
             <w:r>
               <w:rPr>
@@ -3309,7 +3309,7 @@
                 <w:noProof/>
                 <w:webHidden/>
               </w:rPr>
-              <w:instrText xml:space="preserve"> PAGEREF _Toc237869717 \h </w:instrText>
+              <w:instrText xml:space="preserve"> PAGEREF _Toc237869967 \h </w:instrText>
             </w:r>
             <w:r>
               <w:rPr>
@@ -3329,7 +3329,7 @@
                 <w:noProof/>
                 <w:webHidden/>
               </w:rPr>
-              <w:t>50</w:t>
+              <w:t>51</w:t>
             </w:r>
             <w:r>
               <w:rPr>
@@ -3355,7 +3355,7 @@
               <w14:ligatures w14:val="standardContextual"/>
             </w:rPr>
           </w:pPr>
-          <w:hyperlink w:anchor="_Toc237869718" w:history="1">
+          <w:hyperlink w:anchor="_Toc237869968" w:history="1">
             <w:r>
               <w:rPr>
                 <w:rStyle w:val="Hipervnculo"/>
@@ -3399,7 +3399,7 @@
                 <w:noProof/>
                 <w:webHidden/>
               </w:rPr>
-              <w:instrText xml:space="preserve"> PAGEREF _Toc237869718 \h </w:instrText>
+              <w:instrText xml:space="preserve"> PAGEREF _Toc237869968 \h </w:instrText>
             </w:r>
             <w:r>
               <w:rPr>
@@ -3419,7 +3419,7 @@
                 <w:noProof/>
                 <w:webHidden/>
               </w:rPr>
-              <w:t>51</w:t>
+              <w:t>52</w:t>
             </w:r>
             <w:r>
               <w:rPr>
@@ -3445,7 +3445,7 @@
               <w14:ligatures w14:val="standardContextual"/>
             </w:rPr>
           </w:pPr>
-          <w:hyperlink w:anchor="_Toc237869719" w:history="1">
+          <w:hyperlink w:anchor="_Toc237869969" w:history="1">
             <w:r>
               <w:rPr>
                 <w:rStyle w:val="Hipervnculo"/>
@@ -3489,7 +3489,7 @@
                 <w:noProof/>
                 <w:webHidden/>
               </w:rPr>
-              <w:instrText xml:space="preserve"> PAGEREF _Toc237869719 \h </w:instrText>
+              <w:instrText xml:space="preserve"> PAGEREF _Toc237869969 \h </w:instrText>
             </w:r>
             <w:r>
               <w:rPr>
@@ -3509,7 +3509,7 @@
                 <w:noProof/>
                 <w:webHidden/>
               </w:rPr>
-              <w:t>52</w:t>
+              <w:t>53</w:t>
             </w:r>
             <w:r>
               <w:rPr>
@@ -3535,7 +3535,7 @@
               <w14:ligatures w14:val="standardContextual"/>
             </w:rPr>
           </w:pPr>
-          <w:hyperlink w:anchor="_Toc237869720" w:history="1">
+          <w:hyperlink w:anchor="_Toc237869970" w:history="1">
             <w:r>
               <w:rPr>
                 <w:rStyle w:val="Hipervnculo"/>
@@ -3579,7 +3579,7 @@
                 <w:noProof/>
                 <w:webHidden/>
               </w:rPr>
-              <w:instrText xml:space="preserve"> PAGEREF _Toc237869720 \h </w:instrText>
+              <w:instrText xml:space="preserve"> PAGEREF _Toc237869970 \h </w:instrText>
             </w:r>
             <w:r>
               <w:rPr>
@@ -3599,7 +3599,7 @@
                 <w:noProof/>
                 <w:webHidden/>
               </w:rPr>
-              <w:t>53</w:t>
+              <w:t>54</w:t>
             </w:r>
             <w:r>
               <w:rPr>
@@ -3625,7 +3625,7 @@
               <w14:ligatures w14:val="standardContextual"/>
             </w:rPr>
           </w:pPr>
-          <w:hyperlink w:anchor="_Toc237869721" w:history="1">
+          <w:hyperlink w:anchor="_Toc237869971" w:history="1">
             <w:r>
               <w:rPr>
                 <w:rStyle w:val="Hipervnculo"/>
@@ -3669,7 +3669,7 @@
                 <w:noProof/>
                 <w:webHidden/>
               </w:rPr>
-              <w:instrText xml:space="preserve"> PAGEREF _Toc237869721 \h </w:instrText>
+              <w:instrText xml:space="preserve"> PAGEREF _Toc237869971 \h </w:instrText>
             </w:r>
             <w:r>
               <w:rPr>
@@ -3689,7 +3689,7 @@
                 <w:noProof/>
                 <w:webHidden/>
               </w:rPr>
-              <w:t>53</w:t>
+              <w:t>54</w:t>
             </w:r>
             <w:r>
               <w:rPr>
@@ -3715,7 +3715,7 @@
               <w14:ligatures w14:val="standardContextual"/>
             </w:rPr>
           </w:pPr>
-          <w:hyperlink w:anchor="_Toc237869722" w:history="1">
+          <w:hyperlink w:anchor="_Toc237869972" w:history="1">
             <w:r>
               <w:rPr>
                 <w:rStyle w:val="Hipervnculo"/>
@@ -3759,7 +3759,7 @@
                 <w:noProof/>
                 <w:webHidden/>
               </w:rPr>
-              <w:instrText xml:space="preserve"> PAGEREF _Toc237869722 \h </w:instrText>
+              <w:instrText xml:space="preserve"> PAGEREF _Toc237869972 \h </w:instrText>
             </w:r>
             <w:r>
               <w:rPr>
@@ -3779,7 +3779,7 @@
                 <w:noProof/>
                 <w:webHidden/>
               </w:rPr>
-              <w:t>53</w:t>
+              <w:t>54</w:t>
             </w:r>
             <w:r>
               <w:rPr>
@@ -3805,7 +3805,7 @@
               <w14:ligatures w14:val="standardContextual"/>
             </w:rPr>
           </w:pPr>
-          <w:hyperlink w:anchor="_Toc237869723" w:history="1">
+          <w:hyperlink w:anchor="_Toc237869973" w:history="1">
             <w:r>
               <w:rPr>
                 <w:rStyle w:val="Hipervnculo"/>
@@ -3849,7 +3849,7 @@
                 <w:noProof/>
                 <w:webHidden/>
               </w:rPr>
-              <w:instrText xml:space="preserve"> PAGEREF _Toc237869723 \h </w:instrText>
+              <w:instrText xml:space="preserve"> PAGEREF _Toc237869973 \h </w:instrText>
             </w:r>
             <w:r>
               <w:rPr>
@@ -3869,7 +3869,7 @@
                 <w:noProof/>
                 <w:webHidden/>
               </w:rPr>
-              <w:t>54</w:t>
+              <w:t>55</w:t>
             </w:r>
             <w:r>
               <w:rPr>
@@ -3895,7 +3895,7 @@
               <w14:ligatures w14:val="standardContextual"/>
             </w:rPr>
           </w:pPr>
-          <w:hyperlink w:anchor="_Toc237869724" w:history="1">
+          <w:hyperlink w:anchor="_Toc237869974" w:history="1">
             <w:r>
               <w:rPr>
                 <w:rStyle w:val="Hipervnculo"/>
@@ -3939,7 +3939,7 @@
                 <w:noProof/>
                 <w:webHidden/>
               </w:rPr>
-              <w:instrText xml:space="preserve"> PAGEREF _Toc237869724 \h </w:instrText>
+              <w:instrText xml:space="preserve"> PAGEREF _Toc237869974 \h </w:instrText>
             </w:r>
             <w:r>
               <w:rPr>
@@ -3959,7 +3959,7 @@
                 <w:noProof/>
                 <w:webHidden/>
               </w:rPr>
-              <w:t>54</w:t>
+              <w:t>55</w:t>
             </w:r>
             <w:r>
               <w:rPr>
@@ -3985,7 +3985,7 @@
               <w14:ligatures w14:val="standardContextual"/>
             </w:rPr>
           </w:pPr>
-          <w:hyperlink w:anchor="_Toc237869725" w:history="1">
+          <w:hyperlink w:anchor="_Toc237869975" w:history="1">
             <w:r>
               <w:rPr>
                 <w:rStyle w:val="Hipervnculo"/>
@@ -4029,7 +4029,7 @@
                 <w:noProof/>
                 <w:webHidden/>
               </w:rPr>
-              <w:instrText xml:space="preserve"> PAGEREF _Toc237869725 \h </w:instrText>
+              <w:instrText xml:space="preserve"> PAGEREF _Toc237869975 \h </w:instrText>
             </w:r>
             <w:r>
               <w:rPr>
@@ -4049,7 +4049,7 @@
                 <w:noProof/>
                 <w:webHidden/>
               </w:rPr>
-              <w:t>55</w:t>
+              <w:t>56</w:t>
             </w:r>
             <w:r>
               <w:rPr>
@@ -4075,7 +4075,7 @@
               <w14:ligatures w14:val="standardContextual"/>
             </w:rPr>
           </w:pPr>
-          <w:hyperlink w:anchor="_Toc237869726" w:history="1">
+          <w:hyperlink w:anchor="_Toc237869976" w:history="1">
             <w:r>
               <w:rPr>
                 <w:rStyle w:val="Hipervnculo"/>
@@ -4119,7 +4119,7 @@
                 <w:noProof/>
                 <w:webHidden/>
               </w:rPr>
-              <w:instrText xml:space="preserve"> PAGEREF _Toc237869726 \h </w:instrText>
+              <w:instrText xml:space="preserve"> PAGEREF _Toc237869976 \h </w:instrText>
             </w:r>
             <w:r>
               <w:rPr>
@@ -4139,7 +4139,7 @@
                 <w:noProof/>
                 <w:webHidden/>
               </w:rPr>
-              <w:t>55</w:t>
+              <w:t>56</w:t>
             </w:r>
             <w:r>
               <w:rPr>
@@ -4165,7 +4165,7 @@
               <w14:ligatures w14:val="standardContextual"/>
             </w:rPr>
           </w:pPr>
-          <w:hyperlink w:anchor="_Toc237869727" w:history="1">
+          <w:hyperlink w:anchor="_Toc237869977" w:history="1">
             <w:r>
               <w:rPr>
                 <w:rStyle w:val="Hipervnculo"/>
@@ -4209,7 +4209,7 @@
                 <w:noProof/>
                 <w:webHidden/>
               </w:rPr>
-              <w:instrText xml:space="preserve"> PAGEREF _Toc237869727 \h </w:instrText>
+              <w:instrText xml:space="preserve"> PAGEREF _Toc237869977 \h </w:instrText>
             </w:r>
             <w:r>
               <w:rPr>
@@ -4229,7 +4229,7 @@
                 <w:noProof/>
                 <w:webHidden/>
               </w:rPr>
-              <w:t>55</w:t>
+              <w:t>56</w:t>
             </w:r>
             <w:r>
               <w:rPr>
@@ -4255,7 +4255,7 @@
               <w14:ligatures w14:val="standardContextual"/>
             </w:rPr>
           </w:pPr>
-          <w:hyperlink w:anchor="_Toc237869728" w:history="1">
+          <w:hyperlink w:anchor="_Toc237869978" w:history="1">
             <w:r>
               <w:rPr>
                 <w:rStyle w:val="Hipervnculo"/>
@@ -4299,7 +4299,7 @@
                 <w:noProof/>
                 <w:webHidden/>
               </w:rPr>
-              <w:instrText xml:space="preserve"> PAGEREF _Toc237869728 \h </w:instrText>
+              <w:instrText xml:space="preserve"> PAGEREF _Toc237869978 \h </w:instrText>
             </w:r>
             <w:r>
               <w:rPr>
@@ -4319,7 +4319,7 @@
                 <w:noProof/>
                 <w:webHidden/>
               </w:rPr>
-              <w:t>55</w:t>
+              <w:t>56</w:t>
             </w:r>
             <w:r>
               <w:rPr>
@@ -4345,7 +4345,7 @@
               <w14:ligatures w14:val="standardContextual"/>
             </w:rPr>
           </w:pPr>
-          <w:hyperlink w:anchor="_Toc237869729" w:history="1">
+          <w:hyperlink w:anchor="_Toc237869979" w:history="1">
             <w:r>
               <w:rPr>
                 <w:rStyle w:val="Hipervnculo"/>
@@ -4389,7 +4389,7 @@
                 <w:noProof/>
                 <w:webHidden/>
               </w:rPr>
-              <w:instrText xml:space="preserve"> PAGEREF _Toc237869729 \h </w:instrText>
+              <w:instrText xml:space="preserve"> PAGEREF _Toc237869979 \h </w:instrText>
             </w:r>
             <w:r>
               <w:rPr>
@@ -4409,7 +4409,7 @@
                 <w:noProof/>
                 <w:webHidden/>
               </w:rPr>
-              <w:t>56</w:t>
+              <w:t>57</w:t>
             </w:r>
             <w:r>
               <w:rPr>
@@ -4435,7 +4435,7 @@
               <w14:ligatures w14:val="standardContextual"/>
             </w:rPr>
           </w:pPr>
-          <w:hyperlink w:anchor="_Toc237869730" w:history="1">
+          <w:hyperlink w:anchor="_Toc237869980" w:history="1">
             <w:r>
               <w:rPr>
                 <w:rStyle w:val="Hipervnculo"/>
@@ -4479,7 +4479,7 @@
                 <w:noProof/>
                 <w:webHidden/>
               </w:rPr>
-              <w:instrText xml:space="preserve"> PAGEREF _Toc237869730 \h </w:instrText>
+              <w:instrText xml:space="preserve"> PAGEREF _Toc237869980 \h </w:instrText>
             </w:r>
             <w:r>
               <w:rPr>
@@ -4499,7 +4499,7 @@
                 <w:noProof/>
                 <w:webHidden/>
               </w:rPr>
-              <w:t>56</w:t>
+              <w:t>57</w:t>
             </w:r>
             <w:r>
               <w:rPr>
@@ -4525,7 +4525,7 @@
               <w14:ligatures w14:val="standardContextual"/>
             </w:rPr>
           </w:pPr>
-          <w:hyperlink w:anchor="_Toc237869731" w:history="1">
+          <w:hyperlink w:anchor="_Toc237869981" w:history="1">
             <w:r>
               <w:rPr>
                 <w:rStyle w:val="Hipervnculo"/>
@@ -4569,7 +4569,7 @@
                 <w:noProof/>
                 <w:webHidden/>
               </w:rPr>
-              <w:instrText xml:space="preserve"> PAGEREF _Toc237869731 \h </w:instrText>
+              <w:instrText xml:space="preserve"> PAGEREF _Toc237869981 \h </w:instrText>
             </w:r>
             <w:r>
               <w:rPr>
@@ -4589,7 +4589,7 @@
                 <w:noProof/>
                 <w:webHidden/>
               </w:rPr>
-              <w:t>56</w:t>
+              <w:t>57</w:t>
             </w:r>
             <w:r>
               <w:rPr>
@@ -4615,7 +4615,7 @@
               <w14:ligatures w14:val="standardContextual"/>
             </w:rPr>
           </w:pPr>
-          <w:hyperlink w:anchor="_Toc237869732" w:history="1">
+          <w:hyperlink w:anchor="_Toc237869982" w:history="1">
             <w:r>
               <w:rPr>
                 <w:rStyle w:val="Hipervnculo"/>
@@ -4659,7 +4659,7 @@
                 <w:noProof/>
                 <w:webHidden/>
               </w:rPr>
-              <w:instrText xml:space="preserve"> PAGEREF _Toc237869732 \h </w:instrText>
+              <w:instrText xml:space="preserve"> PAGEREF _Toc237869982 \h </w:instrText>
             </w:r>
             <w:r>
               <w:rPr>
@@ -4679,7 +4679,7 @@
                 <w:noProof/>
                 <w:webHidden/>
               </w:rPr>
-              <w:t>56</w:t>
+              <w:t>57</w:t>
             </w:r>
             <w:r>
               <w:rPr>
@@ -4705,7 +4705,7 @@
               <w14:ligatures w14:val="standardContextual"/>
             </w:rPr>
           </w:pPr>
-          <w:hyperlink w:anchor="_Toc237869733" w:history="1">
+          <w:hyperlink w:anchor="_Toc237869983" w:history="1">
             <w:r>
               <w:rPr>
                 <w:rStyle w:val="Hipervnculo"/>
@@ -4749,7 +4749,7 @@
                 <w:noProof/>
                 <w:webHidden/>
               </w:rPr>
-              <w:instrText xml:space="preserve"> PAGEREF _Toc237869733 \h </w:instrText>
+              <w:instrText xml:space="preserve"> PAGEREF _Toc237869983 \h </w:instrText>
             </w:r>
             <w:r>
               <w:rPr>
@@ -4769,7 +4769,7 @@
                 <w:noProof/>
                 <w:webHidden/>
               </w:rPr>
-              <w:t>56</w:t>
+              <w:t>57</w:t>
             </w:r>
             <w:r>
               <w:rPr>
@@ -4795,7 +4795,7 @@
               <w14:ligatures w14:val="standardContextual"/>
             </w:rPr>
           </w:pPr>
-          <w:hyperlink w:anchor="_Toc237869734" w:history="1">
+          <w:hyperlink w:anchor="_Toc237869984" w:history="1">
             <w:r>
               <w:rPr>
                 <w:rStyle w:val="Hipervnculo"/>
@@ -4839,7 +4839,7 @@
                 <w:noProof/>
                 <w:webHidden/>
               </w:rPr>
-              <w:instrText xml:space="preserve"> PAGEREF _Toc237869734 \h </w:instrText>
+              <w:instrText xml:space="preserve"> PAGEREF _Toc237869984 \h </w:instrText>
             </w:r>
             <w:r>
               <w:rPr>
@@ -4859,7 +4859,7 @@
                 <w:noProof/>
                 <w:webHidden/>
               </w:rPr>
-              <w:t>56</w:t>
+              <w:t>57</w:t>
             </w:r>
             <w:r>
               <w:rPr>
@@ -4885,7 +4885,7 @@
               <w14:ligatures w14:val="standardContextual"/>
             </w:rPr>
           </w:pPr>
-          <w:hyperlink w:anchor="_Toc237869735" w:history="1">
+          <w:hyperlink w:anchor="_Toc237869985" w:history="1">
             <w:r>
               <w:rPr>
                 <w:rStyle w:val="Hipervnculo"/>
@@ -4929,7 +4929,7 @@
                 <w:noProof/>
                 <w:webHidden/>
               </w:rPr>
-              <w:instrText xml:space="preserve"> PAGEREF _Toc237869735 \h </w:instrText>
+              <w:instrText xml:space="preserve"> PAGEREF _Toc237869985 \h </w:instrText>
             </w:r>
             <w:r>
               <w:rPr>
@@ -4975,7 +4975,7 @@
               <w14:ligatures w14:val="standardContextual"/>
             </w:rPr>
           </w:pPr>
-          <w:hyperlink w:anchor="_Toc237869736" w:history="1">
+          <w:hyperlink w:anchor="_Toc237869986" w:history="1">
             <w:r>
               <w:rPr>
                 <w:rStyle w:val="Hipervnculo"/>
@@ -5019,7 +5019,7 @@
                 <w:noProof/>
                 <w:webHidden/>
               </w:rPr>
-              <w:instrText xml:space="preserve"> PAGEREF _Toc237869736 \h </w:instrText>
+              <w:instrText xml:space="preserve"> PAGEREF _Toc237869986 \h </w:instrText>
             </w:r>
             <w:r>
               <w:rPr>
@@ -5070,7 +5070,7 @@
       <w:pPr>
         <w:pStyle w:val="Ttulo1"/>
       </w:pPr>
-      <w:bookmarkStart w:id="0" w:name="_Toc237869683"/>
+      <w:bookmarkStart w:id="0" w:name="_Toc237869933"/>
       <w:r>
         <w:lastRenderedPageBreak/>
         <w:t>Introduction</w:t>
@@ -5081,7 +5081,7 @@
       <w:pPr>
         <w:pStyle w:val="Ttulo2"/>
       </w:pPr>
-      <w:bookmarkStart w:id="1" w:name="_Toc237869684"/>
+      <w:bookmarkStart w:id="1" w:name="_Toc237869934"/>
       <w:r>
         <w:t>Purpose</w:t>
       </w:r>
@@ -5102,7 +5102,7 @@
       <w:pPr>
         <w:pStyle w:val="Ttulo2"/>
       </w:pPr>
-      <w:bookmarkStart w:id="2" w:name="_Toc237869685"/>
+      <w:bookmarkStart w:id="2" w:name="_Toc237869935"/>
       <w:r>
         <w:t>Scope</w:t>
       </w:r>
@@ -5146,7 +5146,7 @@
       <w:pPr>
         <w:pStyle w:val="Ttulo2"/>
       </w:pPr>
-      <w:bookmarkStart w:id="3" w:name="_Toc237869686"/>
+      <w:bookmarkStart w:id="3" w:name="_Toc237869936"/>
       <w:r>
         <w:lastRenderedPageBreak/>
         <w:t>Intended Audience</w:t>
@@ -5179,7 +5179,7 @@
       <w:pPr>
         <w:pStyle w:val="Ttulo2"/>
       </w:pPr>
-      <w:bookmarkStart w:id="4" w:name="_Toc237869687"/>
+      <w:bookmarkStart w:id="4" w:name="_Toc237869937"/>
       <w:r>
         <w:t>Definitions</w:t>
       </w:r>
@@ -5538,7 +5538,7 @@
       <w:pPr>
         <w:pStyle w:val="Ttulo1"/>
       </w:pPr>
-      <w:bookmarkStart w:id="5" w:name="_Toc237869688"/>
+      <w:bookmarkStart w:id="5" w:name="_Toc237869938"/>
       <w:r>
         <w:lastRenderedPageBreak/>
         <w:t>P</w:t>
@@ -5552,7 +5552,7 @@
       <w:pPr>
         <w:pStyle w:val="Ttulo2"/>
       </w:pPr>
-      <w:bookmarkStart w:id="6" w:name="_Toc237869689"/>
+      <w:bookmarkStart w:id="6" w:name="_Toc237869939"/>
       <w:r>
         <w:t>Product Description</w:t>
       </w:r>
@@ -5573,7 +5573,7 @@
       <w:pPr>
         <w:pStyle w:val="Ttulo2"/>
       </w:pPr>
-      <w:bookmarkStart w:id="7" w:name="_Toc237869690"/>
+      <w:bookmarkStart w:id="7" w:name="_Toc237869940"/>
       <w:r>
         <w:t>Problem Statement</w:t>
       </w:r>
@@ -5598,7 +5598,7 @@
       <w:pPr>
         <w:pStyle w:val="Ttulo2"/>
       </w:pPr>
-      <w:bookmarkStart w:id="8" w:name="_Toc237869691"/>
+      <w:bookmarkStart w:id="8" w:name="_Toc237869941"/>
       <w:r>
         <w:t>Pr</w:t>
       </w:r>
@@ -5701,7 +5701,7 @@
       <w:pPr>
         <w:pStyle w:val="Ttulo2"/>
       </w:pPr>
-      <w:bookmarkStart w:id="9" w:name="_Toc237869692"/>
+      <w:bookmarkStart w:id="9" w:name="_Toc237869942"/>
       <w:r>
         <w:t>Target Users</w:t>
       </w:r>
@@ -5721,7 +5721,7 @@
       <w:pPr>
         <w:pStyle w:val="Ttulo2"/>
       </w:pPr>
-      <w:bookmarkStart w:id="10" w:name="_Toc237869693"/>
+      <w:bookmarkStart w:id="10" w:name="_Toc237869943"/>
       <w:r>
         <w:t>Product Characteristics</w:t>
       </w:r>
@@ -5811,7 +5811,7 @@
       <w:pPr>
         <w:pStyle w:val="Ttulo1"/>
       </w:pPr>
-      <w:bookmarkStart w:id="11" w:name="_Toc237869694"/>
+      <w:bookmarkStart w:id="11" w:name="_Toc237869944"/>
       <w:r>
         <w:lastRenderedPageBreak/>
         <w:t>System Scope</w:t>
@@ -5822,7 +5822,7 @@
       <w:pPr>
         <w:pStyle w:val="Ttulo2"/>
       </w:pPr>
-      <w:bookmarkStart w:id="12" w:name="_Toc237869695"/>
+      <w:bookmarkStart w:id="12" w:name="_Toc237869945"/>
       <w:r>
         <w:t>In Scope</w:t>
       </w:r>
@@ -6048,7 +6048,7 @@
       <w:pPr>
         <w:pStyle w:val="Ttulo2"/>
       </w:pPr>
-      <w:bookmarkStart w:id="13" w:name="_Toc237869696"/>
+      <w:bookmarkStart w:id="13" w:name="_Toc237869946"/>
       <w:r>
         <w:t>Out of Scope</w:t>
       </w:r>
@@ -6150,7 +6150,7 @@
       <w:pPr>
         <w:pStyle w:val="Ttulo1"/>
       </w:pPr>
-      <w:bookmarkStart w:id="14" w:name="_Toc237869697"/>
+      <w:bookmarkStart w:id="14" w:name="_Toc237869947"/>
       <w:r>
         <w:lastRenderedPageBreak/>
         <w:t>Functional Requirements</w:t>
@@ -6161,7 +6161,7 @@
       <w:pPr>
         <w:pStyle w:val="Ttulo2"/>
       </w:pPr>
-      <w:bookmarkStart w:id="15" w:name="_Toc237869698"/>
+      <w:bookmarkStart w:id="15" w:name="_Toc237869948"/>
       <w:r>
         <w:t>Requirement Specification Format</w:t>
       </w:r>
@@ -6371,7 +6371,7 @@
       <w:pPr>
         <w:pStyle w:val="Ttulo2"/>
       </w:pPr>
-      <w:bookmarkStart w:id="16" w:name="_Toc237869699"/>
+      <w:bookmarkStart w:id="16" w:name="_Toc237869949"/>
       <w:r>
         <w:lastRenderedPageBreak/>
         <w:t>Functional Requirements</w:t>
@@ -6385,7 +6385,7 @@
           <w:lang w:val="en-US"/>
         </w:rPr>
       </w:pPr>
-      <w:bookmarkStart w:id="17" w:name="_Toc237869700"/>
+      <w:bookmarkStart w:id="17" w:name="_Toc237869950"/>
       <w:r>
         <w:rPr>
           <w:lang w:val="en-US"/>
@@ -10688,7 +10688,7 @@
           <w:lang w:val="en-US"/>
         </w:rPr>
       </w:pPr>
-      <w:bookmarkStart w:id="18" w:name="_Toc237869701"/>
+      <w:bookmarkStart w:id="18" w:name="_Toc237869951"/>
       <w:r>
         <w:rPr>
           <w:lang w:val="en-US"/>
@@ -13157,7 +13157,7 @@
           <w:lang w:val="en-US"/>
         </w:rPr>
       </w:pPr>
-      <w:bookmarkStart w:id="19" w:name="_Toc237869702"/>
+      <w:bookmarkStart w:id="19" w:name="_Toc237869952"/>
       <w:r>
         <w:rPr>
           <w:lang w:val="en-US"/>
@@ -15627,7 +15627,7 @@
           <w:lang w:val="en-US"/>
         </w:rPr>
       </w:pPr>
-      <w:bookmarkStart w:id="20" w:name="_Toc237869703"/>
+      <w:bookmarkStart w:id="20" w:name="_Toc237869953"/>
       <w:r>
         <w:rPr>
           <w:lang w:val="en-US"/>
@@ -16601,7 +16601,7 @@
           <w:lang w:val="en-US"/>
         </w:rPr>
       </w:pPr>
-      <w:bookmarkStart w:id="21" w:name="_Toc237869704"/>
+      <w:bookmarkStart w:id="21" w:name="_Toc237869954"/>
       <w:r>
         <w:rPr>
           <w:lang w:val="en-US"/>
@@ -17544,7 +17544,7 @@
           <w:lang w:val="en-US"/>
         </w:rPr>
       </w:pPr>
-      <w:bookmarkStart w:id="22" w:name="_Toc237869705"/>
+      <w:bookmarkStart w:id="22" w:name="_Toc237869955"/>
       <w:r>
         <w:rPr>
           <w:lang w:val="en-US"/>
@@ -19578,7 +19578,7 @@
           <w:lang w:val="en-US"/>
         </w:rPr>
       </w:pPr>
-      <w:bookmarkStart w:id="23" w:name="_Toc237869706"/>
+      <w:bookmarkStart w:id="23" w:name="_Toc237869956"/>
       <w:r>
         <w:rPr>
           <w:lang w:val="en-US"/>
@@ -20547,7 +20547,7 @@
           <w:lang w:val="en-US"/>
         </w:rPr>
       </w:pPr>
-      <w:bookmarkStart w:id="24" w:name="_Toc237869707"/>
+      <w:bookmarkStart w:id="24" w:name="_Toc237869957"/>
       <w:r>
         <w:rPr>
           <w:lang w:val="en-US"/>
@@ -21413,7 +21413,7 @@
           <w:lang w:val="en-US"/>
         </w:rPr>
       </w:pPr>
-      <w:bookmarkStart w:id="25" w:name="_Toc237869708"/>
+      <w:bookmarkStart w:id="25" w:name="_Toc237869958"/>
       <w:r>
         <w:rPr>
           <w:lang w:val="en-US"/>
@@ -22306,7 +22306,7 @@
           <w:lang w:val="en-US"/>
         </w:rPr>
       </w:pPr>
-      <w:bookmarkStart w:id="26" w:name="_Toc237869709"/>
+      <w:bookmarkStart w:id="26" w:name="_Toc237869959"/>
       <w:r>
         <w:rPr>
           <w:lang w:val="en-US"/>
@@ -23286,7 +23286,7 @@
       <w:pPr>
         <w:pStyle w:val="Ttulo1"/>
       </w:pPr>
-      <w:bookmarkStart w:id="27" w:name="_Toc237869710"/>
+      <w:bookmarkStart w:id="27" w:name="_Toc237869960"/>
       <w:r>
         <w:lastRenderedPageBreak/>
         <w:t>Non-Functional Requirements</w:t>
@@ -23297,7 +23297,7 @@
       <w:pPr>
         <w:pStyle w:val="Ttulo2"/>
       </w:pPr>
-      <w:bookmarkStart w:id="28" w:name="_Toc237869711"/>
+      <w:bookmarkStart w:id="28" w:name="_Toc237869961"/>
       <w:r>
         <w:t>Requirement Specification Format</w:t>
       </w:r>
@@ -23413,7 +23413,7 @@
       <w:pPr>
         <w:pStyle w:val="Ttulo2"/>
       </w:pPr>
-      <w:bookmarkStart w:id="29" w:name="_Toc237869712"/>
+      <w:bookmarkStart w:id="29" w:name="_Toc237869962"/>
       <w:r>
         <w:t>Non-Functional Requirements</w:t>
       </w:r>
@@ -23429,7 +23429,7 @@
           <w:lang w:val="en-US"/>
         </w:rPr>
       </w:pPr>
-      <w:bookmarkStart w:id="30" w:name="_Toc237869713"/>
+      <w:bookmarkStart w:id="30" w:name="_Toc237869963"/>
       <w:r>
         <w:rPr>
           <w:lang w:val="en-US"/>
@@ -23666,7 +23666,7 @@
           <w:lang w:val="en-US"/>
         </w:rPr>
       </w:pPr>
-      <w:bookmarkStart w:id="31" w:name="_Toc237869714"/>
+      <w:bookmarkStart w:id="31" w:name="_Toc237869964"/>
       <w:r>
         <w:rPr>
           <w:lang w:val="en-US"/>
@@ -24003,7 +24003,7 @@
           <w:lang w:val="en-US"/>
         </w:rPr>
       </w:pPr>
-      <w:bookmarkStart w:id="32" w:name="_Toc237869715"/>
+      <w:bookmarkStart w:id="32" w:name="_Toc237869965"/>
       <w:r>
         <w:rPr>
           <w:lang w:val="en-US"/>
@@ -24346,7 +24346,7 @@
           <w:lang w:val="en-US"/>
         </w:rPr>
       </w:pPr>
-      <w:bookmarkStart w:id="33" w:name="_Toc237869716"/>
+      <w:bookmarkStart w:id="33" w:name="_Toc237869966"/>
       <w:r>
         <w:rPr>
           <w:lang w:val="en-US"/>
@@ -24608,7 +24608,7 @@
           <w:lang w:val="en-US"/>
         </w:rPr>
       </w:pPr>
-      <w:bookmarkStart w:id="34" w:name="_Toc237869717"/>
+      <w:bookmarkStart w:id="34" w:name="_Toc237869967"/>
       <w:r>
         <w:rPr>
           <w:lang w:val="en-US"/>
@@ -24855,7 +24855,7 @@
           <w:lang w:val="en-US"/>
         </w:rPr>
       </w:pPr>
-      <w:bookmarkStart w:id="35" w:name="_Toc237869718"/>
+      <w:bookmarkStart w:id="35" w:name="_Toc237869968"/>
       <w:r>
         <w:rPr>
           <w:lang w:val="en-US"/>
@@ -25093,7 +25093,7 @@
           <w:lang w:val="en-US"/>
         </w:rPr>
       </w:pPr>
-      <w:bookmarkStart w:id="36" w:name="_Toc237869719"/>
+      <w:bookmarkStart w:id="36" w:name="_Toc237869969"/>
       <w:r>
         <w:rPr>
           <w:lang w:val="en-US"/>
@@ -25226,7 +25226,7 @@
       <w:pPr>
         <w:pStyle w:val="Ttulo1"/>
       </w:pPr>
-      <w:bookmarkStart w:id="37" w:name="_Toc237869720"/>
+      <w:bookmarkStart w:id="37" w:name="_Toc237869970"/>
       <w:r>
         <w:lastRenderedPageBreak/>
         <w:t>Data Requirements</w:t>
@@ -25237,7 +25237,7 @@
       <w:pPr>
         <w:pStyle w:val="Ttulo2"/>
       </w:pPr>
-      <w:bookmarkStart w:id="38" w:name="_Toc237869721"/>
+      <w:bookmarkStart w:id="38" w:name="_Toc237869971"/>
       <w:r>
         <w:t>Data Entities</w:t>
       </w:r>
@@ -25413,7 +25413,7 @@
       <w:pPr>
         <w:pStyle w:val="Ttulo2"/>
       </w:pPr>
-      <w:bookmarkStart w:id="39" w:name="_Toc237869722"/>
+      <w:bookmarkStart w:id="39" w:name="_Toc237869972"/>
       <w:r>
         <w:t>Data Relationships</w:t>
       </w:r>
@@ -25529,7 +25529,7 @@
       <w:pPr>
         <w:pStyle w:val="Ttulo2"/>
       </w:pPr>
-      <w:bookmarkStart w:id="40" w:name="_Toc237869723"/>
+      <w:bookmarkStart w:id="40" w:name="_Toc237869973"/>
       <w:r>
         <w:lastRenderedPageBreak/>
         <w:t>Data Persistence</w:t>
@@ -25641,7 +25641,7 @@
       <w:pPr>
         <w:pStyle w:val="Ttulo2"/>
       </w:pPr>
-      <w:bookmarkStart w:id="41" w:name="_Toc237869724"/>
+      <w:bookmarkStart w:id="41" w:name="_Toc237869974"/>
       <w:r>
         <w:t>Data Integrity</w:t>
       </w:r>
@@ -25748,7 +25748,7 @@
       <w:pPr>
         <w:pStyle w:val="Ttulo2"/>
       </w:pPr>
-      <w:bookmarkStart w:id="42" w:name="_Toc237869725"/>
+      <w:bookmarkStart w:id="42" w:name="_Toc237869975"/>
       <w:r>
         <w:lastRenderedPageBreak/>
         <w:t>Data Validation</w:t>
@@ -25860,7 +25860,7 @@
       <w:pPr>
         <w:pStyle w:val="Ttulo1"/>
       </w:pPr>
-      <w:bookmarkStart w:id="43" w:name="_Toc237869726"/>
+      <w:bookmarkStart w:id="43" w:name="_Toc237869976"/>
       <w:r>
         <w:t>External Interface Requirements</w:t>
       </w:r>
@@ -25873,7 +25873,7 @@
       <w:r>
         <w:t xml:space="preserve"> </w:t>
       </w:r>
-      <w:bookmarkStart w:id="44" w:name="_Toc237869727"/>
+      <w:bookmarkStart w:id="44" w:name="_Toc237869977"/>
       <w:r>
         <w:t>User Interface</w:t>
       </w:r>
@@ -25900,7 +25900,7 @@
       <w:pPr>
         <w:pStyle w:val="Ttulo2"/>
       </w:pPr>
-      <w:bookmarkStart w:id="45" w:name="_Toc237869728"/>
+      <w:bookmarkStart w:id="45" w:name="_Toc237869978"/>
       <w:r>
         <w:t>Database Interface</w:t>
       </w:r>
@@ -25926,7 +25926,7 @@
       <w:pPr>
         <w:pStyle w:val="Ttulo2"/>
       </w:pPr>
-      <w:bookmarkStart w:id="46" w:name="_Toc237869729"/>
+      <w:bookmarkStart w:id="46" w:name="_Toc237869979"/>
       <w:r>
         <w:lastRenderedPageBreak/>
         <w:t>Browser Interface</w:t>
@@ -25945,7 +25945,7 @@
       <w:pPr>
         <w:pStyle w:val="Ttulo2"/>
       </w:pPr>
-      <w:bookmarkStart w:id="47" w:name="_Toc237869730"/>
+      <w:bookmarkStart w:id="47" w:name="_Toc237869980"/>
       <w:r>
         <w:t>External System Interfaces</w:t>
       </w:r>
@@ -25963,7 +25963,7 @@
       <w:pPr>
         <w:pStyle w:val="Ttulo1"/>
       </w:pPr>
-      <w:bookmarkStart w:id="48" w:name="_Toc237869731"/>
+      <w:bookmarkStart w:id="48" w:name="_Toc237869981"/>
       <w:r>
         <w:t>Constraints, Assumptions, and Dependencies</w:t>
       </w:r>
@@ -25973,7 +25973,7 @@
       <w:pPr>
         <w:pStyle w:val="Ttulo2"/>
       </w:pPr>
-      <w:bookmarkStart w:id="49" w:name="_Toc237869732"/>
+      <w:bookmarkStart w:id="49" w:name="_Toc237869982"/>
       <w:r>
         <w:t>Constraints</w:t>
       </w:r>
@@ -26000,7 +26000,7 @@
       <w:pPr>
         <w:pStyle w:val="Ttulo2"/>
       </w:pPr>
-      <w:bookmarkStart w:id="50" w:name="_Toc237869733"/>
+      <w:bookmarkStart w:id="50" w:name="_Toc237869983"/>
       <w:r>
         <w:t>Assumptions</w:t>
       </w:r>
@@ -26027,7 +26027,7 @@
       <w:pPr>
         <w:pStyle w:val="Ttulo2"/>
       </w:pPr>
-      <w:bookmarkStart w:id="51" w:name="_Toc237869734"/>
+      <w:bookmarkStart w:id="51" w:name="_Toc237869984"/>
       <w:r>
         <w:t>Dependencies</w:t>
       </w:r>
@@ -26048,7 +26048,7 @@
       <w:pPr>
         <w:pStyle w:val="Ttulo1"/>
       </w:pPr>
-      <w:bookmarkStart w:id="52" w:name="_Toc237869735"/>
+      <w:bookmarkStart w:id="52" w:name="_Toc237869985"/>
       <w:r>
         <w:lastRenderedPageBreak/>
         <w:t>A</w:t>
@@ -26233,7 +26233,7 @@
       <w:pPr>
         <w:pStyle w:val="Ttulo2"/>
       </w:pPr>
-      <w:bookmarkStart w:id="53" w:name="_Toc237869736"/>
+      <w:bookmarkStart w:id="53" w:name="_Toc237869986"/>
       <w:r>
         <w:t>Verification</w:t>
       </w:r>

</xml_diff>